<commit_message>
Manuscript: code and data available on request
Co-Authored-By: Claude Sonnet 5.5 <noreply@anthropic.com>
Claude-Session: https://claude.ai/code/session_013MWEbKStV7gCMmHJrttV1T
</commit_message>
<xml_diff>
--- a/paper/Blockchain_ZeroTrust_IIoT_IEEE_Access.docx
+++ b/paper/Blockchain_ZeroTrust_IIoT_IEEE_Access.docx
@@ -6633,7 +6633,7 @@
           <w:sz w:val="20"/>
           <w:szCs w:val="20"/>
         </w:rPr>
-        <w:t xml:space="preserve"> evaluations of `AccessControl.evaluateRequest`), S3 per-event logging at 10–200 tx/s offered for 20 s, S4 batch anchoring at 1 tx/s, and S5 revocation visibility. Block observation was polled every 25 ms. The scripts and raw results are in the released repository.</w:t>
+        <w:t xml:space="preserve"> evaluations of `AccessControl.evaluateRequest`), S3 per-event logging at 10–200 tx/s offered for 20 s, S4 batch anchoring at 1 tx/s, and S5 revocation visibility. Block observation was polled every 25 ms. The benchmark scripts, contracts and raw results are available from the authors on request.</w:t>
       </w:r>
     </w:p>
     <w:p>
@@ -6830,7 +6830,7 @@
           <w:sz w:val="20"/>
           <w:szCs w:val="20"/>
         </w:rPr>
-        <w:t xml:space="preserve">Table 4 lists the parameters used by the model; every value can be changed in the released code.</w:t>
+        <w:t xml:space="preserve">Table 4 lists the parameters used by the model; every value can be changed in the code, which is available from the authors on request.</w:t>
       </w:r>
     </w:p>
     <w:p>
@@ -7553,7 +7553,7 @@
           <w:sz w:val="14"/>
           <w:szCs w:val="14"/>
         </w:rPr>
-        <w:t xml:space="preserve">Ledger values are measured on Besu; network, PKI and cache values are assumptions for a LAN-connected plant, editable in the released code.</w:t>
+        <w:t xml:space="preserve">Ledger values are measured on Besu; network, PKI and cache values are assumptions for a LAN-connected plant, editable in the code (available on request).</w:t>
       </w:r>
     </w:p>
     <w:p>
@@ -11151,7 +11151,7 @@
         </w:rPr>
         <w:t xml:space="preserve">F. Federici, D. Martintoni, and V. Senni, “A zero-trust architecture for remote access in industrial IoT infrastructures,” Electronics, vol. 12, no. 3, Art. no. 566, 2023, </w:t>
       </w:r>
-      <w:hyperlink w:history="1" r:id="rIdd-zagyxtt-ac4pecznudj">
+      <w:hyperlink w:history="1" r:id="rIde2mmt5s-1aeascvksa2ns">
         <w:r>
           <w:rPr>
             <w:rFonts w:ascii="Times New Roman" w:cs="Times New Roman" w:eastAsia="Times New Roman" w:hAnsi="Times New Roman"/>
@@ -11189,7 +11189,7 @@
         </w:rPr>
         <w:t xml:space="preserve">C. Zanasi, S. Russo, and M. Colajanni, “Flexible zero trust architecture for the cybersecurity of industrial IoT infrastructures,” Ad Hoc Netw., vol. 156, Art. no. 103414, 2024, </w:t>
       </w:r>
-      <w:hyperlink w:history="1" r:id="rIdwfaibsglaxupz8i89yitz">
+      <w:hyperlink w:history="1" r:id="rIdad9cpis-mgyntjjqluyn7">
         <w:r>
           <w:rPr>
             <w:rFonts w:ascii="Times New Roman" w:cs="Times New Roman" w:eastAsia="Times New Roman" w:hAnsi="Times New Roman"/>
@@ -11227,7 +11227,7 @@
         </w:rPr>
         <w:t xml:space="preserve">S. Rose, O. Borchert, S. Mitchell, and S. Connelly, “Zero trust architecture,” Nat. Inst. Standards Technol., Gaithersburg, MD, USA, Spec. Publ. 800-207, Aug. 2020, </w:t>
       </w:r>
-      <w:hyperlink w:history="1" r:id="rIdter55twj-2csls_dyowby">
+      <w:hyperlink w:history="1" r:id="rIdiplzjx5tqfptxvptb71ju">
         <w:r>
           <w:rPr>
             <w:rFonts w:ascii="Times New Roman" w:cs="Times New Roman" w:eastAsia="Times New Roman" w:hAnsi="Times New Roman"/>
@@ -11265,7 +11265,7 @@
         </w:rPr>
         <w:t xml:space="preserve">M. L. Gambo and A. Almulhem, “Zero trust architecture: A systematic literature review,” J. Netw. Syst. Manage., vol. 34, Art. no. 25, 2026, </w:t>
       </w:r>
-      <w:hyperlink w:history="1" r:id="rIdre7ooc_vmai4spjcvovgi">
+      <w:hyperlink w:history="1" r:id="rIdernykzup9fyspooe1sgpi">
         <w:r>
           <w:rPr>
             <w:rFonts w:ascii="Times New Roman" w:cs="Times New Roman" w:eastAsia="Times New Roman" w:hAnsi="Times New Roman"/>
@@ -11303,7 +11303,7 @@
         </w:rPr>
         <w:t xml:space="preserve">S. Mushtaq, M. Mohsin, and M. M. Mushtaq, “A systematic literature review on the implementation and challenges of zero trust architecture across domains,” Sensors, vol. 25, no. 19, Art. no. 6118, 2025, </w:t>
       </w:r>
-      <w:hyperlink w:history="1" r:id="rIdg7isove_voy037vagtfql">
+      <w:hyperlink w:history="1" r:id="rIdj-a0rrpuupvfq7pg30xns">
         <w:r>
           <w:rPr>
             <w:rFonts w:ascii="Times New Roman" w:cs="Times New Roman" w:eastAsia="Times New Roman" w:hAnsi="Times New Roman"/>
@@ -11341,7 +11341,7 @@
         </w:rPr>
         <w:t xml:space="preserve">M. A. Azad, S. Abdullah, J. Arshad, H. Lallie, and Y. H. Ahmed, “Verify and trust: A multidimensional survey of zero-trust security in the age of IoT,” Internet Things, vol. 27, Art. no. 101227, 2024, </w:t>
       </w:r>
-      <w:hyperlink w:history="1" r:id="rIde6odjup8jczjylggbnu8r">
+      <w:hyperlink w:history="1" r:id="rIdmfuc3zl26mlirxjn6bhtz">
         <w:r>
           <w:rPr>
             <w:rFonts w:ascii="Times New Roman" w:cs="Times New Roman" w:eastAsia="Times New Roman" w:hAnsi="Times New Roman"/>
@@ -11379,7 +11379,7 @@
         </w:rPr>
         <w:t xml:space="preserve">S. Mthethwa, M. T. Dlamini, and E. Jembere, “Zero trust for NHIs based on robust identity and access management for a resilient IoT future,” Sensors, vol. 26, no. 8, Art. no. 2392, 2026, </w:t>
       </w:r>
-      <w:hyperlink w:history="1" r:id="rIdm7tscw_off_8yje7dphue">
+      <w:hyperlink w:history="1" r:id="rId6v2ipr6eexh74px9brwib">
         <w:r>
           <w:rPr>
             <w:rFonts w:ascii="Times New Roman" w:cs="Times New Roman" w:eastAsia="Times New Roman" w:hAnsi="Times New Roman"/>
@@ -11417,7 +11417,7 @@
         </w:rPr>
         <w:t xml:space="preserve">M. Asim, N. Tariq, A. I. Awad, F. Waheed, S. Bukhari, A. Rafay, and H. H. Song, “Lightweight and privacy-aware decentralized identity management for Industrial Internet of Things applications,” Future Gener. Comput. Syst., vol. 186, Art. no. 108753, 2027 (online Aug. 2026), </w:t>
       </w:r>
-      <w:hyperlink w:history="1" r:id="rIdkt8bjdakshwdwrj6emeb9">
+      <w:hyperlink w:history="1" r:id="rIdkmbtnudfatk1aqzdijo-h">
         <w:r>
           <w:rPr>
             <w:rFonts w:ascii="Times New Roman" w:cs="Times New Roman" w:eastAsia="Times New Roman" w:hAnsi="Times New Roman"/>
@@ -11455,7 +11455,7 @@
         </w:rPr>
         <w:t xml:space="preserve">E. B. Fernández and A. Brazhuk, “A critical analysis of zero trust architecture (ZTA),” Comput. Stand. Interfaces, vol. 89, Art. no. 103832, 2024, </w:t>
       </w:r>
-      <w:hyperlink w:history="1" r:id="rIduh2uzqbrlkgnoic2x2ltd">
+      <w:hyperlink w:history="1" r:id="rIdmdlyrhimzat-kup04bz7n">
         <w:r>
           <w:rPr>
             <w:rFonts w:ascii="Times New Roman" w:cs="Times New Roman" w:eastAsia="Times New Roman" w:hAnsi="Times New Roman"/>
@@ -11493,7 +11493,7 @@
         </w:rPr>
         <w:t xml:space="preserve">Y.-W. Ma and P.-H. Chiu, “A novel risk-based access control engine in zero trust architecture for IoT network,” Int. J. Inf. Secur., vol. 24, Art. no. 124, 2025, </w:t>
       </w:r>
-      <w:hyperlink w:history="1" r:id="rIdjpvltcjsmersuxifi8eo8">
+      <w:hyperlink w:history="1" r:id="rIdlbcomwbeaegco7yycdr45">
         <w:r>
           <w:rPr>
             <w:rFonts w:ascii="Times New Roman" w:cs="Times New Roman" w:eastAsia="Times New Roman" w:hAnsi="Times New Roman"/>
@@ -11531,7 +11531,7 @@
         </w:rPr>
         <w:t xml:space="preserve">M. A. Aleisa, “Blockchain-enabled zero trust architecture for privacy-preserving cybersecurity in IoT environments,” IEEE Access, vol. 13, pp. 18660–18676, 2025, </w:t>
       </w:r>
-      <w:hyperlink w:history="1" r:id="rIdwieshx2r0mwbrvwmgwmuo">
+      <w:hyperlink w:history="1" r:id="rIdmdkl1g51sdcitg39hmjyv">
         <w:r>
           <w:rPr>
             <w:rFonts w:ascii="Times New Roman" w:cs="Times New Roman" w:eastAsia="Times New Roman" w:hAnsi="Times New Roman"/>
@@ -11569,7 +11569,7 @@
         </w:rPr>
         <w:t xml:space="preserve">S. Nie, J. Ren, R. Wu, P. Han, Z. Han, and W. Wan, “Zero-trust access control mechanism based on blockchain and inner-product encryption in the Internet of Things in a 6G environment,” Sensors, vol. 25, no. 2, Art. no. 550, 2025, </w:t>
       </w:r>
-      <w:hyperlink w:history="1" r:id="rId04lkemg_pvvncnbid8ewf">
+      <w:hyperlink w:history="1" r:id="rId9hbi-op49_gmvag81hynh">
         <w:r>
           <w:rPr>
             <w:rFonts w:ascii="Times New Roman" w:cs="Times New Roman" w:eastAsia="Times New Roman" w:hAnsi="Times New Roman"/>
@@ -11607,7 +11607,7 @@
         </w:rPr>
         <w:t xml:space="preserve">G. Ali, S. Shah, M. Elaffendi, and N. Ahmad, “Blockchain-based access management framework for interoperable digital twins in industrial IoT,” Front. Blockchain, vol. 8, Art. no. 1693926, 2025, </w:t>
       </w:r>
-      <w:hyperlink w:history="1" r:id="rId3y4liwnmvpjrpase-ekpw">
+      <w:hyperlink w:history="1" r:id="rIdkqbxpspnaf3x-mv-7c-k8">
         <w:r>
           <w:rPr>
             <w:rFonts w:ascii="Times New Roman" w:cs="Times New Roman" w:eastAsia="Times New Roman" w:hAnsi="Times New Roman"/>
@@ -11645,7 +11645,7 @@
         </w:rPr>
         <w:t xml:space="preserve">M. Essaid and H. Ju, “Blockchain solutions for enhancing security and privacy in Industrial IoT,” Appl. Sci., vol. 15, no. 12, Art. no. 6835, 2025, </w:t>
       </w:r>
-      <w:hyperlink w:history="1" r:id="rIdeoczjhelonziqwzx-axdc">
+      <w:hyperlink w:history="1" r:id="rIdtoercixmph8gtdef6jmep">
         <w:r>
           <w:rPr>
             <w:rFonts w:ascii="Times New Roman" w:cs="Times New Roman" w:eastAsia="Times New Roman" w:hAnsi="Times New Roman"/>
@@ -11683,7 +11683,7 @@
         </w:rPr>
         <w:t xml:space="preserve">D. Li, H. Li, N. Crespi, R. Minerva, M. Li, W. Liang, and K. C. Li, “Hyper-IIoT: A smart contract-inspired access control scheme for resource-constrained Industrial Internet of Things,” IEEE Trans. Sustain. Comput., vol. 10, no. 5, pp. 820–829, 2025, </w:t>
       </w:r>
-      <w:hyperlink w:history="1" r:id="rId9dn-lxa2vxk65hq1eqsww">
+      <w:hyperlink w:history="1" r:id="rIdfr_xfqdyc6evlgqwhsajw">
         <w:r>
           <w:rPr>
             <w:rFonts w:ascii="Times New Roman" w:cs="Times New Roman" w:eastAsia="Times New Roman" w:hAnsi="Times New Roman"/>
@@ -11721,7 +11721,7 @@
         </w:rPr>
         <w:t xml:space="preserve">Z. Guo, “Blockchain-enhanced smart contracts for formal verification of IoT access control mechanisms,” Alexandria Eng. J., vol. 118, pp. 315–324, 2025, </w:t>
       </w:r>
-      <w:hyperlink w:history="1" r:id="rIdluoc-svrgyxyoexn3b4wk">
+      <w:hyperlink w:history="1" r:id="rIdaah41rta7-z6wsas5cdm_">
         <w:r>
           <w:rPr>
             <w:rFonts w:ascii="Times New Roman" w:cs="Times New Roman" w:eastAsia="Times New Roman" w:hAnsi="Times New Roman"/>
@@ -11759,7 +11759,7 @@
         </w:rPr>
         <w:t xml:space="preserve">A. Singh, V. Pareek, and A. Sharma, “Blockchain-enabled zero trust framework for securing FinTech ecosystems against insider threats and cyber attacks,” </w:t>
       </w:r>
-      <w:hyperlink w:history="1" r:id="rIdflb1ng3izbvf7qmjcn039">
+      <w:hyperlink w:history="1" r:id="rId4o545bfbz9v2uyoonpoks">
         <w:r>
           <w:rPr>
             <w:rFonts w:ascii="Times New Roman" w:cs="Times New Roman" w:eastAsia="Times New Roman" w:hAnsi="Times New Roman"/>
@@ -11797,7 +11797,7 @@
         </w:rPr>
         <w:t xml:space="preserve">M. M. Salim, M. Kim, S. K. Singh, and J. H. Park, “Zero-trust blockchain-enabled framework for scalable and secure IoT networks,” Future Gener. Comput. Syst., vol. 175, Art. no. 108093, 2026, </w:t>
       </w:r>
-      <w:hyperlink w:history="1" r:id="rIdroooc5mqwbzutqp1v1kl9">
+      <w:hyperlink w:history="1" r:id="rIdcnjciaydcekwkkvpyzoq9">
         <w:r>
           <w:rPr>
             <w:rFonts w:ascii="Times New Roman" w:cs="Times New Roman" w:eastAsia="Times New Roman" w:hAnsi="Times New Roman"/>
@@ -11835,7 +11835,7 @@
         </w:rPr>
         <w:t xml:space="preserve">A. Sharma, S. Rani, and W. Boulila, “Blockchain-based zero trust networks with federated transfer learning for IoT security in industry 5.0,” PLOS ONE, vol. 20, no. 6, Art. no. e0323241, 2025, </w:t>
       </w:r>
-      <w:hyperlink w:history="1" r:id="rId3kvg-58negkfgzz2xjn13">
+      <w:hyperlink w:history="1" r:id="rIdf244iojwh_pfrkfpdhjku">
         <w:r>
           <w:rPr>
             <w:rFonts w:ascii="Times New Roman" w:cs="Times New Roman" w:eastAsia="Times New Roman" w:hAnsi="Times New Roman"/>
@@ -11873,7 +11873,7 @@
         </w:rPr>
         <w:t xml:space="preserve">S. Mishra, T. S. M. Aldafas, and N. S. Alshammari, “A zero-trust digital twin framework for privacy-preserving multi-dataset intrusion detection in industrial IoT with lightweight blockchain auditing,” Sci. Rep., vol. 16, Art. no. 15236, 2026, </w:t>
       </w:r>
-      <w:hyperlink w:history="1" r:id="rIdxneyfsap_5d7itps6_vib">
+      <w:hyperlink w:history="1" r:id="rId5tlie0_ctl5azohmdhf5u">
         <w:r>
           <w:rPr>
             <w:rFonts w:ascii="Times New Roman" w:cs="Times New Roman" w:eastAsia="Times New Roman" w:hAnsi="Times New Roman"/>
@@ -11911,7 +11911,7 @@
         </w:rPr>
         <w:t xml:space="preserve">Z. Zhai, J. Liu, X. Liu, Y. Mao, X. Zhang, J. Ma, and C. Jin, “A lightweight authentication method for Industrial Internet of Things based on blockchain and Chebyshev chaotic maps,” Future Internet, vol. 17, no. 8, Art. no. 338, 2025, </w:t>
       </w:r>
-      <w:hyperlink w:history="1" r:id="rIdpqpgswsuw-d0vv2acy1jo">
+      <w:hyperlink w:history="1" r:id="rIdroqhhbftzpgdndzkiycdd">
         <w:r>
           <w:rPr>
             <w:rFonts w:ascii="Times New Roman" w:cs="Times New Roman" w:eastAsia="Times New Roman" w:hAnsi="Times New Roman"/>
@@ -11949,7 +11949,7 @@
         </w:rPr>
         <w:t xml:space="preserve">T. Ramírez-Gordillo, A. Maciá-Lillo, F. A. Pujol, N. García-D’Urso, J. Azorín-López, and H. Mora, “Decentralized identity management for Internet of Things (IoT) devices using IOTA blockchain technology,” Future Internet, vol. 17, no. 1, Art. no. 49, 2025, </w:t>
       </w:r>
-      <w:hyperlink w:history="1" r:id="rIdh6shelzghxq1lbj233qrl">
+      <w:hyperlink w:history="1" r:id="rIdkvh1roxhutx2zr-qwyg6i">
         <w:r>
           <w:rPr>
             <w:rFonts w:ascii="Times New Roman" w:cs="Times New Roman" w:eastAsia="Times New Roman" w:hAnsi="Times New Roman"/>
@@ -11987,7 +11987,7 @@
         </w:rPr>
         <w:t xml:space="preserve">S. I. R. Naqvi, Z. J. Bin, A. Mohsin, M. P. Akhter, and M. M. ur Rahman, “DBoT: Enhancing scalability and privacy in intelligent building spaces through a direct acyclic graph blockchain,” in Proc. 17th Int. Conf. Open Source Syst. Technol. (ICOSST), 2023, </w:t>
       </w:r>
-      <w:hyperlink w:history="1" r:id="rIdbnxe3ej60m_gwgin1di7h">
+      <w:hyperlink w:history="1" r:id="rIdq63qrxlwoaqlazbr5p-8w">
         <w:r>
           <w:rPr>
             <w:rFonts w:ascii="Times New Roman" w:cs="Times New Roman" w:eastAsia="Times New Roman" w:hAnsi="Times New Roman"/>
@@ -12025,7 +12025,7 @@
         </w:rPr>
         <w:t xml:space="preserve">R. Islam, R. Bose, S. Roy, A. A. Khan, S. Sutradhar, S. Das, F. Ali, and A. A. AlZubi, “Decentralized trust framework for smart cities: A blockchain-enabled cybersecurity and data integrity model,” Sci. Rep., vol. 15, Art. no. 23454, 2025, </w:t>
       </w:r>
-      <w:hyperlink w:history="1" r:id="rIdiofp4metvhhyn-7tm5rdq">
+      <w:hyperlink w:history="1" r:id="rIddyq7ov3egui4cmt0ll_-o">
         <w:r>
           <w:rPr>
             <w:rFonts w:ascii="Times New Roman" w:cs="Times New Roman" w:eastAsia="Times New Roman" w:hAnsi="Times New Roman"/>
@@ -12063,7 +12063,7 @@
         </w:rPr>
         <w:t xml:space="preserve">P. Rani, “A zero-trust framework for securing next-generation Internet of Things network,” in New Trends and Applications in Internet of Things (IoT) and Big Data Analytics, vol. 2. Cham, Switzerland: Springer, 2026, pp. 213–225, </w:t>
       </w:r>
-      <w:hyperlink w:history="1" r:id="rIdbe6nz3jcdovysopgpv696">
+      <w:hyperlink w:history="1" r:id="rIddbgzn9vmhnnpmyasxwubv">
         <w:r>
           <w:rPr>
             <w:rFonts w:ascii="Times New Roman" w:cs="Times New Roman" w:eastAsia="Times New Roman" w:hAnsi="Times New Roman"/>
@@ -12101,7 +12101,7 @@
         </w:rPr>
         <w:t xml:space="preserve">B. Chellaprabha, D. Manohari, and J. J. Justus, “Scalable and secure IoT architecture using trust-driven adaptive resource management and edge intelligence,” in Expert Applications and Security (NICE-TEAS 2025), Lecture Notes in Networks and Systems, vol. 1823. Cham, Switzerland: Springer, 2026, pp. 444–461, </w:t>
       </w:r>
-      <w:hyperlink w:history="1" r:id="rIdv6xd-_8fh3tdelidft5gp">
+      <w:hyperlink w:history="1" r:id="rIdqvsxgrcrrq5e8xw5hozte">
         <w:r>
           <w:rPr>
             <w:rFonts w:ascii="Times New Roman" w:cs="Times New Roman" w:eastAsia="Times New Roman" w:hAnsi="Times New Roman"/>
@@ -12139,7 +12139,7 @@
         </w:rPr>
         <w:t xml:space="preserve">K. Li et al., “Zero-trust foundation models: A new paradigm for secure and collaborative artificial intelligence for Internet of Things,” </w:t>
       </w:r>
-      <w:hyperlink w:history="1" r:id="rIdkyl3hsc0gzm_qzxud52fl">
+      <w:hyperlink w:history="1" r:id="rId-nbszrew_jz8bg8yf4ahk">
         <w:r>
           <w:rPr>
             <w:rFonts w:ascii="Times New Roman" w:cs="Times New Roman" w:eastAsia="Times New Roman" w:hAnsi="Times New Roman"/>
@@ -12177,7 +12177,7 @@
         </w:rPr>
         <w:t xml:space="preserve">S. Ghasemshirazi, G. Shirvani, and M. A. Alipour, “Zero trust: Applications, challenges, and opportunities,” </w:t>
       </w:r>
-      <w:hyperlink w:history="1" r:id="rIdfnrl9ux_9zff5x6t6uvbs">
+      <w:hyperlink w:history="1" r:id="rIdidar5xjazut7uquc6tz2r">
         <w:r>
           <w:rPr>
             <w:rFonts w:ascii="Times New Roman" w:cs="Times New Roman" w:eastAsia="Times New Roman" w:hAnsi="Times New Roman"/>
@@ -12215,7 +12215,7 @@
         </w:rPr>
         <w:t xml:space="preserve">A. K. Peepliwal et al., “A prototype model of zero-trust architecture blockchain with EigenTrust-based practical Byzantine fault tolerance protocol to manage decentralized clinical trials,” </w:t>
       </w:r>
-      <w:hyperlink w:history="1" r:id="rIdaaix7rwhyt19z8p-kit2q">
+      <w:hyperlink w:history="1" r:id="rIdmlcpfjrwndf6tzfhowl3h">
         <w:r>
           <w:rPr>
             <w:rFonts w:ascii="Times New Roman" w:cs="Times New Roman" w:eastAsia="Times New Roman" w:hAnsi="Times New Roman"/>
@@ -12253,7 +12253,7 @@
         </w:rPr>
         <w:t xml:space="preserve">A. Kulkarni, N. A. Hazari, and M. Y. Niamat, “A zero trust-based framework employing blockchain technology and ring oscillator physical unclonable functions for security of field programmable gate array supply chain,” IEEE Access, vol. 12, pp. 89322–89338, 2024. [Online]. Available: </w:t>
       </w:r>
-      <w:hyperlink w:history="1" r:id="rId7rkeknewx1zm1psu0wvcz">
+      <w:hyperlink w:history="1" r:id="rIdodc2rh0z0nmxyp8qlr6kq">
         <w:r>
           <w:rPr>
             <w:rFonts w:ascii="Times New Roman" w:cs="Times New Roman" w:eastAsia="Times New Roman" w:hAnsi="Times New Roman"/>

</xml_diff>

<commit_message>
Add end-to-end results (3 runs on Besu), aggregation/figures, updated manuscript
Co-Authored-By: Claude Sonnet 5.5 <noreply@anthropic.com>
Claude-Session: https://claude.ai/code/session_013MWEbKStV7gCMmHJrttV1T
</commit_message>
<xml_diff>
--- a/paper/Blockchain_ZeroTrust_IIoT_IEEE_Access.docx
+++ b/paper/Blockchain_ZeroTrust_IIoT_IEEE_Access.docx
@@ -101,7 +101,7 @@
           <w:sz w:val="18"/>
           <w:szCs w:val="18"/>
         </w:rPr>
-        <w:t xml:space="preserve">Industrial IoT (IIoT) networks need continuous, per-request verification, but placing a blockchain on the authentication path adds seconds of latency and saturates ledger capacity. We propose BC-ZTA, a three-tier blockchain-assisted zero-trust architecture in which edge policy enforcement points decide from cached, Merkle-verified ledger state, while identity, trust and audit updates are written asynchronously to a permissioned Hyperledger Besu (IBFT 2.0) network through four Solidity contracts. All contracts compile and pass 15 unit tests; gas was measured by execution, showing that Merkle batch anchoring cuts audit cost per record by about 1351×. Measurements on a four-validator Besu network show about 1522 ms write confirmation and a throughput ceiling near 60 tx/s, so synchronous on-chain checks reach 2.3 s at 50 devices. A model of the edge path gives a mean authorisation latency of 1.7 ms against 55.9 ms for centralised PKI-IAM, flat up to 400 devices, with revocation delay of about 1.5 s when event-driven invalidation is used. The Besu runs used a single shared host; the edge-path figures are model-based.</w:t>
+        <w:t xml:space="preserve">Industrial IoT (IIoT) networks need continuous, per-request verification, but placing a blockchain on the authentication path adds seconds of latency and saturates ledger capacity. We propose BC-ZTA, a three-tier blockchain-assisted zero-trust architecture in which edge policy enforcement points decide from cached, Merkle-verified ledger state, while identity, trust and audit updates are written asynchronously to a permissioned Hyperledger Besu (IBFT 2.0) network through four Solidity contracts. We implemented the policy enforcement point and three baselines and measured them end to end on a four-validator Besu network (three repetitions, shared two-vCPU host). At 50 devices BC-ZTA answers in 7.4 ms on average, compared with 48.2 ms for a centralised directory with an emulated WAN link and 10257 ms when every request is an on-chain transaction; the synchronous design saturates at about 47 requests per second, whereas BC-ZTA served 200 devices with no failures and about one on-chain write per second. Event-driven cache invalidation enforces a revocation in 1.2 s on average, and all 1050 forged, replayed, stale, unregistered, tampered or policy-violating requests were rejected. Merkle batch anchoring cuts audit gas per record by about 1351×. Limitations are the shared single host, the emulated WAN delay and the emulated device population.</w:t>
       </w:r>
     </w:p>
     <w:p>
@@ -919,15 +919,15 @@
           <w:sz w:val="20"/>
           <w:szCs w:val="20"/>
         </w:rPr>
-        <w:t xml:space="preserve">Measured Besu evaluation.</w:t>
-      </w:r>
-      <w:r>
-        <w:rPr>
-          <w:rFonts w:ascii="Times New Roman" w:cs="Times New Roman" w:eastAsia="Times New Roman" w:hAnsi="Times New Roman"/>
-          <w:sz w:val="20"/>
-          <w:szCs w:val="20"/>
-        </w:rPr>
-        <w:t xml:space="preserve"> Gas, write-confirmation latency, read latency, ledger throughput saturation, batch anchoring and revocation visibility are measured on a four-validator Hyperledger Besu IBFT 2.0 network (three repetitions); the edge-cache request path and the PKI/ABAC baselines are modelled with explicit parameters (Section V).</w:t>
+        <w:t xml:space="preserve">End-to-end prototype and measurements.</w:t>
+      </w:r>
+      <w:r>
+        <w:rPr>
+          <w:rFonts w:ascii="Times New Roman" w:cs="Times New Roman" w:eastAsia="Times New Roman" w:hAnsi="Times New Roman"/>
+          <w:sz w:val="20"/>
+          <w:szCs w:val="20"/>
+        </w:rPr>
+        <w:t xml:space="preserve"> A running PEP/PDP service, three baselines (centralised PKI-IAM, local ABAC, blockchain-synchronous) and a load generator, evaluated on a four-validator Hyperledger Besu IBFT 2.0 network in three repetitions: latency and goodput up to 200 devices, revocation delay, security tests and gas (Sections 5–6).</w:t>
       </w:r>
     </w:p>
     <w:p>
@@ -6633,7 +6633,25 @@
           <w:sz w:val="20"/>
           <w:szCs w:val="20"/>
         </w:rPr>
-        <w:t xml:space="preserve"> evaluations of `AccessControl.evaluateRequest`), S3 per-event logging at 10–200 tx/s offered for 20 s, S4 batch anchoring at 1 tx/s, and S5 revocation visibility. Block observation was polled every 25 ms. The benchmark scripts, contracts and raw results are available from the authors on request.</w:t>
+        <w:t xml:space="preserve"> evaluations of </w:t>
+      </w:r>
+      <w:r>
+        <w:rPr>
+          <w:rFonts w:ascii="Times New Roman" w:cs="Times New Roman" w:eastAsia="Times New Roman" w:hAnsi="Times New Roman"/>
+          <w:i/>
+          <w:iCs/>
+          <w:sz w:val="20"/>
+          <w:szCs w:val="20"/>
+        </w:rPr>
+        <w:t xml:space="preserve">AccessControl.evaluateRequest</w:t>
+      </w:r>
+      <w:r>
+        <w:rPr>
+          <w:rFonts w:ascii="Times New Roman" w:cs="Times New Roman" w:eastAsia="Times New Roman" w:hAnsi="Times New Roman"/>
+          <w:sz w:val="20"/>
+          <w:szCs w:val="20"/>
+        </w:rPr>
+        <w:t xml:space="preserve">), S3 per-event logging at 10–200 tx/s offered for 20 s, S4 batch anchoring at 1 tx/s, and S5 revocation visibility. Block observation was polled every 25 ms. The benchmark scripts, contracts and raw results are available from the authors on request.</w:t>
       </w:r>
     </w:p>
     <w:p>
@@ -6681,7 +6699,7 @@
           <w:sz w:val="20"/>
           <w:szCs w:val="20"/>
         </w:rPr>
-        <w:t xml:space="preserve">C. Evaluation Method</w:t>
+        <w:t xml:space="preserve">C. End-to-End Prototype and Load Generator</w:t>
       </w:r>
     </w:p>
     <w:p>
@@ -6695,7 +6713,115 @@
           <w:sz w:val="20"/>
           <w:szCs w:val="20"/>
         </w:rPr>
-        <w:t xml:space="preserve">Ledger-side quantities are taken from the Besu measurements above. The edge request path and the two non-blockchain baselines are produced by a Monte-Carlo model (seed 42, 100,000 trials) that composes per-step costs: LAN/WAN round trips, ECDSA verify/sign, Merkle verification, directory or cache lookup, policy evaluation, and, for cache misses, the measured chain-read latency (5.4 ms). Per-step costs use log-normal noise (σ = 0.15 compute, 0.3 network). The synchronous blockchain baseline uses the measured S3 latency at the same offered load. No physical plant was available, so LAN/WAN and PKI costs are assumptions.</w:t>
+        <w:t xml:space="preserve">Besides the contract-level tests, we implemented the complete request path as running software (Node.js 20): a PEP/PDP service, a load generator and the baselines of Section V-D. Each device owns a secp256k1 key and signs </w:t>
+      </w:r>
+      <w:r>
+        <w:rPr>
+          <w:rFonts w:ascii="Times New Roman" w:cs="Times New Roman" w:eastAsia="Times New Roman" w:hAnsi="Times New Roman"/>
+          <w:i/>
+          <w:iCs/>
+          <w:sz w:val="20"/>
+          <w:szCs w:val="20"/>
+        </w:rPr>
+        <w:t xml:space="preserve">DID | resource | timestamp | nonce</w:t>
+      </w:r>
+      <w:r>
+        <w:rPr>
+          <w:rFonts w:ascii="Times New Roman" w:cs="Times New Roman" w:eastAsia="Times New Roman" w:hAnsi="Times New Roman"/>
+          <w:sz w:val="20"/>
+          <w:szCs w:val="20"/>
+        </w:rPr>
+        <w:t xml:space="preserve">; its key hash and device class are registered on-chain and its DID is part of one Merkle epoch commitment. The PEP rejects stale timestamps (&gt;5 s) and repeated nonces, recovers the signer, checks it against the registered key hash, verifies the Merkle membership proof against the cached epoch root, and evaluates the ABAC policy (device class 0–1, trust score ≥ 50). In BC-ZTA, identity, trust and policy state are read from Besu with </w:t>
+      </w:r>
+      <w:r>
+        <w:rPr>
+          <w:rFonts w:ascii="Times New Roman" w:cs="Times New Roman" w:eastAsia="Times New Roman" w:hAnsi="Times New Roman"/>
+          <w:i/>
+          <w:iCs/>
+          <w:sz w:val="20"/>
+          <w:szCs w:val="20"/>
+        </w:rPr>
+        <w:t xml:space="preserve">eth_call</w:t>
+      </w:r>
+      <w:r>
+        <w:rPr>
+          <w:rFonts w:ascii="Times New Roman" w:cs="Times New Roman" w:eastAsia="Times New Roman" w:hAnsi="Times New Roman"/>
+          <w:sz w:val="20"/>
+          <w:szCs w:val="20"/>
+        </w:rPr>
+        <w:t xml:space="preserve"> on a cache miss and cached for 30 s; a block-polling subscription (20 ms) invalidates an entry when a </w:t>
+      </w:r>
+      <w:r>
+        <w:rPr>
+          <w:rFonts w:ascii="Times New Roman" w:cs="Times New Roman" w:eastAsia="Times New Roman" w:hAnsi="Times New Roman"/>
+          <w:i/>
+          <w:iCs/>
+          <w:sz w:val="20"/>
+          <w:szCs w:val="20"/>
+        </w:rPr>
+        <w:t xml:space="preserve">DIDRevoked</w:t>
+      </w:r>
+      <w:r>
+        <w:rPr>
+          <w:rFonts w:ascii="Times New Roman" w:cs="Times New Roman" w:eastAsia="Times New Roman" w:hAnsi="Times New Roman"/>
+          <w:sz w:val="20"/>
+          <w:szCs w:val="20"/>
+        </w:rPr>
+        <w:t xml:space="preserve">, </w:t>
+      </w:r>
+      <w:r>
+        <w:rPr>
+          <w:rFonts w:ascii="Times New Roman" w:cs="Times New Roman" w:eastAsia="Times New Roman" w:hAnsi="Times New Roman"/>
+          <w:i/>
+          <w:iCs/>
+          <w:sz w:val="20"/>
+          <w:szCs w:val="20"/>
+        </w:rPr>
+        <w:t xml:space="preserve">KeyUpdated</w:t>
+      </w:r>
+      <w:r>
+        <w:rPr>
+          <w:rFonts w:ascii="Times New Roman" w:cs="Times New Roman" w:eastAsia="Times New Roman" w:hAnsi="Times New Roman"/>
+          <w:sz w:val="20"/>
+          <w:szCs w:val="20"/>
+        </w:rPr>
+        <w:t xml:space="preserve"> or </w:t>
+      </w:r>
+      <w:r>
+        <w:rPr>
+          <w:rFonts w:ascii="Times New Roman" w:cs="Times New Roman" w:eastAsia="Times New Roman" w:hAnsi="Times New Roman"/>
+          <w:i/>
+          <w:iCs/>
+          <w:sz w:val="20"/>
+          <w:szCs w:val="20"/>
+        </w:rPr>
+        <w:t xml:space="preserve">ScoreUpdated</w:t>
+      </w:r>
+      <w:r>
+        <w:rPr>
+          <w:rFonts w:ascii="Times New Roman" w:cs="Times New Roman" w:eastAsia="Times New Roman" w:hAnsi="Times New Roman"/>
+          <w:sz w:val="20"/>
+          <w:szCs w:val="20"/>
+        </w:rPr>
+        <w:t xml:space="preserve"> event is mined; every decision is hashed, and once per second the Merkle root of the pending batch is anchored with </w:t>
+      </w:r>
+      <w:r>
+        <w:rPr>
+          <w:rFonts w:ascii="Times New Roman" w:cs="Times New Roman" w:eastAsia="Times New Roman" w:hAnsi="Times New Roman"/>
+          <w:i/>
+          <w:iCs/>
+          <w:sz w:val="20"/>
+          <w:szCs w:val="20"/>
+        </w:rPr>
+        <w:t xml:space="preserve">AuditLog.anchorBatch</w:t>
+      </w:r>
+      <w:r>
+        <w:rPr>
+          <w:rFonts w:ascii="Times New Roman" w:cs="Times New Roman" w:eastAsia="Times New Roman" w:hAnsi="Times New Roman"/>
+          <w:sz w:val="20"/>
+          <w:szCs w:val="20"/>
+        </w:rPr>
+        <w:t xml:space="preserve">. The load generator emulates N = 10, 25, 50, 100, 200 devices, each sending one request per second with staggered phases, for 5 s of warm-up and a 20 s measurement window; requests are signed before the window so that the generator itself is not the bottleneck. The PEP, the baseline servers, the load generator and all four Besu validators run on the same 2-vCPU host.</w:t>
       </w:r>
     </w:p>
     <w:p>
@@ -6744,7 +6870,7 @@
           <w:sz w:val="20"/>
           <w:szCs w:val="20"/>
         </w:rPr>
-        <w:t xml:space="preserve">: WAN directory lookup per request. (B2) </w:t>
+        <w:t xml:space="preserve">: each request makes one lookup at a separate directory server, with an emulated WAN round trip of 40 ms plus 2 ms directory time (an in-process delay, not a real network). (B2) </w:t>
       </w:r>
       <w:r>
         <w:rPr>
@@ -6762,7 +6888,7 @@
           <w:sz w:val="20"/>
           <w:szCs w:val="20"/>
         </w:rPr>
-        <w:t xml:space="preserve">: local attribute store, no ledger. (B3) </w:t>
+        <w:t xml:space="preserve">: a local attribute store at the PEP. (B3) </w:t>
       </w:r>
       <w:r>
         <w:rPr>
@@ -6780,7 +6906,7 @@
           <w:sz w:val="20"/>
           <w:szCs w:val="20"/>
         </w:rPr>
-        <w:t xml:space="preserve">: every authentication and authorisation is an on-chain transaction waiting for finality. (P) </w:t>
+        <w:t xml:space="preserve">: for every request the PEP reads the state with </w:t>
       </w:r>
       <w:r>
         <w:rPr>
@@ -6790,6 +6916,42 @@
           <w:sz w:val="20"/>
           <w:szCs w:val="20"/>
         </w:rPr>
+        <w:t xml:space="preserve">eth_call</w:t>
+      </w:r>
+      <w:r>
+        <w:rPr>
+          <w:rFonts w:ascii="Times New Roman" w:cs="Times New Roman" w:eastAsia="Times New Roman" w:hAnsi="Times New Roman"/>
+          <w:sz w:val="20"/>
+          <w:szCs w:val="20"/>
+        </w:rPr>
+        <w:t xml:space="preserve"> and sends an </w:t>
+      </w:r>
+      <w:r>
+        <w:rPr>
+          <w:rFonts w:ascii="Times New Roman" w:cs="Times New Roman" w:eastAsia="Times New Roman" w:hAnsi="Times New Roman"/>
+          <w:i/>
+          <w:iCs/>
+          <w:sz w:val="20"/>
+          <w:szCs w:val="20"/>
+        </w:rPr>
+        <w:t xml:space="preserve">AuditLog.logEvent</w:t>
+      </w:r>
+      <w:r>
+        <w:rPr>
+          <w:rFonts w:ascii="Times New Roman" w:cs="Times New Roman" w:eastAsia="Times New Roman" w:hAnsi="Times New Roman"/>
+          <w:sz w:val="20"/>
+          <w:szCs w:val="20"/>
+        </w:rPr>
+        <w:t xml:space="preserve"> transaction (eight sender accounts) and replies only after the block containing it is observed. (P) </w:t>
+      </w:r>
+      <w:r>
+        <w:rPr>
+          <w:rFonts w:ascii="Times New Roman" w:cs="Times New Roman" w:eastAsia="Times New Roman" w:hAnsi="Times New Roman"/>
+          <w:i/>
+          <w:iCs/>
+          <w:sz w:val="20"/>
+          <w:szCs w:val="20"/>
+        </w:rPr>
         <w:t xml:space="preserve">Proposed BC-ZTA</w:t>
       </w:r>
       <w:r>
@@ -6798,7 +6960,7 @@
           <w:sz w:val="20"/>
           <w:szCs w:val="20"/>
         </w:rPr>
-        <w:t xml:space="preserve">: cached, Merkle-verified reads with a 90% hit ratio and asynchronous writes.</w:t>
+        <w:t xml:space="preserve"> as in Section V-C. All four use the same request format, signature check and policy, so differences come from where state is read and written.</w:t>
       </w:r>
     </w:p>
     <w:p>
@@ -6830,7 +6992,7 @@
           <w:sz w:val="20"/>
           <w:szCs w:val="20"/>
         </w:rPr>
-        <w:t xml:space="preserve">Table 4 lists the parameters used by the model; every value can be changed in the code, which is available from the authors on request.</w:t>
+        <w:t xml:space="preserve">Table 4 lists the experimental parameters; the PKI delay is an assumption, the other values are configuration of the prototype.</w:t>
       </w:r>
     </w:p>
     <w:p>
@@ -6845,7 +7007,7 @@
           <w:sz w:val="16"/>
           <w:szCs w:val="16"/>
         </w:rPr>
-        <w:t xml:space="preserve">TABLE 4. KEY MODEL PARAMETERS</w:t>
+        <w:t xml:space="preserve">TABLE 4. EXPERIMENTAL PARAMETERS</w:t>
       </w:r>
     </w:p>
     <w:tbl>
@@ -6976,7 +7138,7 @@
                 <w:sz w:val="15"/>
                 <w:szCs w:val="15"/>
               </w:rPr>
-              <w:t xml:space="preserve">LAN / WAN / validator RTT</w:t>
+              <w:t xml:space="preserve">Ledger</w:t>
             </w:r>
           </w:p>
         </w:tc>
@@ -7011,7 +7173,7 @@
                 <w:sz w:val="15"/>
                 <w:szCs w:val="15"/>
               </w:rPr>
-              <w:t xml:space="preserve">2 / 40 / 5 ms</w:t>
+              <w:t xml:space="preserve">Besu v26.9.0, IBFT 2.0, 4 validators</w:t>
             </w:r>
           </w:p>
         </w:tc>
@@ -7051,7 +7213,7 @@
                 <w:sz w:val="15"/>
                 <w:szCs w:val="15"/>
               </w:rPr>
-              <w:t xml:space="preserve">ECDSA verify / sign</w:t>
+              <w:t xml:space="preserve">Block period</w:t>
             </w:r>
           </w:p>
         </w:tc>
@@ -7086,7 +7248,7 @@
                 <w:sz w:val="15"/>
                 <w:szCs w:val="15"/>
               </w:rPr>
-              <w:t xml:space="preserve">3 / 2 ms</w:t>
+              <w:t xml:space="preserve">2 s</w:t>
             </w:r>
           </w:p>
         </w:tc>
@@ -7126,7 +7288,7 @@
                 <w:sz w:val="15"/>
                 <w:szCs w:val="15"/>
               </w:rPr>
-              <w:t xml:space="preserve">Block period; finality mean (measured)</w:t>
+              <w:t xml:space="preserve">Host</w:t>
             </w:r>
           </w:p>
         </w:tc>
@@ -7161,7 +7323,7 @@
                 <w:sz w:val="15"/>
                 <w:szCs w:val="15"/>
               </w:rPr>
-              <w:t xml:space="preserve">2 s; 1520 ms</w:t>
+              <w:t xml:space="preserve">GitHub-hosted, 2 vCPU, 8 GB</w:t>
             </w:r>
           </w:p>
         </w:tc>
@@ -7201,7 +7363,7 @@
                 <w:sz w:val="15"/>
                 <w:szCs w:val="15"/>
               </w:rPr>
-              <w:t xml:space="preserve">Cache TTL; hit ratio</w:t>
+              <w:t xml:space="preserve">Devices; request rate</w:t>
             </w:r>
           </w:p>
         </w:tc>
@@ -7236,7 +7398,7 @@
                 <w:sz w:val="15"/>
                 <w:szCs w:val="15"/>
               </w:rPr>
-              <w:t xml:space="preserve">30 s; 0.9</w:t>
+              <w:t xml:space="preserve">10–200; 1 req/s each</w:t>
             </w:r>
           </w:p>
         </w:tc>
@@ -7276,7 +7438,7 @@
                 <w:sz w:val="15"/>
                 <w:szCs w:val="15"/>
               </w:rPr>
-              <w:t xml:space="preserve">Ledger capacity (measured)</w:t>
+              <w:t xml:space="preserve">Warm-up; window; runs</w:t>
             </w:r>
           </w:p>
         </w:tc>
@@ -7311,7 +7473,7 @@
                 <w:sz w:val="15"/>
                 <w:szCs w:val="15"/>
               </w:rPr>
-              <w:t xml:space="preserve">60 tx/s</w:t>
+              <w:t xml:space="preserve">5 s; 20 s; 3</w:t>
             </w:r>
           </w:p>
         </w:tc>
@@ -7351,7 +7513,7 @@
                 <w:sz w:val="15"/>
                 <w:szCs w:val="15"/>
               </w:rPr>
-              <w:t xml:space="preserve">Request rate per device</w:t>
+              <w:t xml:space="preserve">Cache TTL; anchor interval</w:t>
             </w:r>
           </w:p>
         </w:tc>
@@ -7386,7 +7548,7 @@
                 <w:sz w:val="15"/>
                 <w:szCs w:val="15"/>
               </w:rPr>
-              <w:t xml:space="preserve">1 req/s</w:t>
+              <w:t xml:space="preserve">30 s; 1 s</w:t>
             </w:r>
           </w:p>
         </w:tc>
@@ -7426,7 +7588,7 @@
                 <w:sz w:val="15"/>
                 <w:szCs w:val="15"/>
               </w:rPr>
-              <w:t xml:space="preserve">Trust update interval; quorum</w:t>
+              <w:t xml:space="preserve">Emulated WAN RTT (B1)</w:t>
             </w:r>
           </w:p>
         </w:tc>
@@ -7461,7 +7623,7 @@
                 <w:sz w:val="15"/>
                 <w:szCs w:val="15"/>
               </w:rPr>
-              <w:t xml:space="preserve">30 s; 2 votes</w:t>
+              <w:t xml:space="preserve">40 ms</w:t>
             </w:r>
           </w:p>
         </w:tc>
@@ -7476,6 +7638,81 @@
             <w:tcBorders>
               <w:top w:val="none" w:color="FFFFFF" w:sz="0"/>
               <w:left w:val="none" w:color="FFFFFF" w:sz="0"/>
+              <w:bottom w:val="none" w:color="FFFFFF" w:sz="0"/>
+              <w:right w:val="none" w:color="FFFFFF" w:sz="0"/>
+            </w:tcBorders>
+            <w:tcMar>
+              <w:top w:type="dxa" w:w="20"/>
+              <w:left w:type="dxa" w:w="40"/>
+              <w:bottom w:type="dxa" w:w="20"/>
+              <w:right w:type="dxa" w:w="40"/>
+            </w:tcMar>
+            <w:vAlign w:val="center"/>
+          </w:tcPr>
+          <w:p>
+            <w:pPr>
+              <w:keepNext/>
+              <w:spacing w:after="0" w:line="200"/>
+              <w:jc w:val="left"/>
+            </w:pPr>
+            <w:r>
+              <w:rPr>
+                <w:rFonts w:ascii="Times New Roman" w:cs="Times New Roman" w:eastAsia="Times New Roman" w:hAnsi="Times New Roman"/>
+                <w:b w:val="false"/>
+                <w:bCs w:val="false"/>
+                <w:sz w:val="15"/>
+                <w:szCs w:val="15"/>
+              </w:rPr>
+              <w:t xml:space="preserve">Freshness window; policy</w:t>
+            </w:r>
+          </w:p>
+        </w:tc>
+        <w:tc>
+          <w:tcPr>
+            <w:tcW w:type="dxa" w:w="2160"/>
+            <w:tcBorders>
+              <w:top w:val="none" w:color="FFFFFF" w:sz="0"/>
+              <w:left w:val="none" w:color="FFFFFF" w:sz="0"/>
+              <w:bottom w:val="none" w:color="FFFFFF" w:sz="0"/>
+              <w:right w:val="none" w:color="FFFFFF" w:sz="0"/>
+            </w:tcBorders>
+            <w:tcMar>
+              <w:top w:type="dxa" w:w="20"/>
+              <w:left w:type="dxa" w:w="40"/>
+              <w:bottom w:type="dxa" w:w="20"/>
+              <w:right w:type="dxa" w:w="40"/>
+            </w:tcMar>
+            <w:vAlign w:val="center"/>
+          </w:tcPr>
+          <w:p>
+            <w:pPr>
+              <w:keepNext/>
+              <w:spacing w:after="0" w:line="200"/>
+              <w:jc w:val="left"/>
+            </w:pPr>
+            <w:r>
+              <w:rPr>
+                <w:rFonts w:ascii="Times New Roman" w:cs="Times New Roman" w:eastAsia="Times New Roman" w:hAnsi="Times New Roman"/>
+                <w:b w:val="false"/>
+                <w:bCs w:val="false"/>
+                <w:sz w:val="15"/>
+                <w:szCs w:val="15"/>
+              </w:rPr>
+              <w:t xml:space="preserve">5 s; class 0–1, trust ≥ 50</w:t>
+            </w:r>
+          </w:p>
+        </w:tc>
+      </w:tr>
+      <w:tr>
+        <w:trPr>
+          <w:cantSplit/>
+        </w:trPr>
+        <w:tc>
+          <w:tcPr>
+            <w:tcW w:type="dxa" w:w="2700"/>
+            <w:tcBorders>
+              <w:top w:val="none" w:color="FFFFFF" w:sz="0"/>
+              <w:left w:val="none" w:color="FFFFFF" w:sz="0"/>
               <w:bottom w:val="single" w:color="000000" w:sz="4"/>
               <w:right w:val="none" w:color="FFFFFF" w:sz="0"/>
             </w:tcBorders>
@@ -7501,7 +7738,7 @@
                 <w:sz w:val="15"/>
                 <w:szCs w:val="15"/>
               </w:rPr>
-              <w:t xml:space="preserve">Audit batch interval</w:t>
+              <w:t xml:space="preserve">Revocation tests</w:t>
             </w:r>
           </w:p>
         </w:tc>
@@ -7536,7 +7773,7 @@
                 <w:sz w:val="15"/>
                 <w:szCs w:val="15"/>
               </w:rPr>
-              <w:t xml:space="preserve">1 s</w:t>
+              <w:t xml:space="preserve">8 devices × 3 runs per system; TTL 10 s</w:t>
             </w:r>
           </w:p>
         </w:tc>
@@ -7553,7 +7790,7 @@
           <w:sz w:val="14"/>
           <w:szCs w:val="14"/>
         </w:rPr>
-        <w:t xml:space="preserve">Ledger values are measured on Besu; network, PKI and cache values are assumptions for a LAN-connected plant, editable in the code (available on request).</w:t>
+        <w:t xml:space="preserve">Only the PKI round trip is emulated; everything else is measured on running software.</w:t>
       </w:r>
     </w:p>
     <w:p>
@@ -7584,7 +7821,7 @@
           <w:sz w:val="20"/>
           <w:szCs w:val="20"/>
         </w:rPr>
-        <w:t xml:space="preserve">Mean and 95th-percentile authentication and authorisation latency; on-chain write load (tx/s) versus device count; gas per operation; revocation delay (mean and worst case); and audit storage growth.</w:t>
+        <w:t xml:space="preserve">(E1) End-to-end latency (mean, P95) from request send to decision, goodput (accepted requests per second), failures, and on-chain writes per second versus device count. (E2) Revocation enforcement delay: time from the revocation action until the PEP first denies the device. (E3) Security tests with 50 attempts each per run. (E4) Decision latency while the ledger is flooded with transactions. Also gas per operation and, from the micro-benchmark, confirmation latency and ledger throughput.</w:t>
       </w:r>
     </w:p>
     <w:p>
@@ -7631,7 +7868,7 @@
           <w:sz w:val="20"/>
           <w:szCs w:val="20"/>
         </w:rPr>
-        <w:t xml:space="preserve">Table 5 and Fig. 3 give results for 50 devices (1 request/s each), the highest load below the measured ledger saturation. Mean authentication latency of BC-ZTA is 8.2 ms (P95 12.8 ms), 87% lower than the centralised PKI-IAM (62.0 ms) and about 284× faster than the synchronous blockchain (2337 ms). It is within 0.2 ms of the ledger-free ABAC baseline, the cost of Merkle verification and cache lookups.</w:t>
+        <w:t xml:space="preserve">Table 5 and Fig. 3 show end-to-end latency (mean of 3 runs). At 50 devices BC-ZTA answers in 7.4 ms on average (P95 22.3 ms), versus 48.2 ms for the centralised PKI-IAM, 4.4 ms for the ledger-free ABAC store and 10257 ms for the synchronous blockchain. BC-ZTA is therefore 85% faster than the centralised baseline, costs about 3.0 ms more than a local store (Merkle verification, hashing and audit bookkeeping), and is about 1381× faster than checking every request on-chain. Even at 10 devices, where the ledger is not saturated, the synchronous design needs 1426 ms because each request waits for a block.</w:t>
       </w:r>
     </w:p>
     <w:p>
@@ -7646,7 +7883,7 @@
           <w:sz w:val="16"/>
           <w:szCs w:val="16"/>
         </w:rPr>
-        <w:t xml:space="preserve">TABLE 5. LATENCY AT 50 DEVICES (MS; BC-ONLY MEASURED)</w:t>
+        <w:t xml:space="preserve">TABLE 5. END-TO-END LATENCY (MS, MEAN OF 3 RUNS)</w:t>
       </w:r>
     </w:p>
     <w:tbl>
@@ -7663,11 +7900,11 @@
         <w:tblLayout w:type="fixed"/>
       </w:tblPr>
       <w:tblGrid>
-        <w:gridCol w:w="1560"/>
-        <w:gridCol w:w="825"/>
-        <w:gridCol w:w="825"/>
-        <w:gridCol w:w="825"/>
-        <w:gridCol w:w="825"/>
+        <w:gridCol w:w="1500"/>
+        <w:gridCol w:w="840"/>
+        <w:gridCol w:w="840"/>
+        <w:gridCol w:w="840"/>
+        <w:gridCol w:w="840"/>
       </w:tblGrid>
       <w:tr>
         <w:trPr>
@@ -7676,7 +7913,7 @@
         </w:trPr>
         <w:tc>
           <w:tcPr>
-            <w:tcW w:type="dxa" w:w="1560"/>
+            <w:tcW w:type="dxa" w:w="1500"/>
             <w:tcBorders>
               <w:top w:val="single" w:color="000000" w:sz="4"/>
               <w:left w:val="none" w:color="FFFFFF" w:sz="0"/>
@@ -7705,13 +7942,13 @@
                 <w:sz w:val="15"/>
                 <w:szCs w:val="15"/>
               </w:rPr>
-              <w:t xml:space="preserve">Metric</w:t>
-            </w:r>
-          </w:p>
-        </w:tc>
-        <w:tc>
-          <w:tcPr>
-            <w:tcW w:type="dxa" w:w="825"/>
+              <w:t xml:space="preserve">System</w:t>
+            </w:r>
+          </w:p>
+        </w:tc>
+        <w:tc>
+          <w:tcPr>
+            <w:tcW w:type="dxa" w:w="840"/>
             <w:tcBorders>
               <w:top w:val="single" w:color="000000" w:sz="4"/>
               <w:left w:val="none" w:color="FFFFFF" w:sz="0"/>
@@ -7730,7 +7967,7 @@
             <w:pPr>
               <w:keepNext/>
               <w:spacing w:after="0" w:line="200"/>
-              <w:jc w:val="center"/>
+              <w:jc w:val="left"/>
             </w:pPr>
             <w:r>
               <w:rPr>
@@ -7740,13 +7977,13 @@
                 <w:sz w:val="15"/>
                 <w:szCs w:val="15"/>
               </w:rPr>
-              <w:t xml:space="preserve">PKI-IAM</w:t>
-            </w:r>
-          </w:p>
-        </w:tc>
-        <w:tc>
-          <w:tcPr>
-            <w:tcW w:type="dxa" w:w="825"/>
+              <w:t xml:space="preserve">Mean 50</w:t>
+            </w:r>
+          </w:p>
+        </w:tc>
+        <w:tc>
+          <w:tcPr>
+            <w:tcW w:type="dxa" w:w="840"/>
             <w:tcBorders>
               <w:top w:val="single" w:color="000000" w:sz="4"/>
               <w:left w:val="none" w:color="FFFFFF" w:sz="0"/>
@@ -7765,7 +8002,7 @@
             <w:pPr>
               <w:keepNext/>
               <w:spacing w:after="0" w:line="200"/>
-              <w:jc w:val="center"/>
+              <w:jc w:val="left"/>
             </w:pPr>
             <w:r>
               <w:rPr>
@@ -7775,13 +8012,13 @@
                 <w:sz w:val="15"/>
                 <w:szCs w:val="15"/>
               </w:rPr>
-              <w:t xml:space="preserve">ABAC</w:t>
-            </w:r>
-          </w:p>
-        </w:tc>
-        <w:tc>
-          <w:tcPr>
-            <w:tcW w:type="dxa" w:w="825"/>
+              <w:t xml:space="preserve">P95 50</w:t>
+            </w:r>
+          </w:p>
+        </w:tc>
+        <w:tc>
+          <w:tcPr>
+            <w:tcW w:type="dxa" w:w="840"/>
             <w:tcBorders>
               <w:top w:val="single" w:color="000000" w:sz="4"/>
               <w:left w:val="none" w:color="FFFFFF" w:sz="0"/>
@@ -7800,7 +8037,7 @@
             <w:pPr>
               <w:keepNext/>
               <w:spacing w:after="0" w:line="200"/>
-              <w:jc w:val="center"/>
+              <w:jc w:val="left"/>
             </w:pPr>
             <w:r>
               <w:rPr>
@@ -7810,13 +8047,13 @@
                 <w:sz w:val="15"/>
                 <w:szCs w:val="15"/>
               </w:rPr>
-              <w:t xml:space="preserve">BC-only</w:t>
-            </w:r>
-          </w:p>
-        </w:tc>
-        <w:tc>
-          <w:tcPr>
-            <w:tcW w:type="dxa" w:w="825"/>
+              <w:t xml:space="preserve">Mean 200</w:t>
+            </w:r>
+          </w:p>
+        </w:tc>
+        <w:tc>
+          <w:tcPr>
+            <w:tcW w:type="dxa" w:w="840"/>
             <w:tcBorders>
               <w:top w:val="single" w:color="000000" w:sz="4"/>
               <w:left w:val="none" w:color="FFFFFF" w:sz="0"/>
@@ -7835,7 +8072,7 @@
             <w:pPr>
               <w:keepNext/>
               <w:spacing w:after="0" w:line="200"/>
-              <w:jc w:val="center"/>
+              <w:jc w:val="left"/>
             </w:pPr>
             <w:r>
               <w:rPr>
@@ -7845,7 +8082,7 @@
                 <w:sz w:val="15"/>
                 <w:szCs w:val="15"/>
               </w:rPr>
-              <w:t xml:space="preserve">BC-ZTA</w:t>
+              <w:t xml:space="preserve">P95 200</w:t>
             </w:r>
           </w:p>
         </w:tc>
@@ -7856,176 +8093,176 @@
         </w:trPr>
         <w:tc>
           <w:tcPr>
-            <w:tcW w:type="dxa" w:w="1560"/>
-            <w:tcBorders>
-              <w:top w:val="none" w:color="FFFFFF" w:sz="0"/>
-              <w:left w:val="none" w:color="FFFFFF" w:sz="0"/>
-              <w:bottom w:val="none" w:color="FFFFFF" w:sz="0"/>
-              <w:right w:val="none" w:color="FFFFFF" w:sz="0"/>
-            </w:tcBorders>
-            <w:tcMar>
-              <w:top w:type="dxa" w:w="20"/>
-              <w:left w:type="dxa" w:w="40"/>
-              <w:bottom w:type="dxa" w:w="20"/>
-              <w:right w:type="dxa" w:w="40"/>
-            </w:tcMar>
-            <w:vAlign w:val="center"/>
-          </w:tcPr>
-          <w:p>
-            <w:pPr>
-              <w:keepNext/>
-              <w:spacing w:after="0" w:line="200"/>
-              <w:jc w:val="left"/>
-            </w:pPr>
-            <w:r>
-              <w:rPr>
-                <w:rFonts w:ascii="Times New Roman" w:cs="Times New Roman" w:eastAsia="Times New Roman" w:hAnsi="Times New Roman"/>
-                <w:b w:val="false"/>
-                <w:bCs w:val="false"/>
-                <w:sz w:val="15"/>
-                <w:szCs w:val="15"/>
-              </w:rPr>
-              <w:t xml:space="preserve">Auth. mean</w:t>
-            </w:r>
-          </w:p>
-        </w:tc>
-        <w:tc>
-          <w:tcPr>
-            <w:tcW w:type="dxa" w:w="825"/>
-            <w:tcBorders>
-              <w:top w:val="none" w:color="FFFFFF" w:sz="0"/>
-              <w:left w:val="none" w:color="FFFFFF" w:sz="0"/>
-              <w:bottom w:val="none" w:color="FFFFFF" w:sz="0"/>
-              <w:right w:val="none" w:color="FFFFFF" w:sz="0"/>
-            </w:tcBorders>
-            <w:tcMar>
-              <w:top w:type="dxa" w:w="20"/>
-              <w:left w:type="dxa" w:w="40"/>
-              <w:bottom w:type="dxa" w:w="20"/>
-              <w:right w:type="dxa" w:w="40"/>
-            </w:tcMar>
-            <w:vAlign w:val="center"/>
-          </w:tcPr>
-          <w:p>
-            <w:pPr>
-              <w:keepNext/>
-              <w:spacing w:after="0" w:line="200"/>
-              <w:jc w:val="center"/>
-            </w:pPr>
-            <w:r>
-              <w:rPr>
-                <w:rFonts w:ascii="Times New Roman" w:cs="Times New Roman" w:eastAsia="Times New Roman" w:hAnsi="Times New Roman"/>
-                <w:b w:val="false"/>
-                <w:bCs w:val="false"/>
-                <w:sz w:val="15"/>
-                <w:szCs w:val="15"/>
-              </w:rPr>
-              <w:t xml:space="preserve">62.0</w:t>
-            </w:r>
-          </w:p>
-        </w:tc>
-        <w:tc>
-          <w:tcPr>
-            <w:tcW w:type="dxa" w:w="825"/>
-            <w:tcBorders>
-              <w:top w:val="none" w:color="FFFFFF" w:sz="0"/>
-              <w:left w:val="none" w:color="FFFFFF" w:sz="0"/>
-              <w:bottom w:val="none" w:color="FFFFFF" w:sz="0"/>
-              <w:right w:val="none" w:color="FFFFFF" w:sz="0"/>
-            </w:tcBorders>
-            <w:tcMar>
-              <w:top w:type="dxa" w:w="20"/>
-              <w:left w:type="dxa" w:w="40"/>
-              <w:bottom w:type="dxa" w:w="20"/>
-              <w:right w:type="dxa" w:w="40"/>
-            </w:tcMar>
-            <w:vAlign w:val="center"/>
-          </w:tcPr>
-          <w:p>
-            <w:pPr>
-              <w:keepNext/>
-              <w:spacing w:after="0" w:line="200"/>
-              <w:jc w:val="center"/>
-            </w:pPr>
-            <w:r>
-              <w:rPr>
-                <w:rFonts w:ascii="Times New Roman" w:cs="Times New Roman" w:eastAsia="Times New Roman" w:hAnsi="Times New Roman"/>
-                <w:b w:val="false"/>
-                <w:bCs w:val="false"/>
-                <w:sz w:val="15"/>
-                <w:szCs w:val="15"/>
-              </w:rPr>
-              <w:t xml:space="preserve">8.0</w:t>
-            </w:r>
-          </w:p>
-        </w:tc>
-        <w:tc>
-          <w:tcPr>
-            <w:tcW w:type="dxa" w:w="825"/>
-            <w:tcBorders>
-              <w:top w:val="none" w:color="FFFFFF" w:sz="0"/>
-              <w:left w:val="none" w:color="FFFFFF" w:sz="0"/>
-              <w:bottom w:val="none" w:color="FFFFFF" w:sz="0"/>
-              <w:right w:val="none" w:color="FFFFFF" w:sz="0"/>
-            </w:tcBorders>
-            <w:tcMar>
-              <w:top w:type="dxa" w:w="20"/>
-              <w:left w:type="dxa" w:w="40"/>
-              <w:bottom w:type="dxa" w:w="20"/>
-              <w:right w:type="dxa" w:w="40"/>
-            </w:tcMar>
-            <w:vAlign w:val="center"/>
-          </w:tcPr>
-          <w:p>
-            <w:pPr>
-              <w:keepNext/>
-              <w:spacing w:after="0" w:line="200"/>
-              <w:jc w:val="center"/>
-            </w:pPr>
-            <w:r>
-              <w:rPr>
-                <w:rFonts w:ascii="Times New Roman" w:cs="Times New Roman" w:eastAsia="Times New Roman" w:hAnsi="Times New Roman"/>
-                <w:b w:val="false"/>
-                <w:bCs w:val="false"/>
-                <w:sz w:val="15"/>
-                <w:szCs w:val="15"/>
-              </w:rPr>
-              <w:t xml:space="preserve">2336.7</w:t>
-            </w:r>
-          </w:p>
-        </w:tc>
-        <w:tc>
-          <w:tcPr>
-            <w:tcW w:type="dxa" w:w="825"/>
-            <w:tcBorders>
-              <w:top w:val="none" w:color="FFFFFF" w:sz="0"/>
-              <w:left w:val="none" w:color="FFFFFF" w:sz="0"/>
-              <w:bottom w:val="none" w:color="FFFFFF" w:sz="0"/>
-              <w:right w:val="none" w:color="FFFFFF" w:sz="0"/>
-            </w:tcBorders>
-            <w:tcMar>
-              <w:top w:type="dxa" w:w="20"/>
-              <w:left w:type="dxa" w:w="40"/>
-              <w:bottom w:type="dxa" w:w="20"/>
-              <w:right w:type="dxa" w:w="40"/>
-            </w:tcMar>
-            <w:vAlign w:val="center"/>
-          </w:tcPr>
-          <w:p>
-            <w:pPr>
-              <w:keepNext/>
-              <w:spacing w:after="0" w:line="200"/>
-              <w:jc w:val="center"/>
-            </w:pPr>
-            <w:r>
-              <w:rPr>
-                <w:rFonts w:ascii="Times New Roman" w:cs="Times New Roman" w:eastAsia="Times New Roman" w:hAnsi="Times New Roman"/>
-                <w:b/>
-                <w:bCs/>
-                <w:sz w:val="15"/>
-                <w:szCs w:val="15"/>
-              </w:rPr>
-              <w:t xml:space="preserve">8.2</w:t>
+            <w:tcW w:type="dxa" w:w="1500"/>
+            <w:tcBorders>
+              <w:top w:val="none" w:color="FFFFFF" w:sz="0"/>
+              <w:left w:val="none" w:color="FFFFFF" w:sz="0"/>
+              <w:bottom w:val="none" w:color="FFFFFF" w:sz="0"/>
+              <w:right w:val="none" w:color="FFFFFF" w:sz="0"/>
+            </w:tcBorders>
+            <w:tcMar>
+              <w:top w:type="dxa" w:w="20"/>
+              <w:left w:type="dxa" w:w="40"/>
+              <w:bottom w:type="dxa" w:w="20"/>
+              <w:right w:type="dxa" w:w="40"/>
+            </w:tcMar>
+            <w:vAlign w:val="center"/>
+          </w:tcPr>
+          <w:p>
+            <w:pPr>
+              <w:keepNext/>
+              <w:spacing w:after="0" w:line="200"/>
+              <w:jc w:val="left"/>
+            </w:pPr>
+            <w:r>
+              <w:rPr>
+                <w:rFonts w:ascii="Times New Roman" w:cs="Times New Roman" w:eastAsia="Times New Roman" w:hAnsi="Times New Roman"/>
+                <w:b w:val="false"/>
+                <w:bCs w:val="false"/>
+                <w:sz w:val="15"/>
+                <w:szCs w:val="15"/>
+              </w:rPr>
+              <w:t xml:space="preserve">PKI-IAM</w:t>
+            </w:r>
+          </w:p>
+        </w:tc>
+        <w:tc>
+          <w:tcPr>
+            <w:tcW w:type="dxa" w:w="840"/>
+            <w:tcBorders>
+              <w:top w:val="none" w:color="FFFFFF" w:sz="0"/>
+              <w:left w:val="none" w:color="FFFFFF" w:sz="0"/>
+              <w:bottom w:val="none" w:color="FFFFFF" w:sz="0"/>
+              <w:right w:val="none" w:color="FFFFFF" w:sz="0"/>
+            </w:tcBorders>
+            <w:tcMar>
+              <w:top w:type="dxa" w:w="20"/>
+              <w:left w:type="dxa" w:w="40"/>
+              <w:bottom w:type="dxa" w:w="20"/>
+              <w:right w:type="dxa" w:w="40"/>
+            </w:tcMar>
+            <w:vAlign w:val="center"/>
+          </w:tcPr>
+          <w:p>
+            <w:pPr>
+              <w:keepNext/>
+              <w:spacing w:after="0" w:line="200"/>
+              <w:jc w:val="left"/>
+            </w:pPr>
+            <w:r>
+              <w:rPr>
+                <w:rFonts w:ascii="Times New Roman" w:cs="Times New Roman" w:eastAsia="Times New Roman" w:hAnsi="Times New Roman"/>
+                <w:b w:val="false"/>
+                <w:bCs w:val="false"/>
+                <w:sz w:val="15"/>
+                <w:szCs w:val="15"/>
+              </w:rPr>
+              <w:t xml:space="preserve">48.2</w:t>
+            </w:r>
+          </w:p>
+        </w:tc>
+        <w:tc>
+          <w:tcPr>
+            <w:tcW w:type="dxa" w:w="840"/>
+            <w:tcBorders>
+              <w:top w:val="none" w:color="FFFFFF" w:sz="0"/>
+              <w:left w:val="none" w:color="FFFFFF" w:sz="0"/>
+              <w:bottom w:val="none" w:color="FFFFFF" w:sz="0"/>
+              <w:right w:val="none" w:color="FFFFFF" w:sz="0"/>
+            </w:tcBorders>
+            <w:tcMar>
+              <w:top w:type="dxa" w:w="20"/>
+              <w:left w:type="dxa" w:w="40"/>
+              <w:bottom w:type="dxa" w:w="20"/>
+              <w:right w:type="dxa" w:w="40"/>
+            </w:tcMar>
+            <w:vAlign w:val="center"/>
+          </w:tcPr>
+          <w:p>
+            <w:pPr>
+              <w:keepNext/>
+              <w:spacing w:after="0" w:line="200"/>
+              <w:jc w:val="left"/>
+            </w:pPr>
+            <w:r>
+              <w:rPr>
+                <w:rFonts w:ascii="Times New Roman" w:cs="Times New Roman" w:eastAsia="Times New Roman" w:hAnsi="Times New Roman"/>
+                <w:b w:val="false"/>
+                <w:bCs w:val="false"/>
+                <w:sz w:val="15"/>
+                <w:szCs w:val="15"/>
+              </w:rPr>
+              <w:t xml:space="preserve">57.1</w:t>
+            </w:r>
+          </w:p>
+        </w:tc>
+        <w:tc>
+          <w:tcPr>
+            <w:tcW w:type="dxa" w:w="840"/>
+            <w:tcBorders>
+              <w:top w:val="none" w:color="FFFFFF" w:sz="0"/>
+              <w:left w:val="none" w:color="FFFFFF" w:sz="0"/>
+              <w:bottom w:val="none" w:color="FFFFFF" w:sz="0"/>
+              <w:right w:val="none" w:color="FFFFFF" w:sz="0"/>
+            </w:tcBorders>
+            <w:tcMar>
+              <w:top w:type="dxa" w:w="20"/>
+              <w:left w:type="dxa" w:w="40"/>
+              <w:bottom w:type="dxa" w:w="20"/>
+              <w:right w:type="dxa" w:w="40"/>
+            </w:tcMar>
+            <w:vAlign w:val="center"/>
+          </w:tcPr>
+          <w:p>
+            <w:pPr>
+              <w:keepNext/>
+              <w:spacing w:after="0" w:line="200"/>
+              <w:jc w:val="left"/>
+            </w:pPr>
+            <w:r>
+              <w:rPr>
+                <w:rFonts w:ascii="Times New Roman" w:cs="Times New Roman" w:eastAsia="Times New Roman" w:hAnsi="Times New Roman"/>
+                <w:b w:val="false"/>
+                <w:bCs w:val="false"/>
+                <w:sz w:val="15"/>
+                <w:szCs w:val="15"/>
+              </w:rPr>
+              <w:t xml:space="preserve">60.8</w:t>
+            </w:r>
+          </w:p>
+        </w:tc>
+        <w:tc>
+          <w:tcPr>
+            <w:tcW w:type="dxa" w:w="840"/>
+            <w:tcBorders>
+              <w:top w:val="none" w:color="FFFFFF" w:sz="0"/>
+              <w:left w:val="none" w:color="FFFFFF" w:sz="0"/>
+              <w:bottom w:val="none" w:color="FFFFFF" w:sz="0"/>
+              <w:right w:val="none" w:color="FFFFFF" w:sz="0"/>
+            </w:tcBorders>
+            <w:tcMar>
+              <w:top w:type="dxa" w:w="20"/>
+              <w:left w:type="dxa" w:w="40"/>
+              <w:bottom w:type="dxa" w:w="20"/>
+              <w:right w:type="dxa" w:w="40"/>
+            </w:tcMar>
+            <w:vAlign w:val="center"/>
+          </w:tcPr>
+          <w:p>
+            <w:pPr>
+              <w:keepNext/>
+              <w:spacing w:after="0" w:line="200"/>
+              <w:jc w:val="left"/>
+            </w:pPr>
+            <w:r>
+              <w:rPr>
+                <w:rFonts w:ascii="Times New Roman" w:cs="Times New Roman" w:eastAsia="Times New Roman" w:hAnsi="Times New Roman"/>
+                <w:b w:val="false"/>
+                <w:bCs w:val="false"/>
+                <w:sz w:val="15"/>
+                <w:szCs w:val="15"/>
+              </w:rPr>
+              <w:t xml:space="preserve">126.7</w:t>
             </w:r>
           </w:p>
         </w:tc>
@@ -8036,176 +8273,176 @@
         </w:trPr>
         <w:tc>
           <w:tcPr>
-            <w:tcW w:type="dxa" w:w="1560"/>
-            <w:tcBorders>
-              <w:top w:val="none" w:color="FFFFFF" w:sz="0"/>
-              <w:left w:val="none" w:color="FFFFFF" w:sz="0"/>
-              <w:bottom w:val="none" w:color="FFFFFF" w:sz="0"/>
-              <w:right w:val="none" w:color="FFFFFF" w:sz="0"/>
-            </w:tcBorders>
-            <w:tcMar>
-              <w:top w:type="dxa" w:w="20"/>
-              <w:left w:type="dxa" w:w="40"/>
-              <w:bottom w:type="dxa" w:w="20"/>
-              <w:right w:type="dxa" w:w="40"/>
-            </w:tcMar>
-            <w:vAlign w:val="center"/>
-          </w:tcPr>
-          <w:p>
-            <w:pPr>
-              <w:keepNext/>
-              <w:spacing w:after="0" w:line="200"/>
-              <w:jc w:val="left"/>
-            </w:pPr>
-            <w:r>
-              <w:rPr>
-                <w:rFonts w:ascii="Times New Roman" w:cs="Times New Roman" w:eastAsia="Times New Roman" w:hAnsi="Times New Roman"/>
-                <w:b w:val="false"/>
-                <w:bCs w:val="false"/>
-                <w:sz w:val="15"/>
-                <w:szCs w:val="15"/>
-              </w:rPr>
-              <w:t xml:space="preserve">Auth. P95</w:t>
-            </w:r>
-          </w:p>
-        </w:tc>
-        <w:tc>
-          <w:tcPr>
-            <w:tcW w:type="dxa" w:w="825"/>
-            <w:tcBorders>
-              <w:top w:val="none" w:color="FFFFFF" w:sz="0"/>
-              <w:left w:val="none" w:color="FFFFFF" w:sz="0"/>
-              <w:bottom w:val="none" w:color="FFFFFF" w:sz="0"/>
-              <w:right w:val="none" w:color="FFFFFF" w:sz="0"/>
-            </w:tcBorders>
-            <w:tcMar>
-              <w:top w:type="dxa" w:w="20"/>
-              <w:left w:type="dxa" w:w="40"/>
-              <w:bottom w:type="dxa" w:w="20"/>
-              <w:right w:type="dxa" w:w="40"/>
-            </w:tcMar>
-            <w:vAlign w:val="center"/>
-          </w:tcPr>
-          <w:p>
-            <w:pPr>
-              <w:keepNext/>
-              <w:spacing w:after="0" w:line="200"/>
-              <w:jc w:val="center"/>
-            </w:pPr>
-            <w:r>
-              <w:rPr>
-                <w:rFonts w:ascii="Times New Roman" w:cs="Times New Roman" w:eastAsia="Times New Roman" w:hAnsi="Times New Roman"/>
-                <w:b w:val="false"/>
-                <w:bCs w:val="false"/>
-                <w:sz w:val="15"/>
-                <w:szCs w:val="15"/>
-              </w:rPr>
-              <w:t xml:space="preserve">85.1</w:t>
-            </w:r>
-          </w:p>
-        </w:tc>
-        <w:tc>
-          <w:tcPr>
-            <w:tcW w:type="dxa" w:w="825"/>
-            <w:tcBorders>
-              <w:top w:val="none" w:color="FFFFFF" w:sz="0"/>
-              <w:left w:val="none" w:color="FFFFFF" w:sz="0"/>
-              <w:bottom w:val="none" w:color="FFFFFF" w:sz="0"/>
-              <w:right w:val="none" w:color="FFFFFF" w:sz="0"/>
-            </w:tcBorders>
-            <w:tcMar>
-              <w:top w:type="dxa" w:w="20"/>
-              <w:left w:type="dxa" w:w="40"/>
-              <w:bottom w:type="dxa" w:w="20"/>
-              <w:right w:type="dxa" w:w="40"/>
-            </w:tcMar>
-            <w:vAlign w:val="center"/>
-          </w:tcPr>
-          <w:p>
-            <w:pPr>
-              <w:keepNext/>
-              <w:spacing w:after="0" w:line="200"/>
-              <w:jc w:val="center"/>
-            </w:pPr>
-            <w:r>
-              <w:rPr>
-                <w:rFonts w:ascii="Times New Roman" w:cs="Times New Roman" w:eastAsia="Times New Roman" w:hAnsi="Times New Roman"/>
-                <w:b w:val="false"/>
-                <w:bCs w:val="false"/>
-                <w:sz w:val="15"/>
-                <w:szCs w:val="15"/>
-              </w:rPr>
-              <w:t xml:space="preserve">9.5</w:t>
-            </w:r>
-          </w:p>
-        </w:tc>
-        <w:tc>
-          <w:tcPr>
-            <w:tcW w:type="dxa" w:w="825"/>
-            <w:tcBorders>
-              <w:top w:val="none" w:color="FFFFFF" w:sz="0"/>
-              <w:left w:val="none" w:color="FFFFFF" w:sz="0"/>
-              <w:bottom w:val="none" w:color="FFFFFF" w:sz="0"/>
-              <w:right w:val="none" w:color="FFFFFF" w:sz="0"/>
-            </w:tcBorders>
-            <w:tcMar>
-              <w:top w:type="dxa" w:w="20"/>
-              <w:left w:type="dxa" w:w="40"/>
-              <w:bottom w:type="dxa" w:w="20"/>
-              <w:right w:type="dxa" w:w="40"/>
-            </w:tcMar>
-            <w:vAlign w:val="center"/>
-          </w:tcPr>
-          <w:p>
-            <w:pPr>
-              <w:keepNext/>
-              <w:spacing w:after="0" w:line="200"/>
-              <w:jc w:val="center"/>
-            </w:pPr>
-            <w:r>
-              <w:rPr>
-                <w:rFonts w:ascii="Times New Roman" w:cs="Times New Roman" w:eastAsia="Times New Roman" w:hAnsi="Times New Roman"/>
-                <w:b w:val="false"/>
-                <w:bCs w:val="false"/>
-                <w:sz w:val="15"/>
-                <w:szCs w:val="15"/>
-              </w:rPr>
-              <w:t xml:space="preserve">3632.9</w:t>
-            </w:r>
-          </w:p>
-        </w:tc>
-        <w:tc>
-          <w:tcPr>
-            <w:tcW w:type="dxa" w:w="825"/>
-            <w:tcBorders>
-              <w:top w:val="none" w:color="FFFFFF" w:sz="0"/>
-              <w:left w:val="none" w:color="FFFFFF" w:sz="0"/>
-              <w:bottom w:val="none" w:color="FFFFFF" w:sz="0"/>
-              <w:right w:val="none" w:color="FFFFFF" w:sz="0"/>
-            </w:tcBorders>
-            <w:tcMar>
-              <w:top w:type="dxa" w:w="20"/>
-              <w:left w:type="dxa" w:w="40"/>
-              <w:bottom w:type="dxa" w:w="20"/>
-              <w:right w:type="dxa" w:w="40"/>
-            </w:tcMar>
-            <w:vAlign w:val="center"/>
-          </w:tcPr>
-          <w:p>
-            <w:pPr>
-              <w:keepNext/>
-              <w:spacing w:after="0" w:line="200"/>
-              <w:jc w:val="center"/>
-            </w:pPr>
-            <w:r>
-              <w:rPr>
-                <w:rFonts w:ascii="Times New Roman" w:cs="Times New Roman" w:eastAsia="Times New Roman" w:hAnsi="Times New Roman"/>
-                <w:b/>
-                <w:bCs/>
-                <w:sz w:val="15"/>
-                <w:szCs w:val="15"/>
-              </w:rPr>
-              <w:t xml:space="preserve">12.8</w:t>
+            <w:tcW w:type="dxa" w:w="1500"/>
+            <w:tcBorders>
+              <w:top w:val="none" w:color="FFFFFF" w:sz="0"/>
+              <w:left w:val="none" w:color="FFFFFF" w:sz="0"/>
+              <w:bottom w:val="none" w:color="FFFFFF" w:sz="0"/>
+              <w:right w:val="none" w:color="FFFFFF" w:sz="0"/>
+            </w:tcBorders>
+            <w:tcMar>
+              <w:top w:type="dxa" w:w="20"/>
+              <w:left w:type="dxa" w:w="40"/>
+              <w:bottom w:type="dxa" w:w="20"/>
+              <w:right w:type="dxa" w:w="40"/>
+            </w:tcMar>
+            <w:vAlign w:val="center"/>
+          </w:tcPr>
+          <w:p>
+            <w:pPr>
+              <w:keepNext/>
+              <w:spacing w:after="0" w:line="200"/>
+              <w:jc w:val="left"/>
+            </w:pPr>
+            <w:r>
+              <w:rPr>
+                <w:rFonts w:ascii="Times New Roman" w:cs="Times New Roman" w:eastAsia="Times New Roman" w:hAnsi="Times New Roman"/>
+                <w:b w:val="false"/>
+                <w:bCs w:val="false"/>
+                <w:sz w:val="15"/>
+                <w:szCs w:val="15"/>
+              </w:rPr>
+              <w:t xml:space="preserve">ABAC</w:t>
+            </w:r>
+          </w:p>
+        </w:tc>
+        <w:tc>
+          <w:tcPr>
+            <w:tcW w:type="dxa" w:w="840"/>
+            <w:tcBorders>
+              <w:top w:val="none" w:color="FFFFFF" w:sz="0"/>
+              <w:left w:val="none" w:color="FFFFFF" w:sz="0"/>
+              <w:bottom w:val="none" w:color="FFFFFF" w:sz="0"/>
+              <w:right w:val="none" w:color="FFFFFF" w:sz="0"/>
+            </w:tcBorders>
+            <w:tcMar>
+              <w:top w:type="dxa" w:w="20"/>
+              <w:left w:type="dxa" w:w="40"/>
+              <w:bottom w:type="dxa" w:w="20"/>
+              <w:right w:type="dxa" w:w="40"/>
+            </w:tcMar>
+            <w:vAlign w:val="center"/>
+          </w:tcPr>
+          <w:p>
+            <w:pPr>
+              <w:keepNext/>
+              <w:spacing w:after="0" w:line="200"/>
+              <w:jc w:val="left"/>
+            </w:pPr>
+            <w:r>
+              <w:rPr>
+                <w:rFonts w:ascii="Times New Roman" w:cs="Times New Roman" w:eastAsia="Times New Roman" w:hAnsi="Times New Roman"/>
+                <w:b w:val="false"/>
+                <w:bCs w:val="false"/>
+                <w:sz w:val="15"/>
+                <w:szCs w:val="15"/>
+              </w:rPr>
+              <w:t xml:space="preserve">4.4</w:t>
+            </w:r>
+          </w:p>
+        </w:tc>
+        <w:tc>
+          <w:tcPr>
+            <w:tcW w:type="dxa" w:w="840"/>
+            <w:tcBorders>
+              <w:top w:val="none" w:color="FFFFFF" w:sz="0"/>
+              <w:left w:val="none" w:color="FFFFFF" w:sz="0"/>
+              <w:bottom w:val="none" w:color="FFFFFF" w:sz="0"/>
+              <w:right w:val="none" w:color="FFFFFF" w:sz="0"/>
+            </w:tcBorders>
+            <w:tcMar>
+              <w:top w:type="dxa" w:w="20"/>
+              <w:left w:type="dxa" w:w="40"/>
+              <w:bottom w:type="dxa" w:w="20"/>
+              <w:right w:type="dxa" w:w="40"/>
+            </w:tcMar>
+            <w:vAlign w:val="center"/>
+          </w:tcPr>
+          <w:p>
+            <w:pPr>
+              <w:keepNext/>
+              <w:spacing w:after="0" w:line="200"/>
+              <w:jc w:val="left"/>
+            </w:pPr>
+            <w:r>
+              <w:rPr>
+                <w:rFonts w:ascii="Times New Roman" w:cs="Times New Roman" w:eastAsia="Times New Roman" w:hAnsi="Times New Roman"/>
+                <w:b w:val="false"/>
+                <w:bCs w:val="false"/>
+                <w:sz w:val="15"/>
+                <w:szCs w:val="15"/>
+              </w:rPr>
+              <w:t xml:space="preserve">8.8</w:t>
+            </w:r>
+          </w:p>
+        </w:tc>
+        <w:tc>
+          <w:tcPr>
+            <w:tcW w:type="dxa" w:w="840"/>
+            <w:tcBorders>
+              <w:top w:val="none" w:color="FFFFFF" w:sz="0"/>
+              <w:left w:val="none" w:color="FFFFFF" w:sz="0"/>
+              <w:bottom w:val="none" w:color="FFFFFF" w:sz="0"/>
+              <w:right w:val="none" w:color="FFFFFF" w:sz="0"/>
+            </w:tcBorders>
+            <w:tcMar>
+              <w:top w:type="dxa" w:w="20"/>
+              <w:left w:type="dxa" w:w="40"/>
+              <w:bottom w:type="dxa" w:w="20"/>
+              <w:right w:type="dxa" w:w="40"/>
+            </w:tcMar>
+            <w:vAlign w:val="center"/>
+          </w:tcPr>
+          <w:p>
+            <w:pPr>
+              <w:keepNext/>
+              <w:spacing w:after="0" w:line="200"/>
+              <w:jc w:val="left"/>
+            </w:pPr>
+            <w:r>
+              <w:rPr>
+                <w:rFonts w:ascii="Times New Roman" w:cs="Times New Roman" w:eastAsia="Times New Roman" w:hAnsi="Times New Roman"/>
+                <w:b w:val="false"/>
+                <w:bCs w:val="false"/>
+                <w:sz w:val="15"/>
+                <w:szCs w:val="15"/>
+              </w:rPr>
+              <w:t xml:space="preserve">12.0</w:t>
+            </w:r>
+          </w:p>
+        </w:tc>
+        <w:tc>
+          <w:tcPr>
+            <w:tcW w:type="dxa" w:w="840"/>
+            <w:tcBorders>
+              <w:top w:val="none" w:color="FFFFFF" w:sz="0"/>
+              <w:left w:val="none" w:color="FFFFFF" w:sz="0"/>
+              <w:bottom w:val="none" w:color="FFFFFF" w:sz="0"/>
+              <w:right w:val="none" w:color="FFFFFF" w:sz="0"/>
+            </w:tcBorders>
+            <w:tcMar>
+              <w:top w:type="dxa" w:w="20"/>
+              <w:left w:type="dxa" w:w="40"/>
+              <w:bottom w:type="dxa" w:w="20"/>
+              <w:right w:type="dxa" w:w="40"/>
+            </w:tcMar>
+            <w:vAlign w:val="center"/>
+          </w:tcPr>
+          <w:p>
+            <w:pPr>
+              <w:keepNext/>
+              <w:spacing w:after="0" w:line="200"/>
+              <w:jc w:val="left"/>
+            </w:pPr>
+            <w:r>
+              <w:rPr>
+                <w:rFonts w:ascii="Times New Roman" w:cs="Times New Roman" w:eastAsia="Times New Roman" w:hAnsi="Times New Roman"/>
+                <w:b w:val="false"/>
+                <w:bCs w:val="false"/>
+                <w:sz w:val="15"/>
+                <w:szCs w:val="15"/>
+              </w:rPr>
+              <w:t xml:space="preserve">60.5</w:t>
             </w:r>
           </w:p>
         </w:tc>
@@ -8216,176 +8453,176 @@
         </w:trPr>
         <w:tc>
           <w:tcPr>
-            <w:tcW w:type="dxa" w:w="1560"/>
-            <w:tcBorders>
-              <w:top w:val="none" w:color="FFFFFF" w:sz="0"/>
-              <w:left w:val="none" w:color="FFFFFF" w:sz="0"/>
-              <w:bottom w:val="none" w:color="FFFFFF" w:sz="0"/>
-              <w:right w:val="none" w:color="FFFFFF" w:sz="0"/>
-            </w:tcBorders>
-            <w:tcMar>
-              <w:top w:type="dxa" w:w="20"/>
-              <w:left w:type="dxa" w:w="40"/>
-              <w:bottom w:type="dxa" w:w="20"/>
-              <w:right w:type="dxa" w:w="40"/>
-            </w:tcMar>
-            <w:vAlign w:val="center"/>
-          </w:tcPr>
-          <w:p>
-            <w:pPr>
-              <w:keepNext/>
-              <w:spacing w:after="0" w:line="200"/>
-              <w:jc w:val="left"/>
-            </w:pPr>
-            <w:r>
-              <w:rPr>
-                <w:rFonts w:ascii="Times New Roman" w:cs="Times New Roman" w:eastAsia="Times New Roman" w:hAnsi="Times New Roman"/>
-                <w:b w:val="false"/>
-                <w:bCs w:val="false"/>
-                <w:sz w:val="15"/>
-                <w:szCs w:val="15"/>
-              </w:rPr>
-              <w:t xml:space="preserve">Authz. mean</w:t>
-            </w:r>
-          </w:p>
-        </w:tc>
-        <w:tc>
-          <w:tcPr>
-            <w:tcW w:type="dxa" w:w="825"/>
-            <w:tcBorders>
-              <w:top w:val="none" w:color="FFFFFF" w:sz="0"/>
-              <w:left w:val="none" w:color="FFFFFF" w:sz="0"/>
-              <w:bottom w:val="none" w:color="FFFFFF" w:sz="0"/>
-              <w:right w:val="none" w:color="FFFFFF" w:sz="0"/>
-            </w:tcBorders>
-            <w:tcMar>
-              <w:top w:type="dxa" w:w="20"/>
-              <w:left w:type="dxa" w:w="40"/>
-              <w:bottom w:type="dxa" w:w="20"/>
-              <w:right w:type="dxa" w:w="40"/>
-            </w:tcMar>
-            <w:vAlign w:val="center"/>
-          </w:tcPr>
-          <w:p>
-            <w:pPr>
-              <w:keepNext/>
-              <w:spacing w:after="0" w:line="200"/>
-              <w:jc w:val="center"/>
-            </w:pPr>
-            <w:r>
-              <w:rPr>
-                <w:rFonts w:ascii="Times New Roman" w:cs="Times New Roman" w:eastAsia="Times New Roman" w:hAnsi="Times New Roman"/>
-                <w:b w:val="false"/>
-                <w:bCs w:val="false"/>
-                <w:sz w:val="15"/>
-                <w:szCs w:val="15"/>
-              </w:rPr>
-              <w:t xml:space="preserve">55.9</w:t>
-            </w:r>
-          </w:p>
-        </w:tc>
-        <w:tc>
-          <w:tcPr>
-            <w:tcW w:type="dxa" w:w="825"/>
-            <w:tcBorders>
-              <w:top w:val="none" w:color="FFFFFF" w:sz="0"/>
-              <w:left w:val="none" w:color="FFFFFF" w:sz="0"/>
-              <w:bottom w:val="none" w:color="FFFFFF" w:sz="0"/>
-              <w:right w:val="none" w:color="FFFFFF" w:sz="0"/>
-            </w:tcBorders>
-            <w:tcMar>
-              <w:top w:type="dxa" w:w="20"/>
-              <w:left w:type="dxa" w:w="40"/>
-              <w:bottom w:type="dxa" w:w="20"/>
-              <w:right w:type="dxa" w:w="40"/>
-            </w:tcMar>
-            <w:vAlign w:val="center"/>
-          </w:tcPr>
-          <w:p>
-            <w:pPr>
-              <w:keepNext/>
-              <w:spacing w:after="0" w:line="200"/>
-              <w:jc w:val="center"/>
-            </w:pPr>
-            <w:r>
-              <w:rPr>
-                <w:rFonts w:ascii="Times New Roman" w:cs="Times New Roman" w:eastAsia="Times New Roman" w:hAnsi="Times New Roman"/>
-                <w:b w:val="false"/>
-                <w:bCs w:val="false"/>
-                <w:sz w:val="15"/>
-                <w:szCs w:val="15"/>
-              </w:rPr>
-              <w:t xml:space="preserve">2.0</w:t>
-            </w:r>
-          </w:p>
-        </w:tc>
-        <w:tc>
-          <w:tcPr>
-            <w:tcW w:type="dxa" w:w="825"/>
-            <w:tcBorders>
-              <w:top w:val="none" w:color="FFFFFF" w:sz="0"/>
-              <w:left w:val="none" w:color="FFFFFF" w:sz="0"/>
-              <w:bottom w:val="none" w:color="FFFFFF" w:sz="0"/>
-              <w:right w:val="none" w:color="FFFFFF" w:sz="0"/>
-            </w:tcBorders>
-            <w:tcMar>
-              <w:top w:type="dxa" w:w="20"/>
-              <w:left w:type="dxa" w:w="40"/>
-              <w:bottom w:type="dxa" w:w="20"/>
-              <w:right w:type="dxa" w:w="40"/>
-            </w:tcMar>
-            <w:vAlign w:val="center"/>
-          </w:tcPr>
-          <w:p>
-            <w:pPr>
-              <w:keepNext/>
-              <w:spacing w:after="0" w:line="200"/>
-              <w:jc w:val="center"/>
-            </w:pPr>
-            <w:r>
-              <w:rPr>
-                <w:rFonts w:ascii="Times New Roman" w:cs="Times New Roman" w:eastAsia="Times New Roman" w:hAnsi="Times New Roman"/>
-                <w:b w:val="false"/>
-                <w:bCs w:val="false"/>
-                <w:sz w:val="15"/>
-                <w:szCs w:val="15"/>
-              </w:rPr>
-              <w:t xml:space="preserve">2329.7</w:t>
-            </w:r>
-          </w:p>
-        </w:tc>
-        <w:tc>
-          <w:tcPr>
-            <w:tcW w:type="dxa" w:w="825"/>
-            <w:tcBorders>
-              <w:top w:val="none" w:color="FFFFFF" w:sz="0"/>
-              <w:left w:val="none" w:color="FFFFFF" w:sz="0"/>
-              <w:bottom w:val="none" w:color="FFFFFF" w:sz="0"/>
-              <w:right w:val="none" w:color="FFFFFF" w:sz="0"/>
-            </w:tcBorders>
-            <w:tcMar>
-              <w:top w:type="dxa" w:w="20"/>
-              <w:left w:type="dxa" w:w="40"/>
-              <w:bottom w:type="dxa" w:w="20"/>
-              <w:right w:type="dxa" w:w="40"/>
-            </w:tcMar>
-            <w:vAlign w:val="center"/>
-          </w:tcPr>
-          <w:p>
-            <w:pPr>
-              <w:keepNext/>
-              <w:spacing w:after="0" w:line="200"/>
-              <w:jc w:val="center"/>
-            </w:pPr>
-            <w:r>
-              <w:rPr>
-                <w:rFonts w:ascii="Times New Roman" w:cs="Times New Roman" w:eastAsia="Times New Roman" w:hAnsi="Times New Roman"/>
-                <w:b/>
-                <w:bCs/>
-                <w:sz w:val="15"/>
-                <w:szCs w:val="15"/>
-              </w:rPr>
-              <w:t xml:space="preserve">1.7</w:t>
+            <w:tcW w:type="dxa" w:w="1500"/>
+            <w:tcBorders>
+              <w:top w:val="none" w:color="FFFFFF" w:sz="0"/>
+              <w:left w:val="none" w:color="FFFFFF" w:sz="0"/>
+              <w:bottom w:val="none" w:color="FFFFFF" w:sz="0"/>
+              <w:right w:val="none" w:color="FFFFFF" w:sz="0"/>
+            </w:tcBorders>
+            <w:tcMar>
+              <w:top w:type="dxa" w:w="20"/>
+              <w:left w:type="dxa" w:w="40"/>
+              <w:bottom w:type="dxa" w:w="20"/>
+              <w:right w:type="dxa" w:w="40"/>
+            </w:tcMar>
+            <w:vAlign w:val="center"/>
+          </w:tcPr>
+          <w:p>
+            <w:pPr>
+              <w:keepNext/>
+              <w:spacing w:after="0" w:line="200"/>
+              <w:jc w:val="left"/>
+            </w:pPr>
+            <w:r>
+              <w:rPr>
+                <w:rFonts w:ascii="Times New Roman" w:cs="Times New Roman" w:eastAsia="Times New Roman" w:hAnsi="Times New Roman"/>
+                <w:b w:val="false"/>
+                <w:bCs w:val="false"/>
+                <w:sz w:val="15"/>
+                <w:szCs w:val="15"/>
+              </w:rPr>
+              <w:t xml:space="preserve">BC-only</w:t>
+            </w:r>
+          </w:p>
+        </w:tc>
+        <w:tc>
+          <w:tcPr>
+            <w:tcW w:type="dxa" w:w="840"/>
+            <w:tcBorders>
+              <w:top w:val="none" w:color="FFFFFF" w:sz="0"/>
+              <w:left w:val="none" w:color="FFFFFF" w:sz="0"/>
+              <w:bottom w:val="none" w:color="FFFFFF" w:sz="0"/>
+              <w:right w:val="none" w:color="FFFFFF" w:sz="0"/>
+            </w:tcBorders>
+            <w:tcMar>
+              <w:top w:type="dxa" w:w="20"/>
+              <w:left w:type="dxa" w:w="40"/>
+              <w:bottom w:type="dxa" w:w="20"/>
+              <w:right w:type="dxa" w:w="40"/>
+            </w:tcMar>
+            <w:vAlign w:val="center"/>
+          </w:tcPr>
+          <w:p>
+            <w:pPr>
+              <w:keepNext/>
+              <w:spacing w:after="0" w:line="200"/>
+              <w:jc w:val="left"/>
+            </w:pPr>
+            <w:r>
+              <w:rPr>
+                <w:rFonts w:ascii="Times New Roman" w:cs="Times New Roman" w:eastAsia="Times New Roman" w:hAnsi="Times New Roman"/>
+                <w:b w:val="false"/>
+                <w:bCs w:val="false"/>
+                <w:sz w:val="15"/>
+                <w:szCs w:val="15"/>
+              </w:rPr>
+              <w:t xml:space="preserve">10257</w:t>
+            </w:r>
+          </w:p>
+        </w:tc>
+        <w:tc>
+          <w:tcPr>
+            <w:tcW w:type="dxa" w:w="840"/>
+            <w:tcBorders>
+              <w:top w:val="none" w:color="FFFFFF" w:sz="0"/>
+              <w:left w:val="none" w:color="FFFFFF" w:sz="0"/>
+              <w:bottom w:val="none" w:color="FFFFFF" w:sz="0"/>
+              <w:right w:val="none" w:color="FFFFFF" w:sz="0"/>
+            </w:tcBorders>
+            <w:tcMar>
+              <w:top w:type="dxa" w:w="20"/>
+              <w:left w:type="dxa" w:w="40"/>
+              <w:bottom w:type="dxa" w:w="20"/>
+              <w:right w:type="dxa" w:w="40"/>
+            </w:tcMar>
+            <w:vAlign w:val="center"/>
+          </w:tcPr>
+          <w:p>
+            <w:pPr>
+              <w:keepNext/>
+              <w:spacing w:after="0" w:line="200"/>
+              <w:jc w:val="left"/>
+            </w:pPr>
+            <w:r>
+              <w:rPr>
+                <w:rFonts w:ascii="Times New Roman" w:cs="Times New Roman" w:eastAsia="Times New Roman" w:hAnsi="Times New Roman"/>
+                <w:b w:val="false"/>
+                <w:bCs w:val="false"/>
+                <w:sz w:val="15"/>
+                <w:szCs w:val="15"/>
+              </w:rPr>
+              <w:t xml:space="preserve">15847</w:t>
+            </w:r>
+          </w:p>
+        </w:tc>
+        <w:tc>
+          <w:tcPr>
+            <w:tcW w:type="dxa" w:w="840"/>
+            <w:tcBorders>
+              <w:top w:val="none" w:color="FFFFFF" w:sz="0"/>
+              <w:left w:val="none" w:color="FFFFFF" w:sz="0"/>
+              <w:bottom w:val="none" w:color="FFFFFF" w:sz="0"/>
+              <w:right w:val="none" w:color="FFFFFF" w:sz="0"/>
+            </w:tcBorders>
+            <w:tcMar>
+              <w:top w:type="dxa" w:w="20"/>
+              <w:left w:type="dxa" w:w="40"/>
+              <w:bottom w:type="dxa" w:w="20"/>
+              <w:right w:type="dxa" w:w="40"/>
+            </w:tcMar>
+            <w:vAlign w:val="center"/>
+          </w:tcPr>
+          <w:p>
+            <w:pPr>
+              <w:keepNext/>
+              <w:spacing w:after="0" w:line="200"/>
+              <w:jc w:val="left"/>
+            </w:pPr>
+            <w:r>
+              <w:rPr>
+                <w:rFonts w:ascii="Times New Roman" w:cs="Times New Roman" w:eastAsia="Times New Roman" w:hAnsi="Times New Roman"/>
+                <w:b w:val="false"/>
+                <w:bCs w:val="false"/>
+                <w:sz w:val="15"/>
+                <w:szCs w:val="15"/>
+              </w:rPr>
+              <w:t xml:space="preserve">15047</w:t>
+            </w:r>
+          </w:p>
+        </w:tc>
+        <w:tc>
+          <w:tcPr>
+            <w:tcW w:type="dxa" w:w="840"/>
+            <w:tcBorders>
+              <w:top w:val="none" w:color="FFFFFF" w:sz="0"/>
+              <w:left w:val="none" w:color="FFFFFF" w:sz="0"/>
+              <w:bottom w:val="none" w:color="FFFFFF" w:sz="0"/>
+              <w:right w:val="none" w:color="FFFFFF" w:sz="0"/>
+            </w:tcBorders>
+            <w:tcMar>
+              <w:top w:type="dxa" w:w="20"/>
+              <w:left w:type="dxa" w:w="40"/>
+              <w:bottom w:type="dxa" w:w="20"/>
+              <w:right w:type="dxa" w:w="40"/>
+            </w:tcMar>
+            <w:vAlign w:val="center"/>
+          </w:tcPr>
+          <w:p>
+            <w:pPr>
+              <w:keepNext/>
+              <w:spacing w:after="0" w:line="200"/>
+              <w:jc w:val="left"/>
+            </w:pPr>
+            <w:r>
+              <w:rPr>
+                <w:rFonts w:ascii="Times New Roman" w:cs="Times New Roman" w:eastAsia="Times New Roman" w:hAnsi="Times New Roman"/>
+                <w:b w:val="false"/>
+                <w:bCs w:val="false"/>
+                <w:sz w:val="15"/>
+                <w:szCs w:val="15"/>
+              </w:rPr>
+              <w:t xml:space="preserve">27169</w:t>
             </w:r>
           </w:p>
         </w:tc>
@@ -8396,7 +8633,7 @@
         </w:trPr>
         <w:tc>
           <w:tcPr>
-            <w:tcW w:type="dxa" w:w="1560"/>
+            <w:tcW w:type="dxa" w:w="1500"/>
             <w:tcBorders>
               <w:top w:val="none" w:color="FFFFFF" w:sz="0"/>
               <w:left w:val="none" w:color="FFFFFF" w:sz="0"/>
@@ -8413,25 +8650,25 @@
           </w:tcPr>
           <w:p>
             <w:pPr>
-              <w:keepNext w:val="false"/>
-              <w:spacing w:after="0" w:line="200"/>
-              <w:jc w:val="left"/>
-            </w:pPr>
-            <w:r>
-              <w:rPr>
-                <w:rFonts w:ascii="Times New Roman" w:cs="Times New Roman" w:eastAsia="Times New Roman" w:hAnsi="Times New Roman"/>
-                <w:b w:val="false"/>
-                <w:bCs w:val="false"/>
-                <w:sz w:val="15"/>
-                <w:szCs w:val="15"/>
-              </w:rPr>
-              <w:t xml:space="preserve">Authz. P95</w:t>
-            </w:r>
-          </w:p>
-        </w:tc>
-        <w:tc>
-          <w:tcPr>
-            <w:tcW w:type="dxa" w:w="825"/>
+              <w:keepNext/>
+              <w:spacing w:after="0" w:line="200"/>
+              <w:jc w:val="left"/>
+            </w:pPr>
+            <w:r>
+              <w:rPr>
+                <w:rFonts w:ascii="Times New Roman" w:cs="Times New Roman" w:eastAsia="Times New Roman" w:hAnsi="Times New Roman"/>
+                <w:b w:val="false"/>
+                <w:bCs w:val="false"/>
+                <w:sz w:val="15"/>
+                <w:szCs w:val="15"/>
+              </w:rPr>
+              <w:t xml:space="preserve">BC-ZTA</w:t>
+            </w:r>
+          </w:p>
+        </w:tc>
+        <w:tc>
+          <w:tcPr>
+            <w:tcW w:type="dxa" w:w="840"/>
             <w:tcBorders>
               <w:top w:val="none" w:color="FFFFFF" w:sz="0"/>
               <w:left w:val="none" w:color="FFFFFF" w:sz="0"/>
@@ -8448,114 +8685,9 @@
           </w:tcPr>
           <w:p>
             <w:pPr>
-              <w:keepNext w:val="false"/>
-              <w:spacing w:after="0" w:line="200"/>
-              <w:jc w:val="center"/>
-            </w:pPr>
-            <w:r>
-              <w:rPr>
-                <w:rFonts w:ascii="Times New Roman" w:cs="Times New Roman" w:eastAsia="Times New Roman" w:hAnsi="Times New Roman"/>
-                <w:b w:val="false"/>
-                <w:bCs w:val="false"/>
-                <w:sz w:val="15"/>
-                <w:szCs w:val="15"/>
-              </w:rPr>
-              <w:t xml:space="preserve">78.7</w:t>
-            </w:r>
-          </w:p>
-        </w:tc>
-        <w:tc>
-          <w:tcPr>
-            <w:tcW w:type="dxa" w:w="825"/>
-            <w:tcBorders>
-              <w:top w:val="none" w:color="FFFFFF" w:sz="0"/>
-              <w:left w:val="none" w:color="FFFFFF" w:sz="0"/>
-              <w:bottom w:val="single" w:color="000000" w:sz="4"/>
-              <w:right w:val="none" w:color="FFFFFF" w:sz="0"/>
-            </w:tcBorders>
-            <w:tcMar>
-              <w:top w:type="dxa" w:w="20"/>
-              <w:left w:type="dxa" w:w="40"/>
-              <w:bottom w:type="dxa" w:w="20"/>
-              <w:right w:type="dxa" w:w="40"/>
-            </w:tcMar>
-            <w:vAlign w:val="center"/>
-          </w:tcPr>
-          <w:p>
-            <w:pPr>
-              <w:keepNext w:val="false"/>
-              <w:spacing w:after="0" w:line="200"/>
-              <w:jc w:val="center"/>
-            </w:pPr>
-            <w:r>
-              <w:rPr>
-                <w:rFonts w:ascii="Times New Roman" w:cs="Times New Roman" w:eastAsia="Times New Roman" w:hAnsi="Times New Roman"/>
-                <w:b w:val="false"/>
-                <w:bCs w:val="false"/>
-                <w:sz w:val="15"/>
-                <w:szCs w:val="15"/>
-              </w:rPr>
-              <w:t xml:space="preserve">2.4</w:t>
-            </w:r>
-          </w:p>
-        </w:tc>
-        <w:tc>
-          <w:tcPr>
-            <w:tcW w:type="dxa" w:w="825"/>
-            <w:tcBorders>
-              <w:top w:val="none" w:color="FFFFFF" w:sz="0"/>
-              <w:left w:val="none" w:color="FFFFFF" w:sz="0"/>
-              <w:bottom w:val="single" w:color="000000" w:sz="4"/>
-              <w:right w:val="none" w:color="FFFFFF" w:sz="0"/>
-            </w:tcBorders>
-            <w:tcMar>
-              <w:top w:type="dxa" w:w="20"/>
-              <w:left w:type="dxa" w:w="40"/>
-              <w:bottom w:type="dxa" w:w="20"/>
-              <w:right w:type="dxa" w:w="40"/>
-            </w:tcMar>
-            <w:vAlign w:val="center"/>
-          </w:tcPr>
-          <w:p>
-            <w:pPr>
-              <w:keepNext w:val="false"/>
-              <w:spacing w:after="0" w:line="200"/>
-              <w:jc w:val="center"/>
-            </w:pPr>
-            <w:r>
-              <w:rPr>
-                <w:rFonts w:ascii="Times New Roman" w:cs="Times New Roman" w:eastAsia="Times New Roman" w:hAnsi="Times New Roman"/>
-                <w:b w:val="false"/>
-                <w:bCs w:val="false"/>
-                <w:sz w:val="15"/>
-                <w:szCs w:val="15"/>
-              </w:rPr>
-              <w:t xml:space="preserve">3625.9</w:t>
-            </w:r>
-          </w:p>
-        </w:tc>
-        <w:tc>
-          <w:tcPr>
-            <w:tcW w:type="dxa" w:w="825"/>
-            <w:tcBorders>
-              <w:top w:val="none" w:color="FFFFFF" w:sz="0"/>
-              <w:left w:val="none" w:color="FFFFFF" w:sz="0"/>
-              <w:bottom w:val="single" w:color="000000" w:sz="4"/>
-              <w:right w:val="none" w:color="FFFFFF" w:sz="0"/>
-            </w:tcBorders>
-            <w:tcMar>
-              <w:top w:type="dxa" w:w="20"/>
-              <w:left w:type="dxa" w:w="40"/>
-              <w:bottom w:type="dxa" w:w="20"/>
-              <w:right w:type="dxa" w:w="40"/>
-            </w:tcMar>
-            <w:vAlign w:val="center"/>
-          </w:tcPr>
-          <w:p>
-            <w:pPr>
-              <w:keepNext w:val="false"/>
-              <w:spacing w:after="0" w:line="200"/>
-              <w:jc w:val="center"/>
+              <w:keepNext/>
+              <w:spacing w:after="0" w:line="200"/>
+              <w:jc w:val="left"/>
             </w:pPr>
             <w:r>
               <w:rPr>
@@ -8565,7 +8697,112 @@
                 <w:sz w:val="15"/>
                 <w:szCs w:val="15"/>
               </w:rPr>
-              <w:t xml:space="preserve">6.3</w:t>
+              <w:t xml:space="preserve">7.4</w:t>
+            </w:r>
+          </w:p>
+        </w:tc>
+        <w:tc>
+          <w:tcPr>
+            <w:tcW w:type="dxa" w:w="840"/>
+            <w:tcBorders>
+              <w:top w:val="none" w:color="FFFFFF" w:sz="0"/>
+              <w:left w:val="none" w:color="FFFFFF" w:sz="0"/>
+              <w:bottom w:val="single" w:color="000000" w:sz="4"/>
+              <w:right w:val="none" w:color="FFFFFF" w:sz="0"/>
+            </w:tcBorders>
+            <w:tcMar>
+              <w:top w:type="dxa" w:w="20"/>
+              <w:left w:type="dxa" w:w="40"/>
+              <w:bottom w:type="dxa" w:w="20"/>
+              <w:right w:type="dxa" w:w="40"/>
+            </w:tcMar>
+            <w:vAlign w:val="center"/>
+          </w:tcPr>
+          <w:p>
+            <w:pPr>
+              <w:keepNext/>
+              <w:spacing w:after="0" w:line="200"/>
+              <w:jc w:val="left"/>
+            </w:pPr>
+            <w:r>
+              <w:rPr>
+                <w:rFonts w:ascii="Times New Roman" w:cs="Times New Roman" w:eastAsia="Times New Roman" w:hAnsi="Times New Roman"/>
+                <w:b/>
+                <w:bCs/>
+                <w:sz w:val="15"/>
+                <w:szCs w:val="15"/>
+              </w:rPr>
+              <w:t xml:space="preserve">22.3</w:t>
+            </w:r>
+          </w:p>
+        </w:tc>
+        <w:tc>
+          <w:tcPr>
+            <w:tcW w:type="dxa" w:w="840"/>
+            <w:tcBorders>
+              <w:top w:val="none" w:color="FFFFFF" w:sz="0"/>
+              <w:left w:val="none" w:color="FFFFFF" w:sz="0"/>
+              <w:bottom w:val="single" w:color="000000" w:sz="4"/>
+              <w:right w:val="none" w:color="FFFFFF" w:sz="0"/>
+            </w:tcBorders>
+            <w:tcMar>
+              <w:top w:type="dxa" w:w="20"/>
+              <w:left w:type="dxa" w:w="40"/>
+              <w:bottom w:type="dxa" w:w="20"/>
+              <w:right w:type="dxa" w:w="40"/>
+            </w:tcMar>
+            <w:vAlign w:val="center"/>
+          </w:tcPr>
+          <w:p>
+            <w:pPr>
+              <w:keepNext/>
+              <w:spacing w:after="0" w:line="200"/>
+              <w:jc w:val="left"/>
+            </w:pPr>
+            <w:r>
+              <w:rPr>
+                <w:rFonts w:ascii="Times New Roman" w:cs="Times New Roman" w:eastAsia="Times New Roman" w:hAnsi="Times New Roman"/>
+                <w:b/>
+                <w:bCs/>
+                <w:sz w:val="15"/>
+                <w:szCs w:val="15"/>
+              </w:rPr>
+              <w:t xml:space="preserve">54.7</w:t>
+            </w:r>
+          </w:p>
+        </w:tc>
+        <w:tc>
+          <w:tcPr>
+            <w:tcW w:type="dxa" w:w="840"/>
+            <w:tcBorders>
+              <w:top w:val="none" w:color="FFFFFF" w:sz="0"/>
+              <w:left w:val="none" w:color="FFFFFF" w:sz="0"/>
+              <w:bottom w:val="single" w:color="000000" w:sz="4"/>
+              <w:right w:val="none" w:color="FFFFFF" w:sz="0"/>
+            </w:tcBorders>
+            <w:tcMar>
+              <w:top w:type="dxa" w:w="20"/>
+              <w:left w:type="dxa" w:w="40"/>
+              <w:bottom w:type="dxa" w:w="20"/>
+              <w:right w:type="dxa" w:w="40"/>
+            </w:tcMar>
+            <w:vAlign w:val="center"/>
+          </w:tcPr>
+          <w:p>
+            <w:pPr>
+              <w:keepNext/>
+              <w:spacing w:after="0" w:line="200"/>
+              <w:jc w:val="left"/>
+            </w:pPr>
+            <w:r>
+              <w:rPr>
+                <w:rFonts w:ascii="Times New Roman" w:cs="Times New Roman" w:eastAsia="Times New Roman" w:hAnsi="Times New Roman"/>
+                <w:b/>
+                <w:bCs/>
+                <w:sz w:val="15"/>
+                <w:szCs w:val="15"/>
+              </w:rPr>
+              <w:t xml:space="preserve">208.6</w:t>
             </w:r>
           </w:p>
         </w:tc>
@@ -8573,8 +8810,17 @@
     </w:tbl>
     <w:p>
       <w:pPr>
-        <w:spacing w:after="60"/>
-      </w:pPr>
+        <w:spacing w:after="80" w:before="20"/>
+        <w:jc w:val="both"/>
+      </w:pPr>
+      <w:r>
+        <w:rPr>
+          <w:rFonts w:ascii="Times New Roman" w:cs="Times New Roman" w:eastAsia="Times New Roman" w:hAnsi="Times New Roman"/>
+          <w:sz w:val="14"/>
+          <w:szCs w:val="14"/>
+        </w:rPr>
+        <w:t xml:space="preserve">Columns give the number of devices; PKI-IAM includes an emulated 40 ms WAN round trip.</w:t>
+      </w:r>
     </w:p>
     <w:p>
       <w:pPr>
@@ -8585,9 +8831,9 @@
       <w:r>
         <w:drawing>
           <wp:inline distT="0" distB="0" distL="0" distR="0">
-            <wp:extent cx="3067050" cy="2438400"/>
+            <wp:extent cx="3067050" cy="2705100"/>
             <wp:effectExtent t="0" r="0" b="0" l="0"/>
-            <wp:docPr id="1" name="fig3_latency.png" descr="Fig. 3. Mean authentication and authorisation latency at 50 devices (BC-only measured on Besu; others modelled; log scale)." title="Fig. 3. Mean authentication and authorisation latency at 50 devices (BC-only measured on Besu; others modelled; log scale)."/>
+            <wp:docPr id="1" name="fig3_latency.png" descr="Fig. 3. Mean end-to-end latency versus number of devices (log scale; error bars: standard deviation of 3 runs)." title="Fig. 3. Mean end-to-end latency versus number of devices (log scale; error bars: standard deviation of 3 runs)."/>
             <wp:cNvGraphicFramePr>
               <a:graphicFrameLocks xmlns:a="http://schemas.openxmlformats.org/drawingml/2006/main" noChangeAspect="1"/>
             </wp:cNvGraphicFramePr>
@@ -8610,7 +8856,7 @@
                   <pic:spPr bwMode="auto">
                     <a:xfrm>
                       <a:off x="0" y="0"/>
-                      <a:ext cx="3067050" cy="2438400"/>
+                      <a:ext cx="3067050" cy="2705100"/>
                     </a:xfrm>
                     <a:prstGeom prst="rect">
                       <a:avLst/>
@@ -8634,7 +8880,7 @@
           <w:sz w:val="16"/>
           <w:szCs w:val="16"/>
         </w:rPr>
-        <w:t xml:space="preserve">Fig. 3. Mean authentication and authorisation latency at 50 devices (BC-only measured on Besu; others modelled; log scale).</w:t>
+        <w:t xml:space="preserve">Fig. 3. Mean end-to-end latency versus number of devices (log scale; error bars: standard deviation of 3 runs).</w:t>
       </w:r>
     </w:p>
     <w:p>
@@ -8665,7 +8911,25 @@
           <w:sz w:val="20"/>
           <w:szCs w:val="20"/>
         </w:rPr>
-        <w:t xml:space="preserve">Authorisation is a local cache hit for 90% of requests, giving a mean of 1.7 ms versus 55.9 ms for PKI-IAM (97% lower). The P95 of 6.3 ms is dominated by the 10% cache-miss tail that reads the chain (5.4 ms), and remains far below the 3626 ms P95 of the synchronous design. On-chain evaluation costs 44,685 gas as an estimate, but because it is a read, no fee or block wait is incurred.</w:t>
+        <w:t xml:space="preserve">The proposed design makes policy decisions from the edge cache. The measured cache-hit ratio was 96% (one miss per device per 30 s TTL), so 50 devices caused only 50 chain reads for about 1,250 requests; each miss costs one batched </w:t>
+      </w:r>
+      <w:r>
+        <w:rPr>
+          <w:rFonts w:ascii="Times New Roman" w:cs="Times New Roman" w:eastAsia="Times New Roman" w:hAnsi="Times New Roman"/>
+          <w:i/>
+          <w:iCs/>
+          <w:sz w:val="20"/>
+          <w:szCs w:val="20"/>
+        </w:rPr>
+        <w:t xml:space="preserve">eth_call</w:t>
+      </w:r>
+      <w:r>
+        <w:rPr>
+          <w:rFonts w:ascii="Times New Roman" w:cs="Times New Roman" w:eastAsia="Times New Roman" w:hAnsi="Times New Roman"/>
+          <w:sz w:val="20"/>
+          <w:szCs w:val="20"/>
+        </w:rPr>
+        <w:t xml:space="preserve"> of 5.4 ms in the micro-benchmark. The PEP used 0.26 CPU cores at 50 devices and 0.59 at 200, against 0.53 for the local store. Every decision is covered by the audit batch: in the 200-device runs about 5,000 decisions per run were anchored in roughly 25 transactions. On-chain evaluation costs 44,685 gas as an estimate, but because it is a read, no fee or block wait is incurred.</w:t>
       </w:r>
     </w:p>
     <w:p>
@@ -8697,7 +8961,7 @@
           <w:sz w:val="20"/>
           <w:szCs w:val="20"/>
         </w:rPr>
-        <w:t xml:space="preserve">Table 6 summarises the Besu measurements. Write confirmation takes 1522 ms on average at 10 tx/s (P95 2439 ms), close to the 2 s block period; a transaction submitted just after a block, as in the phase-locked sequential tests S1/S5, waits about 1980 ms. Reads cost 5.4 ms (P95 10.9 ms). Committed throughput tracks the offered load up to 50 tx/s (46.5 tx/s) but saturates near 60 tx/s on this host: at 100 and 200 tx/s offered, only 62.7 and 59.1 tx/s commit, mean latency rises to 11.6 s and 16.4 s, and 43% of transactions at 200 tx/s were not confirmed within the 60 s window. A synchronous design at 1 request/s per device therefore saturates between 50 and 100 devices. BC-ZTA issues only trust updates, revocations and audit anchors, reaching 27.67 tx/s at 400 devices, about 46% of the measured capacity (Fig. 4, top). Batch anchoring at 1 tx/s confirmed all 60 anchors in 941 ms on average. Because all validators share one 2-vCPU host, the 60 tx/s figure is a lower bound for a dedicated multi-server deployment.</w:t>
+        <w:t xml:space="preserve">Table 6 summarises the Besu micro-benchmark. Write confirmation takes 1522 ms on average at 10 tx/s (P95 2439 ms), close to the 2 s block period; a transaction submitted just after a block, as in the phase-locked sequential tests S1/S5, waits about 1980 ms. Reads cost 5.4 ms (P95 10.9 ms). Committed throughput tracks the offered load up to 50 tx/s (46.5 tx/s) but saturates near 60 tx/s on this host: at 100 and 200 tx/s offered only 62.7 and 59.1 tx/s commit and 43% of transactions at 200 tx/s were not confirmed within 60 s. Batch anchoring at 1 tx/s confirmed all 60 anchors in 941 ms on average. Because all validators share one 2-vCPU host, 60 tx/s is a lower bound for a dedicated multi-server deployment.</w:t>
       </w:r>
     </w:p>
     <w:p>
@@ -9860,7 +10124,7 @@
           <w:sz w:val="20"/>
           <w:szCs w:val="20"/>
         </w:rPr>
-        <w:t xml:space="preserve">Measured gas per operation is listed in Table 7. Registering a device costs 55,682 gas, whereas committing an epoch root costs 75,469 gas independent of batch size. Logging one event on-chain costs 182,008 gas, while anchoring a batch costs 134,747 gas, i.e. about 135 gas per record for a 1,000-record batch (≈1351× cheaper). At 400 devices and 1 event/s the model yields 34.6 M events/day: 6636 MB/day of ledger growth with per-event logging (192 B/entry) versus 13.8 MB/day with batch anchoring. Device-side CPU and memory were not measured; prior IOTA-based DID work reports that DID generation can saturate a Raspberry Pi 4 CPU </w:t>
+        <w:t xml:space="preserve">Measured gas per operation is listed in Table 7. Registering a device costs 55,682 gas, whereas committing an epoch root costs 75,469 gas independent of batch size. Logging one event on-chain costs 182,008 gas, while anchoring a batch costs 134,747 gas, i.e. about 135 gas per record for a 1,000-record batch (≈1351× cheaper). At 400 devices and 1 event/s the calculation gives 34.6 M events/day: 6636 MB/day of ledger growth with per-event logging (192 B/entry) versus 13.8 MB/day with batch anchoring. Device-side CPU and memory were not measured; prior IOTA-based DID work reports that DID generation can saturate a Raspberry Pi 4 CPU </w:t>
       </w:r>
       <w:r>
         <w:rPr>
@@ -10696,6 +10960,7 @@
     </w:p>
     <w:p>
       <w:pPr>
+        <w:keepNext/>
         <w:spacing w:after="60" w:before="0" w:line="228"/>
         <w:jc w:val="both"/>
       </w:pPr>
@@ -10705,25 +10970,7 @@
           <w:sz w:val="20"/>
           <w:szCs w:val="20"/>
         </w:rPr>
-        <w:t xml:space="preserve">Fig. 4 (bottom) shows mean authorisation latency against device count. BC-ZTA stays near 1.7 ms from 10 to 400 devices, whereas the measured synchronous design rises from 1522 ms at 10 devices to 2330 ms at 50 and 11.6 s at 100 devices, where the ledger saturates. The price of caching is </w:t>
-      </w:r>
-      <w:r>
-        <w:rPr>
-          <w:rFonts w:ascii="Times New Roman" w:cs="Times New Roman" w:eastAsia="Times New Roman" w:hAnsi="Times New Roman"/>
-          <w:i/>
-          <w:iCs/>
-          <w:sz w:val="20"/>
-          <w:szCs w:val="20"/>
-        </w:rPr>
-        <w:t xml:space="preserve">staleness</w:t>
-      </w:r>
-      <w:r>
-        <w:rPr>
-          <w:rFonts w:ascii="Times New Roman" w:cs="Times New Roman" w:eastAsia="Times New Roman" w:hAnsi="Times New Roman"/>
-          <w:sz w:val="20"/>
-          <w:szCs w:val="20"/>
-        </w:rPr>
-        <w:t xml:space="preserve">: with TTL-only refresh, a revoked identity may remain usable for 16.5 s on average (worst case 32.4 s); with event-driven invalidation these fall to 1.5 s and 2.4 s (measured block finality plus one read); the measured phase-locked revocation visibility on Besu was 1.8 s. The centralised baselines revoke instantly but depend on one operator. For comparison, a sharded design reaches 2,500 TPS at 700 nodes </w:t>
+        <w:t xml:space="preserve">Fig. 4 shows goodput and on-chain write load against device count. Central PKI-IAM, ABAC and BC-ZTA served every request up to 200 devices with no failures, whereas the synchronous blockchain saturated: its goodput stopped at 47 req/s (37 req/s at 50 devices), only 74% of requests at 50 devices and 21% at 200 devices were answered in time, mean latency rose to 14.0 s and 2158 requests timed out at 200 devices. Its on-chain write rate (47 tx/s) is the measured ledger ceiling, whereas BC-ZTA writes about 1.0 tx/s regardless of the number of devices. At 200 devices all systems slow down because the PEP, the load generator and the four validators compete for two vCPUs: BC-ZTA reaches 55 ms mean (P95 209 ms) against 12 ms for the local store, so CPU rather than the ledger is its limit on this host. For comparison, a sharded design reaches 2,500 TPS at 700 nodes </w:t>
       </w:r>
       <w:r>
         <w:rPr>
@@ -10751,9 +10998,9 @@
       <w:r>
         <w:drawing>
           <wp:inline distT="0" distB="0" distL="0" distR="0">
-            <wp:extent cx="2762250" cy="3248025"/>
+            <wp:extent cx="2762250" cy="2600325"/>
             <wp:effectExtent t="0" r="0" b="0" l="0"/>
-            <wp:docPr id="1" name="fig4_scalability.png" descr="Fig. 4. On-chain write load (top) and mean authorisation latency (bottom) versus device count (BC-only measured; BC-ZTA modelled)." title="Fig. 4. On-chain write load (top) and mean authorisation latency (bottom) versus device count (BC-only measured; BC-ZTA modelled)."/>
+            <wp:docPr id="1" name="fig4_scalability.png" descr="Fig. 4. Goodput (top) and on-chain writes per second (bottom) versus number of devices; dotted line: offered load." title="Fig. 4. Goodput (top) and on-chain writes per second (bottom) versus number of devices; dotted line: offered load."/>
             <wp:cNvGraphicFramePr>
               <a:graphicFrameLocks xmlns:a="http://schemas.openxmlformats.org/drawingml/2006/main" noChangeAspect="1"/>
             </wp:cNvGraphicFramePr>
@@ -10776,7 +11023,7 @@
                   <pic:spPr bwMode="auto">
                     <a:xfrm>
                       <a:off x="0" y="0"/>
-                      <a:ext cx="2762250" cy="3248025"/>
+                      <a:ext cx="2762250" cy="2600325"/>
                     </a:xfrm>
                     <a:prstGeom prst="rect">
                       <a:avLst/>
@@ -10800,11 +11047,29 @@
           <w:sz w:val="16"/>
           <w:szCs w:val="16"/>
         </w:rPr>
-        <w:t xml:space="preserve">Fig. 4. On-chain write load (top) and mean authorisation latency (bottom) versus device count (BC-only measured; BC-ZTA modelled).</w:t>
-      </w:r>
-    </w:p>
-    <w:p>
-      <w:pPr>
+        <w:t xml:space="preserve">Fig. 4. Goodput (top) and on-chain writes per second (bottom) versus number of devices; dotted line: offered load.</w:t>
+      </w:r>
+    </w:p>
+    <w:p>
+      <w:pPr>
+        <w:keepNext/>
+        <w:spacing w:after="30" w:before="60"/>
+        <w:jc w:val="left"/>
+      </w:pPr>
+      <w:r>
+        <w:rPr>
+          <w:rFonts w:ascii="Times New Roman" w:cs="Times New Roman" w:eastAsia="Times New Roman" w:hAnsi="Times New Roman"/>
+          <w:i/>
+          <w:iCs/>
+          <w:sz w:val="20"/>
+          <w:szCs w:val="20"/>
+        </w:rPr>
+        <w:t xml:space="preserve">F. Attack Resistance</w:t>
+      </w:r>
+    </w:p>
+    <w:p>
+      <w:pPr>
+        <w:keepNext/>
         <w:spacing w:after="60" w:before="0" w:line="228"/>
         <w:jc w:val="both"/>
       </w:pPr>
@@ -10814,7 +11079,1046 @@
           <w:sz w:val="20"/>
           <w:szCs w:val="20"/>
         </w:rPr>
-        <w:t xml:space="preserve">Fig. 5 varies the two assumptions on which the results depend most. In Fig. 5(a), mean authorisation latency at 50 devices rises from 1.3 ms at a 99% cache-hit ratio to 3.8 ms at 50%, while the P95 drops from 7.5 ms to 4.6 ms once the hit ratio reaches 95%, because cache misses then fall below the 5% tail. In Fig. 5(b), TTL-only revocation delay grows linearly with the TTL, from 4.0 s mean at a 5 s TTL to 151 s at 300 s, whereas event-driven invalidation stays near 1.5 s regardless of TTL. With events, the TTL can therefore be chosen for read load: refreshing each of 400 device entries once per TTL costs about 80 reads/s at 5 s versus 1.3 reads/s at 300 s.</w:t>
+        <w:t xml:space="preserve">Table 8 lists the security tests run against the BC-ZTA prototype (3 runs, 50 attempts per test and run). All legitimate requests were accepted (no false rejects), and none of the forged, replayed, stale, unregistered, tampered, class-violating or low-trust requests was accepted. For a revoked device, 0 requests were accepted after the revocation transaction was confirmed, and the first denial came 8 ms after confirmation or sooner. Fig. 5 shows the revocation enforcement delay of each system: with event-driven invalidation BC-ZTA enforces a revocation after 1.22 s on average (worst case 2.12 s), about one block period and independent of the TTL, whereas TTL-only refresh with a 10 s TTL needs 5.5 s on average (worst case 11.2 s). The centralised and local baselines revoke in 48 ms and 5 ms because they hold the state in one place; the blockchain-only value (2.03 s) includes the request that was in flight when the revocation was issued.</w:t>
+      </w:r>
+    </w:p>
+    <w:p>
+      <w:pPr>
+        <w:keepNext/>
+        <w:spacing w:after="30" w:before="60"/>
+        <w:jc w:val="center"/>
+      </w:pPr>
+      <w:r>
+        <w:rPr>
+          <w:rFonts w:ascii="Times New Roman" w:cs="Times New Roman" w:eastAsia="Times New Roman" w:hAnsi="Times New Roman"/>
+          <w:sz w:val="16"/>
+          <w:szCs w:val="16"/>
+        </w:rPr>
+        <w:t xml:space="preserve">TABLE 8. SECURITY TESTS ON THE BC-ZTA PROTOTYPE (3 RUNS)</w:t>
+      </w:r>
+    </w:p>
+    <w:tbl>
+      <w:tblPr>
+        <w:tblW w:type="dxa" w:w="4860"/>
+        <w:tblBorders>
+          <w:top w:val="single" w:color="auto" w:sz="4"/>
+          <w:left w:val="single" w:color="auto" w:sz="4"/>
+          <w:bottom w:val="single" w:color="auto" w:sz="4"/>
+          <w:right w:val="single" w:color="auto" w:sz="4"/>
+          <w:insideH w:val="single" w:color="auto" w:sz="4"/>
+          <w:insideV w:val="single" w:color="auto" w:sz="4"/>
+        </w:tblBorders>
+        <w:tblLayout w:type="fixed"/>
+      </w:tblPr>
+      <w:tblGrid>
+        <w:gridCol w:w="2900"/>
+        <w:gridCol w:w="980"/>
+        <w:gridCol w:w="980"/>
+      </w:tblGrid>
+      <w:tr>
+        <w:trPr>
+          <w:cantSplit/>
+          <w:tblHeader/>
+        </w:trPr>
+        <w:tc>
+          <w:tcPr>
+            <w:tcW w:type="dxa" w:w="2900"/>
+            <w:tcBorders>
+              <w:top w:val="single" w:color="000000" w:sz="4"/>
+              <w:left w:val="none" w:color="FFFFFF" w:sz="0"/>
+              <w:bottom w:val="single" w:color="000000" w:sz="4"/>
+              <w:right w:val="none" w:color="FFFFFF" w:sz="0"/>
+            </w:tcBorders>
+            <w:tcMar>
+              <w:top w:type="dxa" w:w="20"/>
+              <w:left w:type="dxa" w:w="40"/>
+              <w:bottom w:type="dxa" w:w="20"/>
+              <w:right w:type="dxa" w:w="40"/>
+            </w:tcMar>
+            <w:vAlign w:val="center"/>
+          </w:tcPr>
+          <w:p>
+            <w:pPr>
+              <w:keepNext/>
+              <w:spacing w:after="0" w:line="200"/>
+              <w:jc w:val="left"/>
+            </w:pPr>
+            <w:r>
+              <w:rPr>
+                <w:rFonts w:ascii="Times New Roman" w:cs="Times New Roman" w:eastAsia="Times New Roman" w:hAnsi="Times New Roman"/>
+                <w:b/>
+                <w:bCs/>
+                <w:sz w:val="15"/>
+                <w:szCs w:val="15"/>
+              </w:rPr>
+              <w:t xml:space="preserve">Test</w:t>
+            </w:r>
+          </w:p>
+        </w:tc>
+        <w:tc>
+          <w:tcPr>
+            <w:tcW w:type="dxa" w:w="980"/>
+            <w:tcBorders>
+              <w:top w:val="single" w:color="000000" w:sz="4"/>
+              <w:left w:val="none" w:color="FFFFFF" w:sz="0"/>
+              <w:bottom w:val="single" w:color="000000" w:sz="4"/>
+              <w:right w:val="none" w:color="FFFFFF" w:sz="0"/>
+            </w:tcBorders>
+            <w:tcMar>
+              <w:top w:type="dxa" w:w="20"/>
+              <w:left w:type="dxa" w:w="40"/>
+              <w:bottom w:type="dxa" w:w="20"/>
+              <w:right w:type="dxa" w:w="40"/>
+            </w:tcMar>
+            <w:vAlign w:val="center"/>
+          </w:tcPr>
+          <w:p>
+            <w:pPr>
+              <w:keepNext/>
+              <w:spacing w:after="0" w:line="200"/>
+              <w:jc w:val="left"/>
+            </w:pPr>
+            <w:r>
+              <w:rPr>
+                <w:rFonts w:ascii="Times New Roman" w:cs="Times New Roman" w:eastAsia="Times New Roman" w:hAnsi="Times New Roman"/>
+                <w:b/>
+                <w:bCs/>
+                <w:sz w:val="15"/>
+                <w:szCs w:val="15"/>
+              </w:rPr>
+              <w:t xml:space="preserve">Attempts</w:t>
+            </w:r>
+          </w:p>
+        </w:tc>
+        <w:tc>
+          <w:tcPr>
+            <w:tcW w:type="dxa" w:w="980"/>
+            <w:tcBorders>
+              <w:top w:val="single" w:color="000000" w:sz="4"/>
+              <w:left w:val="none" w:color="FFFFFF" w:sz="0"/>
+              <w:bottom w:val="single" w:color="000000" w:sz="4"/>
+              <w:right w:val="none" w:color="FFFFFF" w:sz="0"/>
+            </w:tcBorders>
+            <w:tcMar>
+              <w:top w:type="dxa" w:w="20"/>
+              <w:left w:type="dxa" w:w="40"/>
+              <w:bottom w:type="dxa" w:w="20"/>
+              <w:right w:type="dxa" w:w="40"/>
+            </w:tcMar>
+            <w:vAlign w:val="center"/>
+          </w:tcPr>
+          <w:p>
+            <w:pPr>
+              <w:keepNext/>
+              <w:spacing w:after="0" w:line="200"/>
+              <w:jc w:val="left"/>
+            </w:pPr>
+            <w:r>
+              <w:rPr>
+                <w:rFonts w:ascii="Times New Roman" w:cs="Times New Roman" w:eastAsia="Times New Roman" w:hAnsi="Times New Roman"/>
+                <w:b/>
+                <w:bCs/>
+                <w:sz w:val="15"/>
+                <w:szCs w:val="15"/>
+              </w:rPr>
+              <w:t xml:space="preserve">Accepted</w:t>
+            </w:r>
+          </w:p>
+        </w:tc>
+      </w:tr>
+      <w:tr>
+        <w:trPr>
+          <w:cantSplit/>
+        </w:trPr>
+        <w:tc>
+          <w:tcPr>
+            <w:tcW w:type="dxa" w:w="2900"/>
+            <w:tcBorders>
+              <w:top w:val="none" w:color="FFFFFF" w:sz="0"/>
+              <w:left w:val="none" w:color="FFFFFF" w:sz="0"/>
+              <w:bottom w:val="none" w:color="FFFFFF" w:sz="0"/>
+              <w:right w:val="none" w:color="FFFFFF" w:sz="0"/>
+            </w:tcBorders>
+            <w:tcMar>
+              <w:top w:type="dxa" w:w="20"/>
+              <w:left w:type="dxa" w:w="40"/>
+              <w:bottom w:type="dxa" w:w="20"/>
+              <w:right w:type="dxa" w:w="40"/>
+            </w:tcMar>
+            <w:vAlign w:val="center"/>
+          </w:tcPr>
+          <w:p>
+            <w:pPr>
+              <w:keepNext/>
+              <w:spacing w:after="0" w:line="200"/>
+              <w:jc w:val="left"/>
+            </w:pPr>
+            <w:r>
+              <w:rPr>
+                <w:rFonts w:ascii="Times New Roman" w:cs="Times New Roman" w:eastAsia="Times New Roman" w:hAnsi="Times New Roman"/>
+                <w:b w:val="false"/>
+                <w:bCs w:val="false"/>
+                <w:sz w:val="15"/>
+                <w:szCs w:val="15"/>
+              </w:rPr>
+              <w:t xml:space="preserve">Legitimate requests (control)</w:t>
+            </w:r>
+          </w:p>
+        </w:tc>
+        <w:tc>
+          <w:tcPr>
+            <w:tcW w:type="dxa" w:w="980"/>
+            <w:tcBorders>
+              <w:top w:val="none" w:color="FFFFFF" w:sz="0"/>
+              <w:left w:val="none" w:color="FFFFFF" w:sz="0"/>
+              <w:bottom w:val="none" w:color="FFFFFF" w:sz="0"/>
+              <w:right w:val="none" w:color="FFFFFF" w:sz="0"/>
+            </w:tcBorders>
+            <w:tcMar>
+              <w:top w:type="dxa" w:w="20"/>
+              <w:left w:type="dxa" w:w="40"/>
+              <w:bottom w:type="dxa" w:w="20"/>
+              <w:right w:type="dxa" w:w="40"/>
+            </w:tcMar>
+            <w:vAlign w:val="center"/>
+          </w:tcPr>
+          <w:p>
+            <w:pPr>
+              <w:keepNext/>
+              <w:spacing w:after="0" w:line="200"/>
+              <w:jc w:val="left"/>
+            </w:pPr>
+            <w:r>
+              <w:rPr>
+                <w:rFonts w:ascii="Times New Roman" w:cs="Times New Roman" w:eastAsia="Times New Roman" w:hAnsi="Times New Roman"/>
+                <w:b w:val="false"/>
+                <w:bCs w:val="false"/>
+                <w:sz w:val="15"/>
+                <w:szCs w:val="15"/>
+              </w:rPr>
+              <w:t xml:space="preserve">150</w:t>
+            </w:r>
+          </w:p>
+        </w:tc>
+        <w:tc>
+          <w:tcPr>
+            <w:tcW w:type="dxa" w:w="980"/>
+            <w:tcBorders>
+              <w:top w:val="none" w:color="FFFFFF" w:sz="0"/>
+              <w:left w:val="none" w:color="FFFFFF" w:sz="0"/>
+              <w:bottom w:val="none" w:color="FFFFFF" w:sz="0"/>
+              <w:right w:val="none" w:color="FFFFFF" w:sz="0"/>
+            </w:tcBorders>
+            <w:tcMar>
+              <w:top w:type="dxa" w:w="20"/>
+              <w:left w:type="dxa" w:w="40"/>
+              <w:bottom w:type="dxa" w:w="20"/>
+              <w:right w:type="dxa" w:w="40"/>
+            </w:tcMar>
+            <w:vAlign w:val="center"/>
+          </w:tcPr>
+          <w:p>
+            <w:pPr>
+              <w:keepNext/>
+              <w:spacing w:after="0" w:line="200"/>
+              <w:jc w:val="left"/>
+            </w:pPr>
+            <w:r>
+              <w:rPr>
+                <w:rFonts w:ascii="Times New Roman" w:cs="Times New Roman" w:eastAsia="Times New Roman" w:hAnsi="Times New Roman"/>
+                <w:b w:val="false"/>
+                <w:bCs w:val="false"/>
+                <w:sz w:val="15"/>
+                <w:szCs w:val="15"/>
+              </w:rPr>
+              <w:t xml:space="preserve">150</w:t>
+            </w:r>
+          </w:p>
+        </w:tc>
+      </w:tr>
+      <w:tr>
+        <w:trPr>
+          <w:cantSplit/>
+        </w:trPr>
+        <w:tc>
+          <w:tcPr>
+            <w:tcW w:type="dxa" w:w="2900"/>
+            <w:tcBorders>
+              <w:top w:val="none" w:color="FFFFFF" w:sz="0"/>
+              <w:left w:val="none" w:color="FFFFFF" w:sz="0"/>
+              <w:bottom w:val="none" w:color="FFFFFF" w:sz="0"/>
+              <w:right w:val="none" w:color="FFFFFF" w:sz="0"/>
+            </w:tcBorders>
+            <w:tcMar>
+              <w:top w:type="dxa" w:w="20"/>
+              <w:left w:type="dxa" w:w="40"/>
+              <w:bottom w:type="dxa" w:w="20"/>
+              <w:right w:type="dxa" w:w="40"/>
+            </w:tcMar>
+            <w:vAlign w:val="center"/>
+          </w:tcPr>
+          <w:p>
+            <w:pPr>
+              <w:keepNext/>
+              <w:spacing w:after="0" w:line="200"/>
+              <w:jc w:val="left"/>
+            </w:pPr>
+            <w:r>
+              <w:rPr>
+                <w:rFonts w:ascii="Times New Roman" w:cs="Times New Roman" w:eastAsia="Times New Roman" w:hAnsi="Times New Roman"/>
+                <w:b w:val="false"/>
+                <w:bCs w:val="false"/>
+                <w:sz w:val="15"/>
+                <w:szCs w:val="15"/>
+              </w:rPr>
+              <w:t xml:space="preserve">Forged signature</w:t>
+            </w:r>
+          </w:p>
+        </w:tc>
+        <w:tc>
+          <w:tcPr>
+            <w:tcW w:type="dxa" w:w="980"/>
+            <w:tcBorders>
+              <w:top w:val="none" w:color="FFFFFF" w:sz="0"/>
+              <w:left w:val="none" w:color="FFFFFF" w:sz="0"/>
+              <w:bottom w:val="none" w:color="FFFFFF" w:sz="0"/>
+              <w:right w:val="none" w:color="FFFFFF" w:sz="0"/>
+            </w:tcBorders>
+            <w:tcMar>
+              <w:top w:type="dxa" w:w="20"/>
+              <w:left w:type="dxa" w:w="40"/>
+              <w:bottom w:type="dxa" w:w="20"/>
+              <w:right w:type="dxa" w:w="40"/>
+            </w:tcMar>
+            <w:vAlign w:val="center"/>
+          </w:tcPr>
+          <w:p>
+            <w:pPr>
+              <w:keepNext/>
+              <w:spacing w:after="0" w:line="200"/>
+              <w:jc w:val="left"/>
+            </w:pPr>
+            <w:r>
+              <w:rPr>
+                <w:rFonts w:ascii="Times New Roman" w:cs="Times New Roman" w:eastAsia="Times New Roman" w:hAnsi="Times New Roman"/>
+                <w:b w:val="false"/>
+                <w:bCs w:val="false"/>
+                <w:sz w:val="15"/>
+                <w:szCs w:val="15"/>
+              </w:rPr>
+              <w:t xml:space="preserve">150</w:t>
+            </w:r>
+          </w:p>
+        </w:tc>
+        <w:tc>
+          <w:tcPr>
+            <w:tcW w:type="dxa" w:w="980"/>
+            <w:tcBorders>
+              <w:top w:val="none" w:color="FFFFFF" w:sz="0"/>
+              <w:left w:val="none" w:color="FFFFFF" w:sz="0"/>
+              <w:bottom w:val="none" w:color="FFFFFF" w:sz="0"/>
+              <w:right w:val="none" w:color="FFFFFF" w:sz="0"/>
+            </w:tcBorders>
+            <w:tcMar>
+              <w:top w:type="dxa" w:w="20"/>
+              <w:left w:type="dxa" w:w="40"/>
+              <w:bottom w:type="dxa" w:w="20"/>
+              <w:right w:type="dxa" w:w="40"/>
+            </w:tcMar>
+            <w:vAlign w:val="center"/>
+          </w:tcPr>
+          <w:p>
+            <w:pPr>
+              <w:keepNext/>
+              <w:spacing w:after="0" w:line="200"/>
+              <w:jc w:val="left"/>
+            </w:pPr>
+            <w:r>
+              <w:rPr>
+                <w:rFonts w:ascii="Times New Roman" w:cs="Times New Roman" w:eastAsia="Times New Roman" w:hAnsi="Times New Roman"/>
+                <w:b w:val="false"/>
+                <w:bCs w:val="false"/>
+                <w:sz w:val="15"/>
+                <w:szCs w:val="15"/>
+              </w:rPr>
+              <w:t xml:space="preserve">0</w:t>
+            </w:r>
+          </w:p>
+        </w:tc>
+      </w:tr>
+      <w:tr>
+        <w:trPr>
+          <w:cantSplit/>
+        </w:trPr>
+        <w:tc>
+          <w:tcPr>
+            <w:tcW w:type="dxa" w:w="2900"/>
+            <w:tcBorders>
+              <w:top w:val="none" w:color="FFFFFF" w:sz="0"/>
+              <w:left w:val="none" w:color="FFFFFF" w:sz="0"/>
+              <w:bottom w:val="none" w:color="FFFFFF" w:sz="0"/>
+              <w:right w:val="none" w:color="FFFFFF" w:sz="0"/>
+            </w:tcBorders>
+            <w:tcMar>
+              <w:top w:type="dxa" w:w="20"/>
+              <w:left w:type="dxa" w:w="40"/>
+              <w:bottom w:type="dxa" w:w="20"/>
+              <w:right w:type="dxa" w:w="40"/>
+            </w:tcMar>
+            <w:vAlign w:val="center"/>
+          </w:tcPr>
+          <w:p>
+            <w:pPr>
+              <w:keepNext/>
+              <w:spacing w:after="0" w:line="200"/>
+              <w:jc w:val="left"/>
+            </w:pPr>
+            <w:r>
+              <w:rPr>
+                <w:rFonts w:ascii="Times New Roman" w:cs="Times New Roman" w:eastAsia="Times New Roman" w:hAnsi="Times New Roman"/>
+                <w:b w:val="false"/>
+                <w:bCs w:val="false"/>
+                <w:sz w:val="15"/>
+                <w:szCs w:val="15"/>
+              </w:rPr>
+              <w:t xml:space="preserve">Replayed request</w:t>
+            </w:r>
+          </w:p>
+        </w:tc>
+        <w:tc>
+          <w:tcPr>
+            <w:tcW w:type="dxa" w:w="980"/>
+            <w:tcBorders>
+              <w:top w:val="none" w:color="FFFFFF" w:sz="0"/>
+              <w:left w:val="none" w:color="FFFFFF" w:sz="0"/>
+              <w:bottom w:val="none" w:color="FFFFFF" w:sz="0"/>
+              <w:right w:val="none" w:color="FFFFFF" w:sz="0"/>
+            </w:tcBorders>
+            <w:tcMar>
+              <w:top w:type="dxa" w:w="20"/>
+              <w:left w:type="dxa" w:w="40"/>
+              <w:bottom w:type="dxa" w:w="20"/>
+              <w:right w:type="dxa" w:w="40"/>
+            </w:tcMar>
+            <w:vAlign w:val="center"/>
+          </w:tcPr>
+          <w:p>
+            <w:pPr>
+              <w:keepNext/>
+              <w:spacing w:after="0" w:line="200"/>
+              <w:jc w:val="left"/>
+            </w:pPr>
+            <w:r>
+              <w:rPr>
+                <w:rFonts w:ascii="Times New Roman" w:cs="Times New Roman" w:eastAsia="Times New Roman" w:hAnsi="Times New Roman"/>
+                <w:b w:val="false"/>
+                <w:bCs w:val="false"/>
+                <w:sz w:val="15"/>
+                <w:szCs w:val="15"/>
+              </w:rPr>
+              <w:t xml:space="preserve">150</w:t>
+            </w:r>
+          </w:p>
+        </w:tc>
+        <w:tc>
+          <w:tcPr>
+            <w:tcW w:type="dxa" w:w="980"/>
+            <w:tcBorders>
+              <w:top w:val="none" w:color="FFFFFF" w:sz="0"/>
+              <w:left w:val="none" w:color="FFFFFF" w:sz="0"/>
+              <w:bottom w:val="none" w:color="FFFFFF" w:sz="0"/>
+              <w:right w:val="none" w:color="FFFFFF" w:sz="0"/>
+            </w:tcBorders>
+            <w:tcMar>
+              <w:top w:type="dxa" w:w="20"/>
+              <w:left w:type="dxa" w:w="40"/>
+              <w:bottom w:type="dxa" w:w="20"/>
+              <w:right w:type="dxa" w:w="40"/>
+            </w:tcMar>
+            <w:vAlign w:val="center"/>
+          </w:tcPr>
+          <w:p>
+            <w:pPr>
+              <w:keepNext/>
+              <w:spacing w:after="0" w:line="200"/>
+              <w:jc w:val="left"/>
+            </w:pPr>
+            <w:r>
+              <w:rPr>
+                <w:rFonts w:ascii="Times New Roman" w:cs="Times New Roman" w:eastAsia="Times New Roman" w:hAnsi="Times New Roman"/>
+                <w:b w:val="false"/>
+                <w:bCs w:val="false"/>
+                <w:sz w:val="15"/>
+                <w:szCs w:val="15"/>
+              </w:rPr>
+              <w:t xml:space="preserve">0</w:t>
+            </w:r>
+          </w:p>
+        </w:tc>
+      </w:tr>
+      <w:tr>
+        <w:trPr>
+          <w:cantSplit/>
+        </w:trPr>
+        <w:tc>
+          <w:tcPr>
+            <w:tcW w:type="dxa" w:w="2900"/>
+            <w:tcBorders>
+              <w:top w:val="none" w:color="FFFFFF" w:sz="0"/>
+              <w:left w:val="none" w:color="FFFFFF" w:sz="0"/>
+              <w:bottom w:val="none" w:color="FFFFFF" w:sz="0"/>
+              <w:right w:val="none" w:color="FFFFFF" w:sz="0"/>
+            </w:tcBorders>
+            <w:tcMar>
+              <w:top w:type="dxa" w:w="20"/>
+              <w:left w:type="dxa" w:w="40"/>
+              <w:bottom w:type="dxa" w:w="20"/>
+              <w:right w:type="dxa" w:w="40"/>
+            </w:tcMar>
+            <w:vAlign w:val="center"/>
+          </w:tcPr>
+          <w:p>
+            <w:pPr>
+              <w:keepNext/>
+              <w:spacing w:after="0" w:line="200"/>
+              <w:jc w:val="left"/>
+            </w:pPr>
+            <w:r>
+              <w:rPr>
+                <w:rFonts w:ascii="Times New Roman" w:cs="Times New Roman" w:eastAsia="Times New Roman" w:hAnsi="Times New Roman"/>
+                <w:b w:val="false"/>
+                <w:bCs w:val="false"/>
+                <w:sz w:val="15"/>
+                <w:szCs w:val="15"/>
+              </w:rPr>
+              <w:t xml:space="preserve">Stale timestamp</w:t>
+            </w:r>
+          </w:p>
+        </w:tc>
+        <w:tc>
+          <w:tcPr>
+            <w:tcW w:type="dxa" w:w="980"/>
+            <w:tcBorders>
+              <w:top w:val="none" w:color="FFFFFF" w:sz="0"/>
+              <w:left w:val="none" w:color="FFFFFF" w:sz="0"/>
+              <w:bottom w:val="none" w:color="FFFFFF" w:sz="0"/>
+              <w:right w:val="none" w:color="FFFFFF" w:sz="0"/>
+            </w:tcBorders>
+            <w:tcMar>
+              <w:top w:type="dxa" w:w="20"/>
+              <w:left w:type="dxa" w:w="40"/>
+              <w:bottom w:type="dxa" w:w="20"/>
+              <w:right w:type="dxa" w:w="40"/>
+            </w:tcMar>
+            <w:vAlign w:val="center"/>
+          </w:tcPr>
+          <w:p>
+            <w:pPr>
+              <w:keepNext/>
+              <w:spacing w:after="0" w:line="200"/>
+              <w:jc w:val="left"/>
+            </w:pPr>
+            <w:r>
+              <w:rPr>
+                <w:rFonts w:ascii="Times New Roman" w:cs="Times New Roman" w:eastAsia="Times New Roman" w:hAnsi="Times New Roman"/>
+                <w:b w:val="false"/>
+                <w:bCs w:val="false"/>
+                <w:sz w:val="15"/>
+                <w:szCs w:val="15"/>
+              </w:rPr>
+              <w:t xml:space="preserve">150</w:t>
+            </w:r>
+          </w:p>
+        </w:tc>
+        <w:tc>
+          <w:tcPr>
+            <w:tcW w:type="dxa" w:w="980"/>
+            <w:tcBorders>
+              <w:top w:val="none" w:color="FFFFFF" w:sz="0"/>
+              <w:left w:val="none" w:color="FFFFFF" w:sz="0"/>
+              <w:bottom w:val="none" w:color="FFFFFF" w:sz="0"/>
+              <w:right w:val="none" w:color="FFFFFF" w:sz="0"/>
+            </w:tcBorders>
+            <w:tcMar>
+              <w:top w:type="dxa" w:w="20"/>
+              <w:left w:type="dxa" w:w="40"/>
+              <w:bottom w:type="dxa" w:w="20"/>
+              <w:right w:type="dxa" w:w="40"/>
+            </w:tcMar>
+            <w:vAlign w:val="center"/>
+          </w:tcPr>
+          <w:p>
+            <w:pPr>
+              <w:keepNext/>
+              <w:spacing w:after="0" w:line="200"/>
+              <w:jc w:val="left"/>
+            </w:pPr>
+            <w:r>
+              <w:rPr>
+                <w:rFonts w:ascii="Times New Roman" w:cs="Times New Roman" w:eastAsia="Times New Roman" w:hAnsi="Times New Roman"/>
+                <w:b w:val="false"/>
+                <w:bCs w:val="false"/>
+                <w:sz w:val="15"/>
+                <w:szCs w:val="15"/>
+              </w:rPr>
+              <w:t xml:space="preserve">0</w:t>
+            </w:r>
+          </w:p>
+        </w:tc>
+      </w:tr>
+      <w:tr>
+        <w:trPr>
+          <w:cantSplit/>
+        </w:trPr>
+        <w:tc>
+          <w:tcPr>
+            <w:tcW w:type="dxa" w:w="2900"/>
+            <w:tcBorders>
+              <w:top w:val="none" w:color="FFFFFF" w:sz="0"/>
+              <w:left w:val="none" w:color="FFFFFF" w:sz="0"/>
+              <w:bottom w:val="none" w:color="FFFFFF" w:sz="0"/>
+              <w:right w:val="none" w:color="FFFFFF" w:sz="0"/>
+            </w:tcBorders>
+            <w:tcMar>
+              <w:top w:type="dxa" w:w="20"/>
+              <w:left w:type="dxa" w:w="40"/>
+              <w:bottom w:type="dxa" w:w="20"/>
+              <w:right w:type="dxa" w:w="40"/>
+            </w:tcMar>
+            <w:vAlign w:val="center"/>
+          </w:tcPr>
+          <w:p>
+            <w:pPr>
+              <w:keepNext/>
+              <w:spacing w:after="0" w:line="200"/>
+              <w:jc w:val="left"/>
+            </w:pPr>
+            <w:r>
+              <w:rPr>
+                <w:rFonts w:ascii="Times New Roman" w:cs="Times New Roman" w:eastAsia="Times New Roman" w:hAnsi="Times New Roman"/>
+                <w:b w:val="false"/>
+                <w:bCs w:val="false"/>
+                <w:sz w:val="15"/>
+                <w:szCs w:val="15"/>
+              </w:rPr>
+              <w:t xml:space="preserve">Unregistered DID</w:t>
+            </w:r>
+          </w:p>
+        </w:tc>
+        <w:tc>
+          <w:tcPr>
+            <w:tcW w:type="dxa" w:w="980"/>
+            <w:tcBorders>
+              <w:top w:val="none" w:color="FFFFFF" w:sz="0"/>
+              <w:left w:val="none" w:color="FFFFFF" w:sz="0"/>
+              <w:bottom w:val="none" w:color="FFFFFF" w:sz="0"/>
+              <w:right w:val="none" w:color="FFFFFF" w:sz="0"/>
+            </w:tcBorders>
+            <w:tcMar>
+              <w:top w:type="dxa" w:w="20"/>
+              <w:left w:type="dxa" w:w="40"/>
+              <w:bottom w:type="dxa" w:w="20"/>
+              <w:right w:type="dxa" w:w="40"/>
+            </w:tcMar>
+            <w:vAlign w:val="center"/>
+          </w:tcPr>
+          <w:p>
+            <w:pPr>
+              <w:keepNext/>
+              <w:spacing w:after="0" w:line="200"/>
+              <w:jc w:val="left"/>
+            </w:pPr>
+            <w:r>
+              <w:rPr>
+                <w:rFonts w:ascii="Times New Roman" w:cs="Times New Roman" w:eastAsia="Times New Roman" w:hAnsi="Times New Roman"/>
+                <w:b w:val="false"/>
+                <w:bCs w:val="false"/>
+                <w:sz w:val="15"/>
+                <w:szCs w:val="15"/>
+              </w:rPr>
+              <w:t xml:space="preserve">150</w:t>
+            </w:r>
+          </w:p>
+        </w:tc>
+        <w:tc>
+          <w:tcPr>
+            <w:tcW w:type="dxa" w:w="980"/>
+            <w:tcBorders>
+              <w:top w:val="none" w:color="FFFFFF" w:sz="0"/>
+              <w:left w:val="none" w:color="FFFFFF" w:sz="0"/>
+              <w:bottom w:val="none" w:color="FFFFFF" w:sz="0"/>
+              <w:right w:val="none" w:color="FFFFFF" w:sz="0"/>
+            </w:tcBorders>
+            <w:tcMar>
+              <w:top w:type="dxa" w:w="20"/>
+              <w:left w:type="dxa" w:w="40"/>
+              <w:bottom w:type="dxa" w:w="20"/>
+              <w:right w:type="dxa" w:w="40"/>
+            </w:tcMar>
+            <w:vAlign w:val="center"/>
+          </w:tcPr>
+          <w:p>
+            <w:pPr>
+              <w:keepNext/>
+              <w:spacing w:after="0" w:line="200"/>
+              <w:jc w:val="left"/>
+            </w:pPr>
+            <w:r>
+              <w:rPr>
+                <w:rFonts w:ascii="Times New Roman" w:cs="Times New Roman" w:eastAsia="Times New Roman" w:hAnsi="Times New Roman"/>
+                <w:b w:val="false"/>
+                <w:bCs w:val="false"/>
+                <w:sz w:val="15"/>
+                <w:szCs w:val="15"/>
+              </w:rPr>
+              <w:t xml:space="preserve">0</w:t>
+            </w:r>
+          </w:p>
+        </w:tc>
+      </w:tr>
+      <w:tr>
+        <w:trPr>
+          <w:cantSplit/>
+        </w:trPr>
+        <w:tc>
+          <w:tcPr>
+            <w:tcW w:type="dxa" w:w="2900"/>
+            <w:tcBorders>
+              <w:top w:val="none" w:color="FFFFFF" w:sz="0"/>
+              <w:left w:val="none" w:color="FFFFFF" w:sz="0"/>
+              <w:bottom w:val="none" w:color="FFFFFF" w:sz="0"/>
+              <w:right w:val="none" w:color="FFFFFF" w:sz="0"/>
+            </w:tcBorders>
+            <w:tcMar>
+              <w:top w:type="dxa" w:w="20"/>
+              <w:left w:type="dxa" w:w="40"/>
+              <w:bottom w:type="dxa" w:w="20"/>
+              <w:right w:type="dxa" w:w="40"/>
+            </w:tcMar>
+            <w:vAlign w:val="center"/>
+          </w:tcPr>
+          <w:p>
+            <w:pPr>
+              <w:keepNext/>
+              <w:spacing w:after="0" w:line="200"/>
+              <w:jc w:val="left"/>
+            </w:pPr>
+            <w:r>
+              <w:rPr>
+                <w:rFonts w:ascii="Times New Roman" w:cs="Times New Roman" w:eastAsia="Times New Roman" w:hAnsi="Times New Roman"/>
+                <w:b w:val="false"/>
+                <w:bCs w:val="false"/>
+                <w:sz w:val="15"/>
+                <w:szCs w:val="15"/>
+              </w:rPr>
+              <w:t xml:space="preserve">Tampered Merkle proof</w:t>
+            </w:r>
+          </w:p>
+        </w:tc>
+        <w:tc>
+          <w:tcPr>
+            <w:tcW w:type="dxa" w:w="980"/>
+            <w:tcBorders>
+              <w:top w:val="none" w:color="FFFFFF" w:sz="0"/>
+              <w:left w:val="none" w:color="FFFFFF" w:sz="0"/>
+              <w:bottom w:val="none" w:color="FFFFFF" w:sz="0"/>
+              <w:right w:val="none" w:color="FFFFFF" w:sz="0"/>
+            </w:tcBorders>
+            <w:tcMar>
+              <w:top w:type="dxa" w:w="20"/>
+              <w:left w:type="dxa" w:w="40"/>
+              <w:bottom w:type="dxa" w:w="20"/>
+              <w:right w:type="dxa" w:w="40"/>
+            </w:tcMar>
+            <w:vAlign w:val="center"/>
+          </w:tcPr>
+          <w:p>
+            <w:pPr>
+              <w:keepNext/>
+              <w:spacing w:after="0" w:line="200"/>
+              <w:jc w:val="left"/>
+            </w:pPr>
+            <w:r>
+              <w:rPr>
+                <w:rFonts w:ascii="Times New Roman" w:cs="Times New Roman" w:eastAsia="Times New Roman" w:hAnsi="Times New Roman"/>
+                <w:b w:val="false"/>
+                <w:bCs w:val="false"/>
+                <w:sz w:val="15"/>
+                <w:szCs w:val="15"/>
+              </w:rPr>
+              <w:t xml:space="preserve">150</w:t>
+            </w:r>
+          </w:p>
+        </w:tc>
+        <w:tc>
+          <w:tcPr>
+            <w:tcW w:type="dxa" w:w="980"/>
+            <w:tcBorders>
+              <w:top w:val="none" w:color="FFFFFF" w:sz="0"/>
+              <w:left w:val="none" w:color="FFFFFF" w:sz="0"/>
+              <w:bottom w:val="none" w:color="FFFFFF" w:sz="0"/>
+              <w:right w:val="none" w:color="FFFFFF" w:sz="0"/>
+            </w:tcBorders>
+            <w:tcMar>
+              <w:top w:type="dxa" w:w="20"/>
+              <w:left w:type="dxa" w:w="40"/>
+              <w:bottom w:type="dxa" w:w="20"/>
+              <w:right w:type="dxa" w:w="40"/>
+            </w:tcMar>
+            <w:vAlign w:val="center"/>
+          </w:tcPr>
+          <w:p>
+            <w:pPr>
+              <w:keepNext/>
+              <w:spacing w:after="0" w:line="200"/>
+              <w:jc w:val="left"/>
+            </w:pPr>
+            <w:r>
+              <w:rPr>
+                <w:rFonts w:ascii="Times New Roman" w:cs="Times New Roman" w:eastAsia="Times New Roman" w:hAnsi="Times New Roman"/>
+                <w:b w:val="false"/>
+                <w:bCs w:val="false"/>
+                <w:sz w:val="15"/>
+                <w:szCs w:val="15"/>
+              </w:rPr>
+              <w:t xml:space="preserve">0</w:t>
+            </w:r>
+          </w:p>
+        </w:tc>
+      </w:tr>
+      <w:tr>
+        <w:trPr>
+          <w:cantSplit/>
+        </w:trPr>
+        <w:tc>
+          <w:tcPr>
+            <w:tcW w:type="dxa" w:w="2900"/>
+            <w:tcBorders>
+              <w:top w:val="none" w:color="FFFFFF" w:sz="0"/>
+              <w:left w:val="none" w:color="FFFFFF" w:sz="0"/>
+              <w:bottom w:val="none" w:color="FFFFFF" w:sz="0"/>
+              <w:right w:val="none" w:color="FFFFFF" w:sz="0"/>
+            </w:tcBorders>
+            <w:tcMar>
+              <w:top w:type="dxa" w:w="20"/>
+              <w:left w:type="dxa" w:w="40"/>
+              <w:bottom w:type="dxa" w:w="20"/>
+              <w:right w:type="dxa" w:w="40"/>
+            </w:tcMar>
+            <w:vAlign w:val="center"/>
+          </w:tcPr>
+          <w:p>
+            <w:pPr>
+              <w:keepNext/>
+              <w:spacing w:after="0" w:line="200"/>
+              <w:jc w:val="left"/>
+            </w:pPr>
+            <w:r>
+              <w:rPr>
+                <w:rFonts w:ascii="Times New Roman" w:cs="Times New Roman" w:eastAsia="Times New Roman" w:hAnsi="Times New Roman"/>
+                <w:b w:val="false"/>
+                <w:bCs w:val="false"/>
+                <w:sz w:val="15"/>
+                <w:szCs w:val="15"/>
+              </w:rPr>
+              <w:t xml:space="preserve">Class outside policy</w:t>
+            </w:r>
+          </w:p>
+        </w:tc>
+        <w:tc>
+          <w:tcPr>
+            <w:tcW w:type="dxa" w:w="980"/>
+            <w:tcBorders>
+              <w:top w:val="none" w:color="FFFFFF" w:sz="0"/>
+              <w:left w:val="none" w:color="FFFFFF" w:sz="0"/>
+              <w:bottom w:val="none" w:color="FFFFFF" w:sz="0"/>
+              <w:right w:val="none" w:color="FFFFFF" w:sz="0"/>
+            </w:tcBorders>
+            <w:tcMar>
+              <w:top w:type="dxa" w:w="20"/>
+              <w:left w:type="dxa" w:w="40"/>
+              <w:bottom w:type="dxa" w:w="20"/>
+              <w:right w:type="dxa" w:w="40"/>
+            </w:tcMar>
+            <w:vAlign w:val="center"/>
+          </w:tcPr>
+          <w:p>
+            <w:pPr>
+              <w:keepNext/>
+              <w:spacing w:after="0" w:line="200"/>
+              <w:jc w:val="left"/>
+            </w:pPr>
+            <w:r>
+              <w:rPr>
+                <w:rFonts w:ascii="Times New Roman" w:cs="Times New Roman" w:eastAsia="Times New Roman" w:hAnsi="Times New Roman"/>
+                <w:b w:val="false"/>
+                <w:bCs w:val="false"/>
+                <w:sz w:val="15"/>
+                <w:szCs w:val="15"/>
+              </w:rPr>
+              <w:t xml:space="preserve">150</w:t>
+            </w:r>
+          </w:p>
+        </w:tc>
+        <w:tc>
+          <w:tcPr>
+            <w:tcW w:type="dxa" w:w="980"/>
+            <w:tcBorders>
+              <w:top w:val="none" w:color="FFFFFF" w:sz="0"/>
+              <w:left w:val="none" w:color="FFFFFF" w:sz="0"/>
+              <w:bottom w:val="none" w:color="FFFFFF" w:sz="0"/>
+              <w:right w:val="none" w:color="FFFFFF" w:sz="0"/>
+            </w:tcBorders>
+            <w:tcMar>
+              <w:top w:type="dxa" w:w="20"/>
+              <w:left w:type="dxa" w:w="40"/>
+              <w:bottom w:type="dxa" w:w="20"/>
+              <w:right w:type="dxa" w:w="40"/>
+            </w:tcMar>
+            <w:vAlign w:val="center"/>
+          </w:tcPr>
+          <w:p>
+            <w:pPr>
+              <w:keepNext/>
+              <w:spacing w:after="0" w:line="200"/>
+              <w:jc w:val="left"/>
+            </w:pPr>
+            <w:r>
+              <w:rPr>
+                <w:rFonts w:ascii="Times New Roman" w:cs="Times New Roman" w:eastAsia="Times New Roman" w:hAnsi="Times New Roman"/>
+                <w:b w:val="false"/>
+                <w:bCs w:val="false"/>
+                <w:sz w:val="15"/>
+                <w:szCs w:val="15"/>
+              </w:rPr>
+              <w:t xml:space="preserve">0</w:t>
+            </w:r>
+          </w:p>
+        </w:tc>
+      </w:tr>
+      <w:tr>
+        <w:trPr>
+          <w:cantSplit/>
+        </w:trPr>
+        <w:tc>
+          <w:tcPr>
+            <w:tcW w:type="dxa" w:w="2900"/>
+            <w:tcBorders>
+              <w:top w:val="none" w:color="FFFFFF" w:sz="0"/>
+              <w:left w:val="none" w:color="FFFFFF" w:sz="0"/>
+              <w:bottom w:val="single" w:color="000000" w:sz="4"/>
+              <w:right w:val="none" w:color="FFFFFF" w:sz="0"/>
+            </w:tcBorders>
+            <w:tcMar>
+              <w:top w:type="dxa" w:w="20"/>
+              <w:left w:type="dxa" w:w="40"/>
+              <w:bottom w:type="dxa" w:w="20"/>
+              <w:right w:type="dxa" w:w="40"/>
+            </w:tcMar>
+            <w:vAlign w:val="center"/>
+          </w:tcPr>
+          <w:p>
+            <w:pPr>
+              <w:keepNext/>
+              <w:spacing w:after="0" w:line="200"/>
+              <w:jc w:val="left"/>
+            </w:pPr>
+            <w:r>
+              <w:rPr>
+                <w:rFonts w:ascii="Times New Roman" w:cs="Times New Roman" w:eastAsia="Times New Roman" w:hAnsi="Times New Roman"/>
+                <w:b w:val="false"/>
+                <w:bCs w:val="false"/>
+                <w:sz w:val="15"/>
+                <w:szCs w:val="15"/>
+              </w:rPr>
+              <w:t xml:space="preserve">Trust score below threshold</w:t>
+            </w:r>
+          </w:p>
+        </w:tc>
+        <w:tc>
+          <w:tcPr>
+            <w:tcW w:type="dxa" w:w="980"/>
+            <w:tcBorders>
+              <w:top w:val="none" w:color="FFFFFF" w:sz="0"/>
+              <w:left w:val="none" w:color="FFFFFF" w:sz="0"/>
+              <w:bottom w:val="single" w:color="000000" w:sz="4"/>
+              <w:right w:val="none" w:color="FFFFFF" w:sz="0"/>
+            </w:tcBorders>
+            <w:tcMar>
+              <w:top w:type="dxa" w:w="20"/>
+              <w:left w:type="dxa" w:w="40"/>
+              <w:bottom w:type="dxa" w:w="20"/>
+              <w:right w:type="dxa" w:w="40"/>
+            </w:tcMar>
+            <w:vAlign w:val="center"/>
+          </w:tcPr>
+          <w:p>
+            <w:pPr>
+              <w:keepNext/>
+              <w:spacing w:after="0" w:line="200"/>
+              <w:jc w:val="left"/>
+            </w:pPr>
+            <w:r>
+              <w:rPr>
+                <w:rFonts w:ascii="Times New Roman" w:cs="Times New Roman" w:eastAsia="Times New Roman" w:hAnsi="Times New Roman"/>
+                <w:b w:val="false"/>
+                <w:bCs w:val="false"/>
+                <w:sz w:val="15"/>
+                <w:szCs w:val="15"/>
+              </w:rPr>
+              <w:t xml:space="preserve">150</w:t>
+            </w:r>
+          </w:p>
+        </w:tc>
+        <w:tc>
+          <w:tcPr>
+            <w:tcW w:type="dxa" w:w="980"/>
+            <w:tcBorders>
+              <w:top w:val="none" w:color="FFFFFF" w:sz="0"/>
+              <w:left w:val="none" w:color="FFFFFF" w:sz="0"/>
+              <w:bottom w:val="single" w:color="000000" w:sz="4"/>
+              <w:right w:val="none" w:color="FFFFFF" w:sz="0"/>
+            </w:tcBorders>
+            <w:tcMar>
+              <w:top w:type="dxa" w:w="20"/>
+              <w:left w:type="dxa" w:w="40"/>
+              <w:bottom w:type="dxa" w:w="20"/>
+              <w:right w:type="dxa" w:w="40"/>
+            </w:tcMar>
+            <w:vAlign w:val="center"/>
+          </w:tcPr>
+          <w:p>
+            <w:pPr>
+              <w:keepNext/>
+              <w:spacing w:after="0" w:line="200"/>
+              <w:jc w:val="left"/>
+            </w:pPr>
+            <w:r>
+              <w:rPr>
+                <w:rFonts w:ascii="Times New Roman" w:cs="Times New Roman" w:eastAsia="Times New Roman" w:hAnsi="Times New Roman"/>
+                <w:b w:val="false"/>
+                <w:bCs w:val="false"/>
+                <w:sz w:val="15"/>
+                <w:szCs w:val="15"/>
+              </w:rPr>
+              <w:t xml:space="preserve">0</w:t>
+            </w:r>
+          </w:p>
+        </w:tc>
+      </w:tr>
+    </w:tbl>
+    <w:p>
+      <w:pPr>
+        <w:spacing w:after="80" w:before="20"/>
+        <w:jc w:val="both"/>
+      </w:pPr>
+      <w:r>
+        <w:rPr>
+          <w:rFonts w:ascii="Times New Roman" w:cs="Times New Roman" w:eastAsia="Times New Roman" w:hAnsi="Times New Roman"/>
+          <w:sz w:val="14"/>
+          <w:szCs w:val="14"/>
+        </w:rPr>
+        <w:t xml:space="preserve">For the control row, Accepted is the desired outcome; for all other rows it must be 0.</w:t>
       </w:r>
     </w:p>
     <w:p>
@@ -10828,7 +12132,7 @@
           <wp:inline distT="0" distB="0" distL="0" distR="0">
             <wp:extent cx="3067050" cy="2257425"/>
             <wp:effectExtent t="0" r="0" b="0" l="0"/>
-            <wp:docPr id="1" name="fig5_sensitivity.png" descr="Fig. 5. Sensitivity of (a) authorisation latency to cache-hit ratio and (b) revocation delay to cache TTL (modelled)." title="Fig. 5. Sensitivity of (a) authorisation latency to cache-hit ratio and (b) revocation delay to cache TTL (modelled)."/>
+            <wp:docPr id="1" name="fig5_revocation.png" descr="Fig. 5. Revocation enforcement delay (mean, log scale; marks: worst case observed)." title="Fig. 5. Revocation enforcement delay (mean, log scale; marks: worst case observed)."/>
             <wp:cNvGraphicFramePr>
               <a:graphicFrameLocks xmlns:a="http://schemas.openxmlformats.org/drawingml/2006/main" noChangeAspect="1"/>
             </wp:cNvGraphicFramePr>
@@ -10875,7 +12179,7 @@
           <w:sz w:val="16"/>
           <w:szCs w:val="16"/>
         </w:rPr>
-        <w:t xml:space="preserve">Fig. 5. Sensitivity of (a) authorisation latency to cache-hit ratio and (b) revocation delay to cache TTL (modelled).</w:t>
+        <w:t xml:space="preserve">Fig. 5. Revocation enforcement delay (mean, log scale; marks: worst case observed).</w:t>
       </w:r>
     </w:p>
     <w:p>
@@ -10892,7 +12196,7 @@
           <w:sz w:val="20"/>
           <w:szCs w:val="20"/>
         </w:rPr>
-        <w:t xml:space="preserve">F. Attack Resistance</w:t>
+        <w:t xml:space="preserve">G. Comparison with Baselines</w:t>
       </w:r>
     </w:p>
     <w:p>
@@ -10906,59 +12210,23 @@
           <w:sz w:val="20"/>
           <w:szCs w:val="20"/>
         </w:rPr>
-        <w:t xml:space="preserve">The unit tests verify the on-chain mechanisms behind Table 3: revoked identities and low-trust devices are denied, sessions lapse after the TTL, non-validators and rate-limited validators cannot alter trust, unauthorised registrations are rejected, and audit inclusion proofs verify. Signature checking, nonce windows and gateway-side enforcement are design-level properties; they were </w:t>
-      </w:r>
-      <w:r>
-        <w:rPr>
-          <w:rFonts w:ascii="Times New Roman" w:cs="Times New Roman" w:eastAsia="Times New Roman" w:hAnsi="Times New Roman"/>
-          <w:i/>
-          <w:iCs/>
-          <w:sz w:val="20"/>
-          <w:szCs w:val="20"/>
-        </w:rPr>
-        <w:t xml:space="preserve">not</w:t>
-      </w:r>
-      <w:r>
-        <w:rPr>
-          <w:rFonts w:ascii="Times New Roman" w:cs="Times New Roman" w:eastAsia="Times New Roman" w:hAnsi="Times New Roman"/>
-          <w:sz w:val="20"/>
-          <w:szCs w:val="20"/>
-        </w:rPr>
-        <w:t xml:space="preserve"> subjected to penetration or attack-injection experiments, so we make no quantitative detection claims. Informally: forging an identity needs the device key, or the plant authority’s registration right; replay is limited to the window Δ; modifying a logged event changes its Merkle leaf and fails inclusion against the anchored root; and a single validator can only </w:t>
-      </w:r>
-      <w:r>
-        <w:rPr>
-          <w:rFonts w:ascii="Times New Roman" w:cs="Times New Roman" w:eastAsia="Times New Roman" w:hAnsi="Times New Roman"/>
-          <w:i/>
-          <w:iCs/>
-          <w:sz w:val="20"/>
-          <w:szCs w:val="20"/>
-        </w:rPr>
-        <w:t xml:space="preserve">lower</w:t>
-      </w:r>
-      <w:r>
-        <w:rPr>
-          <w:rFonts w:ascii="Times New Roman" w:cs="Times New Roman" w:eastAsia="Times New Roman" w:hAnsi="Times New Roman"/>
-          <w:sz w:val="20"/>
-          <w:szCs w:val="20"/>
-        </w:rPr>
-        <w:t xml:space="preserve"> a score, never raise it, which is conservative but means a compromised validator can deny service to a device, so validator governance matters. A compromised gateway can bypass enforcement for the resources it fronts, and micro-segmentation limits that blast radius to its own segment. By contrast, learning-based detectors report accuracy in the 85–91% range </w:t>
-      </w:r>
-      <w:r>
-        <w:rPr>
-          <w:rFonts w:ascii="Times New Roman" w:cs="Times New Roman" w:eastAsia="Times New Roman" w:hAnsi="Times New Roman"/>
-          <w:sz w:val="20"/>
-          <w:szCs w:val="20"/>
-        </w:rPr>
-        <w:t xml:space="preserve">[19], [20]</w:t>
-      </w:r>
-      <w:r>
-        <w:rPr>
-          <w:rFonts w:ascii="Times New Roman" w:cs="Times New Roman" w:eastAsia="Times New Roman" w:hAnsi="Times New Roman"/>
-          <w:sz w:val="20"/>
-          <w:szCs w:val="20"/>
-        </w:rPr>
-        <w:t xml:space="preserve">, a complementary function our trust engine could consume.</w:t>
+        <w:t xml:space="preserve">BC-ZTA is 3.0 ms slower than a ledger-free ABAC store at 50 devices but adds decentralised identity, shared policy and tamper-evident anchored audit that B2 lacks; against the centralised PKI-IAM it is 85% faster at 50 devices (with an emulated 40 ms WAN) and removes the central directory; and against the synchronous blockchain it avoids ~10.3 s per decision at 50 devices and the ledger ceiling. Its price is revocation latency: about 1.2 s with events (one block) instead of milliseconds for a central store. A reported Ethereum-based framework pays about 25 ms extra per request even at small scale </w:t>
+      </w:r>
+      <w:r>
+        <w:rPr>
+          <w:rFonts w:ascii="Times New Roman" w:cs="Times New Roman" w:eastAsia="Times New Roman" w:hAnsi="Times New Roman"/>
+          <w:sz w:val="20"/>
+          <w:szCs w:val="20"/>
+        </w:rPr>
+        <w:t xml:space="preserve">[17]</w:t>
+      </w:r>
+      <w:r>
+        <w:rPr>
+          <w:rFonts w:ascii="Times New Roman" w:cs="Times New Roman" w:eastAsia="Times New Roman" w:hAnsi="Times New Roman"/>
+          <w:sz w:val="20"/>
+          <w:szCs w:val="20"/>
+        </w:rPr>
+        <w:t xml:space="preserve">, consistent with our finding that on-path consensus is the bottleneck.</w:t>
       </w:r>
     </w:p>
     <w:p>
@@ -10975,7 +12243,7 @@
           <w:sz w:val="20"/>
           <w:szCs w:val="20"/>
         </w:rPr>
-        <w:t xml:space="preserve">G. Comparison with Baselines</w:t>
+        <w:t xml:space="preserve">H. Discussion and Limitations</w:t>
       </w:r>
     </w:p>
     <w:p>
@@ -10989,54 +12257,7 @@
           <w:sz w:val="20"/>
           <w:szCs w:val="20"/>
         </w:rPr>
-        <w:t xml:space="preserve">BC-ZTA matches the latency of a ledger-free ABAC store (1.7 vs 2.0 ms mean authorisation) while adding decentralised identity, shared policy and tamper-evident audit that B2 lacks; against PKI-IAM it is 97% faster and removes the central directory; and against the synchronous blockchain it avoids ~2.3 s per decision at 50 devices and ledger saturation beyond about 60 tx/s. A reported Ethereum-based framework pays about 25 ms extra per request even at small scale </w:t>
-      </w:r>
-      <w:r>
-        <w:rPr>
-          <w:rFonts w:ascii="Times New Roman" w:cs="Times New Roman" w:eastAsia="Times New Roman" w:hAnsi="Times New Roman"/>
-          <w:sz w:val="20"/>
-          <w:szCs w:val="20"/>
-        </w:rPr>
-        <w:t xml:space="preserve">[17]</w:t>
-      </w:r>
-      <w:r>
-        <w:rPr>
-          <w:rFonts w:ascii="Times New Roman" w:cs="Times New Roman" w:eastAsia="Times New Roman" w:hAnsi="Times New Roman"/>
-          <w:sz w:val="20"/>
-          <w:szCs w:val="20"/>
-        </w:rPr>
-        <w:t xml:space="preserve">, consistent with our finding that on-path consensus is the bottleneck.</w:t>
-      </w:r>
-    </w:p>
-    <w:p>
-      <w:pPr>
-        <w:keepNext/>
-        <w:spacing w:after="30" w:before="60"/>
-        <w:jc w:val="left"/>
-      </w:pPr>
-      <w:r>
-        <w:rPr>
-          <w:rFonts w:ascii="Times New Roman" w:cs="Times New Roman" w:eastAsia="Times New Roman" w:hAnsi="Times New Roman"/>
-          <w:i/>
-          <w:iCs/>
-          <w:sz w:val="20"/>
-          <w:szCs w:val="20"/>
-        </w:rPr>
-        <w:t xml:space="preserve">H. Discussion and Limitations</w:t>
-      </w:r>
-    </w:p>
-    <w:p>
-      <w:pPr>
-        <w:spacing w:after="60" w:before="0" w:line="228"/>
-        <w:jc w:val="both"/>
-      </w:pPr>
-      <w:r>
-        <w:rPr>
-          <w:rFonts w:ascii="Times New Roman" w:cs="Times New Roman" w:eastAsia="Times New Roman" w:hAnsi="Times New Roman"/>
-          <w:sz w:val="20"/>
-          <w:szCs w:val="20"/>
-        </w:rPr>
-        <w:t xml:space="preserve">The key trade-off is bounded revocation staleness for latency. Limitations: (i) all four validators ran on one shared 2-vCPU CI host, so absolute throughput and latency are not representative of a multi-server plant and network delay between validators is not captured; (ii) the edge-cache path, PKI and ABAC baselines, LAN/WAN costs and the 90% cache-hit ratio are modelled assumptions, and no physical or emulated plant was used; (iii) S1 and S5 are phase-locked to the block clock, whereas S3 uses random arrival phases, so S3 is the more representative latency; (iv) no device-side resource or privacy evaluation was performed; (v) the validator set is assumed honest-majority; and (vi) trust scores are voted values, not yet learned from data. Comparisons with published numbers are indicative only, since workloads and testbeds differ.</w:t>
+        <w:t xml:space="preserve">The key trade-off is bounded revocation staleness for latency. Limitations: (i) all four validators, the PEP and the load generator ran on one shared 2-vCPU CI host, so absolute latencies and throughput are not representative of a multi-server plant and validator network delay is not captured; (ii) the WAN delay of the PKI baseline is emulated, and the baselines are simple re-implementations, not production IAM products; (iii) the device population is emulated: no physical devices, industrial protocols or secure elements were used; (iv) one plant authority key issues registrations and revocations, so authority compromise is out of scope; (v) in the flooding test (E4), when 200 tx/s were sent to Besu while 50 devices were served, BC-ZTA success fell to 55–94% (mean latency 1192–8323 ms, against 4.3 ms without flooding), and every failure was a request rejected as stale; we attribute this to CPU starvation of the PEP by the flooded validators on the shared host, so the test does not demonstrate availability under ledger congestion, which needs separate hosts; and (vi) trust scores are voted values, not yet learned from data. Comparisons with published numbers are indicative only, since workloads and testbeds differ.</w:t>
       </w:r>
     </w:p>
     <w:p>
@@ -11079,7 +12300,7 @@
           <w:sz w:val="20"/>
           <w:szCs w:val="20"/>
         </w:rPr>
-        <w:t xml:space="preserve">We presented BC-ZTA, a blockchain-assisted zero-trust architecture that keeps consensus off the per-request path through edge-cached, Merkle-verified state and asynchronous batched anchoring. Four Solidity contracts pass 15 unit tests, and measured gas shows batch anchoring is about 1351× cheaper per record than per-event logging. On a four-validator Besu network the measured ledger saturates near 60 tx/s, so a synchronous design reaches 2.3 s latency at 50 devices; BC-ZTA keeps mean authorisation latency at 1.7 ms (modelled edge path) with on-chain load at about 46% of measured capacity at 400 devices, and revocation delay of about 1.5 s when events are used. Future work includes a multi-host Besu deployment, device-side measurements, learning-based trust scoring and post-quantum signatures.</w:t>
+        <w:t xml:space="preserve">We presented BC-ZTA, a blockchain-assisted zero-trust architecture that keeps consensus off the per-request path through edge-cached, Merkle-verified state and asynchronous batched anchoring. Four Solidity contracts pass 15 unit tests, and measured gas shows batch anchoring is about 1351× cheaper per record than per-event logging. In end-to-end tests on a four-validator Besu network, BC-ZTA decided in 7.4 ms on average at 50 devices and served 200 devices without failures with about one on-chain write per second, while the synchronous design needed 10.3 s and saturated at about 47 requests per second; the price is a revocation delay of about 1.2 s with event-driven invalidation. All forged, replayed, stale, unregistered, tampered and policy-violating requests were rejected. The evaluation used one shared host and an emulated device population and WAN link. Future work includes a multi-host Besu deployment with real network delay, physical devices and industrial protocols, learning-based trust scoring and post-quantum signatures.</w:t>
       </w:r>
     </w:p>
     <w:p>
@@ -11151,7 +12372,7 @@
         </w:rPr>
         <w:t xml:space="preserve">F. Federici, D. Martintoni, and V. Senni, “A zero-trust architecture for remote access in industrial IoT infrastructures,” Electronics, vol. 12, no. 3, Art. no. 566, 2023, </w:t>
       </w:r>
-      <w:hyperlink w:history="1" r:id="rIde2mmt5s-1aeascvksa2ns">
+      <w:hyperlink w:history="1" r:id="rIdicx-huvpjufi5tqk7sh4q">
         <w:r>
           <w:rPr>
             <w:rFonts w:ascii="Times New Roman" w:cs="Times New Roman" w:eastAsia="Times New Roman" w:hAnsi="Times New Roman"/>
@@ -11189,7 +12410,7 @@
         </w:rPr>
         <w:t xml:space="preserve">C. Zanasi, S. Russo, and M. Colajanni, “Flexible zero trust architecture for the cybersecurity of industrial IoT infrastructures,” Ad Hoc Netw., vol. 156, Art. no. 103414, 2024, </w:t>
       </w:r>
-      <w:hyperlink w:history="1" r:id="rIdad9cpis-mgyntjjqluyn7">
+      <w:hyperlink w:history="1" r:id="rIdibn0dl74arzmlfkjoxdnn">
         <w:r>
           <w:rPr>
             <w:rFonts w:ascii="Times New Roman" w:cs="Times New Roman" w:eastAsia="Times New Roman" w:hAnsi="Times New Roman"/>
@@ -11227,7 +12448,7 @@
         </w:rPr>
         <w:t xml:space="preserve">S. Rose, O. Borchert, S. Mitchell, and S. Connelly, “Zero trust architecture,” Nat. Inst. Standards Technol., Gaithersburg, MD, USA, Spec. Publ. 800-207, Aug. 2020, </w:t>
       </w:r>
-      <w:hyperlink w:history="1" r:id="rIdiplzjx5tqfptxvptb71ju">
+      <w:hyperlink w:history="1" r:id="rIduhkojayxekb_ultzzbf1l">
         <w:r>
           <w:rPr>
             <w:rFonts w:ascii="Times New Roman" w:cs="Times New Roman" w:eastAsia="Times New Roman" w:hAnsi="Times New Roman"/>
@@ -11265,7 +12486,7 @@
         </w:rPr>
         <w:t xml:space="preserve">M. L. Gambo and A. Almulhem, “Zero trust architecture: A systematic literature review,” J. Netw. Syst. Manage., vol. 34, Art. no. 25, 2026, </w:t>
       </w:r>
-      <w:hyperlink w:history="1" r:id="rIdernykzup9fyspooe1sgpi">
+      <w:hyperlink w:history="1" r:id="rIde9algprg8khqhhrih5j91">
         <w:r>
           <w:rPr>
             <w:rFonts w:ascii="Times New Roman" w:cs="Times New Roman" w:eastAsia="Times New Roman" w:hAnsi="Times New Roman"/>
@@ -11303,7 +12524,7 @@
         </w:rPr>
         <w:t xml:space="preserve">S. Mushtaq, M. Mohsin, and M. M. Mushtaq, “A systematic literature review on the implementation and challenges of zero trust architecture across domains,” Sensors, vol. 25, no. 19, Art. no. 6118, 2025, </w:t>
       </w:r>
-      <w:hyperlink w:history="1" r:id="rIdj-a0rrpuupvfq7pg30xns">
+      <w:hyperlink w:history="1" r:id="rIdk3vy7yx5wvamef2n_9mrw">
         <w:r>
           <w:rPr>
             <w:rFonts w:ascii="Times New Roman" w:cs="Times New Roman" w:eastAsia="Times New Roman" w:hAnsi="Times New Roman"/>
@@ -11341,7 +12562,7 @@
         </w:rPr>
         <w:t xml:space="preserve">M. A. Azad, S. Abdullah, J. Arshad, H. Lallie, and Y. H. Ahmed, “Verify and trust: A multidimensional survey of zero-trust security in the age of IoT,” Internet Things, vol. 27, Art. no. 101227, 2024, </w:t>
       </w:r>
-      <w:hyperlink w:history="1" r:id="rIdmfuc3zl26mlirxjn6bhtz">
+      <w:hyperlink w:history="1" r:id="rIdzgqihlji6pzeeznajpcdd">
         <w:r>
           <w:rPr>
             <w:rFonts w:ascii="Times New Roman" w:cs="Times New Roman" w:eastAsia="Times New Roman" w:hAnsi="Times New Roman"/>
@@ -11379,7 +12600,7 @@
         </w:rPr>
         <w:t xml:space="preserve">S. Mthethwa, M. T. Dlamini, and E. Jembere, “Zero trust for NHIs based on robust identity and access management for a resilient IoT future,” Sensors, vol. 26, no. 8, Art. no. 2392, 2026, </w:t>
       </w:r>
-      <w:hyperlink w:history="1" r:id="rId6v2ipr6eexh74px9brwib">
+      <w:hyperlink w:history="1" r:id="rIdqcmx7yjfehgx-btogedez">
         <w:r>
           <w:rPr>
             <w:rFonts w:ascii="Times New Roman" w:cs="Times New Roman" w:eastAsia="Times New Roman" w:hAnsi="Times New Roman"/>
@@ -11417,7 +12638,7 @@
         </w:rPr>
         <w:t xml:space="preserve">M. Asim, N. Tariq, A. I. Awad, F. Waheed, S. Bukhari, A. Rafay, and H. H. Song, “Lightweight and privacy-aware decentralized identity management for Industrial Internet of Things applications,” Future Gener. Comput. Syst., vol. 186, Art. no. 108753, 2027 (online Aug. 2026), </w:t>
       </w:r>
-      <w:hyperlink w:history="1" r:id="rIdkmbtnudfatk1aqzdijo-h">
+      <w:hyperlink w:history="1" r:id="rId6x8cjcekifgluo9nouswi">
         <w:r>
           <w:rPr>
             <w:rFonts w:ascii="Times New Roman" w:cs="Times New Roman" w:eastAsia="Times New Roman" w:hAnsi="Times New Roman"/>
@@ -11455,7 +12676,7 @@
         </w:rPr>
         <w:t xml:space="preserve">E. B. Fernández and A. Brazhuk, “A critical analysis of zero trust architecture (ZTA),” Comput. Stand. Interfaces, vol. 89, Art. no. 103832, 2024, </w:t>
       </w:r>
-      <w:hyperlink w:history="1" r:id="rIdmdlyrhimzat-kup04bz7n">
+      <w:hyperlink w:history="1" r:id="rIdntqs5mysjmfveq9sacafr">
         <w:r>
           <w:rPr>
             <w:rFonts w:ascii="Times New Roman" w:cs="Times New Roman" w:eastAsia="Times New Roman" w:hAnsi="Times New Roman"/>
@@ -11493,7 +12714,7 @@
         </w:rPr>
         <w:t xml:space="preserve">Y.-W. Ma and P.-H. Chiu, “A novel risk-based access control engine in zero trust architecture for IoT network,” Int. J. Inf. Secur., vol. 24, Art. no. 124, 2025, </w:t>
       </w:r>
-      <w:hyperlink w:history="1" r:id="rIdlbcomwbeaegco7yycdr45">
+      <w:hyperlink w:history="1" r:id="rIdta8knhxr_hfyx0r038ikw">
         <w:r>
           <w:rPr>
             <w:rFonts w:ascii="Times New Roman" w:cs="Times New Roman" w:eastAsia="Times New Roman" w:hAnsi="Times New Roman"/>
@@ -11531,7 +12752,7 @@
         </w:rPr>
         <w:t xml:space="preserve">M. A. Aleisa, “Blockchain-enabled zero trust architecture for privacy-preserving cybersecurity in IoT environments,” IEEE Access, vol. 13, pp. 18660–18676, 2025, </w:t>
       </w:r>
-      <w:hyperlink w:history="1" r:id="rIdmdkl1g51sdcitg39hmjyv">
+      <w:hyperlink w:history="1" r:id="rIdfnjlcbh14uwj5odm-tpoz">
         <w:r>
           <w:rPr>
             <w:rFonts w:ascii="Times New Roman" w:cs="Times New Roman" w:eastAsia="Times New Roman" w:hAnsi="Times New Roman"/>
@@ -11569,7 +12790,7 @@
         </w:rPr>
         <w:t xml:space="preserve">S. Nie, J. Ren, R. Wu, P. Han, Z. Han, and W. Wan, “Zero-trust access control mechanism based on blockchain and inner-product encryption in the Internet of Things in a 6G environment,” Sensors, vol. 25, no. 2, Art. no. 550, 2025, </w:t>
       </w:r>
-      <w:hyperlink w:history="1" r:id="rId9hbi-op49_gmvag81hynh">
+      <w:hyperlink w:history="1" r:id="rIdgtyjzbvlf0rfxbpghdbuq">
         <w:r>
           <w:rPr>
             <w:rFonts w:ascii="Times New Roman" w:cs="Times New Roman" w:eastAsia="Times New Roman" w:hAnsi="Times New Roman"/>
@@ -11607,7 +12828,7 @@
         </w:rPr>
         <w:t xml:space="preserve">G. Ali, S. Shah, M. Elaffendi, and N. Ahmad, “Blockchain-based access management framework for interoperable digital twins in industrial IoT,” Front. Blockchain, vol. 8, Art. no. 1693926, 2025, </w:t>
       </w:r>
-      <w:hyperlink w:history="1" r:id="rIdkqbxpspnaf3x-mv-7c-k8">
+      <w:hyperlink w:history="1" r:id="rIdptbbhgj81zcs5ntdufj0e">
         <w:r>
           <w:rPr>
             <w:rFonts w:ascii="Times New Roman" w:cs="Times New Roman" w:eastAsia="Times New Roman" w:hAnsi="Times New Roman"/>
@@ -11645,7 +12866,7 @@
         </w:rPr>
         <w:t xml:space="preserve">M. Essaid and H. Ju, “Blockchain solutions for enhancing security and privacy in Industrial IoT,” Appl. Sci., vol. 15, no. 12, Art. no. 6835, 2025, </w:t>
       </w:r>
-      <w:hyperlink w:history="1" r:id="rIdtoercixmph8gtdef6jmep">
+      <w:hyperlink w:history="1" r:id="rIddnpi9y7-z4a8owwwjnt09">
         <w:r>
           <w:rPr>
             <w:rFonts w:ascii="Times New Roman" w:cs="Times New Roman" w:eastAsia="Times New Roman" w:hAnsi="Times New Roman"/>
@@ -11683,7 +12904,7 @@
         </w:rPr>
         <w:t xml:space="preserve">D. Li, H. Li, N. Crespi, R. Minerva, M. Li, W. Liang, and K. C. Li, “Hyper-IIoT: A smart contract-inspired access control scheme for resource-constrained Industrial Internet of Things,” IEEE Trans. Sustain. Comput., vol. 10, no. 5, pp. 820–829, 2025, </w:t>
       </w:r>
-      <w:hyperlink w:history="1" r:id="rIdfr_xfqdyc6evlgqwhsajw">
+      <w:hyperlink w:history="1" r:id="rId42uvuso2cn86sbnzhboaf">
         <w:r>
           <w:rPr>
             <w:rFonts w:ascii="Times New Roman" w:cs="Times New Roman" w:eastAsia="Times New Roman" w:hAnsi="Times New Roman"/>
@@ -11721,7 +12942,7 @@
         </w:rPr>
         <w:t xml:space="preserve">Z. Guo, “Blockchain-enhanced smart contracts for formal verification of IoT access control mechanisms,” Alexandria Eng. J., vol. 118, pp. 315–324, 2025, </w:t>
       </w:r>
-      <w:hyperlink w:history="1" r:id="rIdaah41rta7-z6wsas5cdm_">
+      <w:hyperlink w:history="1" r:id="rIdndxh7yf66de8xd3ubdpvg">
         <w:r>
           <w:rPr>
             <w:rFonts w:ascii="Times New Roman" w:cs="Times New Roman" w:eastAsia="Times New Roman" w:hAnsi="Times New Roman"/>
@@ -11759,7 +12980,7 @@
         </w:rPr>
         <w:t xml:space="preserve">A. Singh, V. Pareek, and A. Sharma, “Blockchain-enabled zero trust framework for securing FinTech ecosystems against insider threats and cyber attacks,” </w:t>
       </w:r>
-      <w:hyperlink w:history="1" r:id="rId4o545bfbz9v2uyoonpoks">
+      <w:hyperlink w:history="1" r:id="rIdr2_c2m3257k8oihprmdct">
         <w:r>
           <w:rPr>
             <w:rFonts w:ascii="Times New Roman" w:cs="Times New Roman" w:eastAsia="Times New Roman" w:hAnsi="Times New Roman"/>
@@ -11797,7 +13018,7 @@
         </w:rPr>
         <w:t xml:space="preserve">M. M. Salim, M. Kim, S. K. Singh, and J. H. Park, “Zero-trust blockchain-enabled framework for scalable and secure IoT networks,” Future Gener. Comput. Syst., vol. 175, Art. no. 108093, 2026, </w:t>
       </w:r>
-      <w:hyperlink w:history="1" r:id="rIdcnjciaydcekwkkvpyzoq9">
+      <w:hyperlink w:history="1" r:id="rIdcmtyrckc1kynhrebw_yp5">
         <w:r>
           <w:rPr>
             <w:rFonts w:ascii="Times New Roman" w:cs="Times New Roman" w:eastAsia="Times New Roman" w:hAnsi="Times New Roman"/>
@@ -11835,7 +13056,7 @@
         </w:rPr>
         <w:t xml:space="preserve">A. Sharma, S. Rani, and W. Boulila, “Blockchain-based zero trust networks with federated transfer learning for IoT security in industry 5.0,” PLOS ONE, vol. 20, no. 6, Art. no. e0323241, 2025, </w:t>
       </w:r>
-      <w:hyperlink w:history="1" r:id="rIdf244iojwh_pfrkfpdhjku">
+      <w:hyperlink w:history="1" r:id="rIdy5qx00krwizyhxvz2qnkd">
         <w:r>
           <w:rPr>
             <w:rFonts w:ascii="Times New Roman" w:cs="Times New Roman" w:eastAsia="Times New Roman" w:hAnsi="Times New Roman"/>
@@ -11873,7 +13094,7 @@
         </w:rPr>
         <w:t xml:space="preserve">S. Mishra, T. S. M. Aldafas, and N. S. Alshammari, “A zero-trust digital twin framework for privacy-preserving multi-dataset intrusion detection in industrial IoT with lightweight blockchain auditing,” Sci. Rep., vol. 16, Art. no. 15236, 2026, </w:t>
       </w:r>
-      <w:hyperlink w:history="1" r:id="rId5tlie0_ctl5azohmdhf5u">
+      <w:hyperlink w:history="1" r:id="rId9cusjegfqnwqsjkrfgk94">
         <w:r>
           <w:rPr>
             <w:rFonts w:ascii="Times New Roman" w:cs="Times New Roman" w:eastAsia="Times New Roman" w:hAnsi="Times New Roman"/>
@@ -11911,7 +13132,7 @@
         </w:rPr>
         <w:t xml:space="preserve">Z. Zhai, J. Liu, X. Liu, Y. Mao, X. Zhang, J. Ma, and C. Jin, “A lightweight authentication method for Industrial Internet of Things based on blockchain and Chebyshev chaotic maps,” Future Internet, vol. 17, no. 8, Art. no. 338, 2025, </w:t>
       </w:r>
-      <w:hyperlink w:history="1" r:id="rIdroqhhbftzpgdndzkiycdd">
+      <w:hyperlink w:history="1" r:id="rIdmqpivr2acx8i77cbesvqn">
         <w:r>
           <w:rPr>
             <w:rFonts w:ascii="Times New Roman" w:cs="Times New Roman" w:eastAsia="Times New Roman" w:hAnsi="Times New Roman"/>
@@ -11949,7 +13170,7 @@
         </w:rPr>
         <w:t xml:space="preserve">T. Ramírez-Gordillo, A. Maciá-Lillo, F. A. Pujol, N. García-D’Urso, J. Azorín-López, and H. Mora, “Decentralized identity management for Internet of Things (IoT) devices using IOTA blockchain technology,” Future Internet, vol. 17, no. 1, Art. no. 49, 2025, </w:t>
       </w:r>
-      <w:hyperlink w:history="1" r:id="rIdkvh1roxhutx2zr-qwyg6i">
+      <w:hyperlink w:history="1" r:id="rIddnztb40sjcwolsl1wqaqq">
         <w:r>
           <w:rPr>
             <w:rFonts w:ascii="Times New Roman" w:cs="Times New Roman" w:eastAsia="Times New Roman" w:hAnsi="Times New Roman"/>
@@ -11987,7 +13208,7 @@
         </w:rPr>
         <w:t xml:space="preserve">S. I. R. Naqvi, Z. J. Bin, A. Mohsin, M. P. Akhter, and M. M. ur Rahman, “DBoT: Enhancing scalability and privacy in intelligent building spaces through a direct acyclic graph blockchain,” in Proc. 17th Int. Conf. Open Source Syst. Technol. (ICOSST), 2023, </w:t>
       </w:r>
-      <w:hyperlink w:history="1" r:id="rIdq63qrxlwoaqlazbr5p-8w">
+      <w:hyperlink w:history="1" r:id="rIdngneldrvdwutgm4etxh_y">
         <w:r>
           <w:rPr>
             <w:rFonts w:ascii="Times New Roman" w:cs="Times New Roman" w:eastAsia="Times New Roman" w:hAnsi="Times New Roman"/>
@@ -12025,7 +13246,7 @@
         </w:rPr>
         <w:t xml:space="preserve">R. Islam, R. Bose, S. Roy, A. A. Khan, S. Sutradhar, S. Das, F. Ali, and A. A. AlZubi, “Decentralized trust framework for smart cities: A blockchain-enabled cybersecurity and data integrity model,” Sci. Rep., vol. 15, Art. no. 23454, 2025, </w:t>
       </w:r>
-      <w:hyperlink w:history="1" r:id="rIddyq7ov3egui4cmt0ll_-o">
+      <w:hyperlink w:history="1" r:id="rIdidtucxdogsuopsrwfslwx">
         <w:r>
           <w:rPr>
             <w:rFonts w:ascii="Times New Roman" w:cs="Times New Roman" w:eastAsia="Times New Roman" w:hAnsi="Times New Roman"/>
@@ -12063,7 +13284,7 @@
         </w:rPr>
         <w:t xml:space="preserve">P. Rani, “A zero-trust framework for securing next-generation Internet of Things network,” in New Trends and Applications in Internet of Things (IoT) and Big Data Analytics, vol. 2. Cham, Switzerland: Springer, 2026, pp. 213–225, </w:t>
       </w:r>
-      <w:hyperlink w:history="1" r:id="rIddbgzn9vmhnnpmyasxwubv">
+      <w:hyperlink w:history="1" r:id="rIdgtod0ynbg3_4mpdnhh0sx">
         <w:r>
           <w:rPr>
             <w:rFonts w:ascii="Times New Roman" w:cs="Times New Roman" w:eastAsia="Times New Roman" w:hAnsi="Times New Roman"/>
@@ -12101,7 +13322,7 @@
         </w:rPr>
         <w:t xml:space="preserve">B. Chellaprabha, D. Manohari, and J. J. Justus, “Scalable and secure IoT architecture using trust-driven adaptive resource management and edge intelligence,” in Expert Applications and Security (NICE-TEAS 2025), Lecture Notes in Networks and Systems, vol. 1823. Cham, Switzerland: Springer, 2026, pp. 444–461, </w:t>
       </w:r>
-      <w:hyperlink w:history="1" r:id="rIdqvsxgrcrrq5e8xw5hozte">
+      <w:hyperlink w:history="1" r:id="rIdghzvsygab7lommnr4mjbs">
         <w:r>
           <w:rPr>
             <w:rFonts w:ascii="Times New Roman" w:cs="Times New Roman" w:eastAsia="Times New Roman" w:hAnsi="Times New Roman"/>
@@ -12139,7 +13360,7 @@
         </w:rPr>
         <w:t xml:space="preserve">K. Li et al., “Zero-trust foundation models: A new paradigm for secure and collaborative artificial intelligence for Internet of Things,” </w:t>
       </w:r>
-      <w:hyperlink w:history="1" r:id="rId-nbszrew_jz8bg8yf4ahk">
+      <w:hyperlink w:history="1" r:id="rId0u-riella5xddoexckbq-">
         <w:r>
           <w:rPr>
             <w:rFonts w:ascii="Times New Roman" w:cs="Times New Roman" w:eastAsia="Times New Roman" w:hAnsi="Times New Roman"/>
@@ -12177,7 +13398,7 @@
         </w:rPr>
         <w:t xml:space="preserve">S. Ghasemshirazi, G. Shirvani, and M. A. Alipour, “Zero trust: Applications, challenges, and opportunities,” </w:t>
       </w:r>
-      <w:hyperlink w:history="1" r:id="rIdidar5xjazut7uquc6tz2r">
+      <w:hyperlink w:history="1" r:id="rIde2un4bvh_-ptdikax0jhr">
         <w:r>
           <w:rPr>
             <w:rFonts w:ascii="Times New Roman" w:cs="Times New Roman" w:eastAsia="Times New Roman" w:hAnsi="Times New Roman"/>
@@ -12215,7 +13436,7 @@
         </w:rPr>
         <w:t xml:space="preserve">A. K. Peepliwal et al., “A prototype model of zero-trust architecture blockchain with EigenTrust-based practical Byzantine fault tolerance protocol to manage decentralized clinical trials,” </w:t>
       </w:r>
-      <w:hyperlink w:history="1" r:id="rIdmlcpfjrwndf6tzfhowl3h">
+      <w:hyperlink w:history="1" r:id="rIdsi5xviv1z0_shklgdjxna">
         <w:r>
           <w:rPr>
             <w:rFonts w:ascii="Times New Roman" w:cs="Times New Roman" w:eastAsia="Times New Roman" w:hAnsi="Times New Roman"/>
@@ -12253,7 +13474,7 @@
         </w:rPr>
         <w:t xml:space="preserve">A. Kulkarni, N. A. Hazari, and M. Y. Niamat, “A zero trust-based framework employing blockchain technology and ring oscillator physical unclonable functions for security of field programmable gate array supply chain,” IEEE Access, vol. 12, pp. 89322–89338, 2024. [Online]. Available: </w:t>
       </w:r>
-      <w:hyperlink w:history="1" r:id="rIdodc2rh0z0nmxyp8qlr6kq">
+      <w:hyperlink w:history="1" r:id="rId-xwse-7e3k-smeesycmbl">
         <w:r>
           <w:rPr>
             <w:rFonts w:ascii="Times New Roman" w:cs="Times New Roman" w:eastAsia="Times New Roman" w:hAnsi="Times New Roman"/>

</xml_diff>

<commit_message>
Add 7-VM GCP results (5 runs + E5), update aggregation/figures/paper and README
Co-Authored-By: Claude Sonnet 5.5 <noreply@anthropic.com>
Claude-Session: https://claude.ai/code/session_013MWEbKStV7gCMmHJrttV1T
</commit_message>
<xml_diff>
--- a/paper/Blockchain_ZeroTrust_IIoT_IEEE_Access.docx
+++ b/paper/Blockchain_ZeroTrust_IIoT_IEEE_Access.docx
@@ -101,7 +101,7 @@
           <w:sz w:val="18"/>
           <w:szCs w:val="18"/>
         </w:rPr>
-        <w:t xml:space="preserve">Industrial IoT (IIoT) networks need continuous, per-request verification, but placing a blockchain on the authentication path adds seconds of latency and saturates ledger capacity. We propose BC-ZTA, a three-tier blockchain-assisted zero-trust architecture in which edge policy enforcement points decide from cached, Merkle-verified ledger state, while identity, trust and audit updates are written asynchronously to a permissioned Hyperledger Besu (IBFT 2.0) network through four Solidity contracts. We implemented the policy enforcement point and three baselines and measured them end to end on a four-validator Besu network (three repetitions, shared two-vCPU host). At 50 devices BC-ZTA answers in 7.4 ms on average, compared with 48.2 ms for a centralised directory with an emulated WAN link and 10257 ms when every request is an on-chain transaction; the synchronous design saturates at about 47 requests per second, whereas BC-ZTA served 200 devices with no failures and about one on-chain write per second. Event-driven cache invalidation enforces a revocation in 1.2 s on average, and all 1050 forged, replayed, stale, unregistered, tampered or policy-violating requests were rejected. Merkle batch anchoring cuts audit gas per record by about 1351×. Limitations are the shared single host, the emulated WAN delay and the emulated device population.</w:t>
+        <w:t xml:space="preserve">Industrial IoT (IIoT) networks need continuous, per-request verification, but placing a blockchain on the authentication path adds seconds of latency and saturates ledger capacity. We propose BC-ZTA, a three-tier blockchain-assisted zero-trust architecture in which edge policy enforcement points decide from cached, Merkle-verified ledger state, while identity, trust and audit updates are written asynchronously to a permissioned Hyperledger Besu (IBFT 2.0) network through four Solidity contracts. We implemented the policy enforcement point and three baselines and measured them end to end on a four-validator Besu network (five repetitions, seven cloud VMs). At 50 devices BC-ZTA answers in 5.4 ms on average, compared with 49.1 ms for a centralised directory with an injected 40 ms network delay and 1382 ms when every request is an on-chain transaction; the synchronous design answers only 40% of the requests at 200 devices, whereas BC-ZTA served 200 devices with no failures and about one on-chain write per second, and kept deciding while one of the four validators was stopped. Event-driven cache invalidation enforces a revocation in 1.3 s on average, and all 1750 forged, replayed, stale, unregistered, tampered or policy-violating requests were rejected. Merkle batch anchoring cuts audit gas per record by about 1351×. Limitations are the single cloud zone with injected network delay, simple baselines and the emulated device population.</w:t>
       </w:r>
     </w:p>
     <w:p>
@@ -927,7 +927,7 @@
           <w:sz w:val="20"/>
           <w:szCs w:val="20"/>
         </w:rPr>
-        <w:t xml:space="preserve"> A running PEP/PDP service, three baselines (centralised PKI-IAM, local ABAC, blockchain-synchronous) and a load generator, evaluated on a four-validator Hyperledger Besu IBFT 2.0 network in three repetitions: latency and goodput up to 200 devices, revocation delay, security tests and gas (Sections 5–6).</w:t>
+        <w:t xml:space="preserve"> A running PEP/PDP service, three baselines (centralised PKI-IAM, local ABAC, blockchain-synchronous) and a load generator, evaluated on a seven-VM Google Cloud deployment with a four-validator Hyperledger Besu IBFT 2.0 network in five repetitions: latency and goodput up to 200 devices, revocation delay, security tests, a validator-failure test and gas (Sections 5–6).</w:t>
       </w:r>
     </w:p>
     <w:p>
@@ -960,7 +960,7 @@
           <w:sz w:val="20"/>
           <w:szCs w:val="20"/>
         </w:rPr>
-        <w:t xml:space="preserve"> Event-driven invalidation reduces mean revocation delay from 16.5 s to 1.5 s (Section VI-E).</w:t>
+        <w:t xml:space="preserve"> Event-driven invalidation reduces mean revocation delay from 6.6 s to 1.3 s (Section VI-F).</w:t>
       </w:r>
     </w:p>
     <w:p>
@@ -6615,7 +6615,7 @@
           <w:sz w:val="20"/>
           <w:szCs w:val="20"/>
         </w:rPr>
-        <w:t xml:space="preserve"> = 1, block period 2 s, chain ID 2026, zero base fee, London EVM) with Docker on a GitHub-hosted 2-vCPU Linux runner; all validators share that single host, so network delay is negligible and CPU is contended. A fresh network was started for each of 3 repetitions. Contracts were compiled with Solidity 0.8.20 (optimizer 200 runs, EVM “london”). Five scenarios were run with pre-signed transactions from 8 worker wallets: S1 sequential write confirmation, S2 read latency (500 </w:t>
+        <w:t xml:space="preserve"> = 1, block period 2 s, chain ID 2026, zero base fee, London EVM) with Docker on a GitHub-hosted 2-vCPU Linux runner for the contract-level micro-benchmark described below; all validators share that single host, so network delay is negligible and CPU is contended. The end-to-end experiments of Section V-C were run separately on a seven-VM Google Cloud deployment (Section V-G). A fresh network was started for each of 3 micro-benchmark repetitions. Contracts were compiled with Solidity 0.8.20 (optimizer 200 runs, EVM “london”). Five scenarios were run with pre-signed transactions from 8 worker wallets: S1 sequential write confirmation, S2 read latency (500 </w:t>
       </w:r>
       <w:r>
         <w:rPr>
@@ -6821,7 +6821,7 @@
           <w:sz w:val="20"/>
           <w:szCs w:val="20"/>
         </w:rPr>
-        <w:t xml:space="preserve">. The load generator emulates N = 10, 25, 50, 100, 200 devices, each sending one request per second with staggered phases, for 5 s of warm-up and a 20 s measurement window; requests are signed before the window so that the generator itself is not the bottleneck. The PEP, the baseline servers, the load generator and all four Besu validators run on the same 2-vCPU host.</w:t>
+        <w:t xml:space="preserve">. The load generator emulates N = 10, 25, 50, 100, 200 devices, each sending one request per second with staggered phases, for 5 s of warm-up and a 20 s measurement window; requests are signed before the window so that the generator itself is not the bottleneck. In the end-to-end experiments the PEP, the directory server, the load generator and the four Besu validators run on separate machines (Section V-G).</w:t>
       </w:r>
     </w:p>
     <w:p>
@@ -6870,7 +6870,25 @@
           <w:sz w:val="20"/>
           <w:szCs w:val="20"/>
         </w:rPr>
-        <w:t xml:space="preserve">: each request makes one lookup at a separate directory server, with an emulated WAN round trip of 40 ms plus 2 ms directory time (an in-process delay, not a real network). (B2) </w:t>
+        <w:t xml:space="preserve">: each request makes one lookup at a separate directory server, on a separate directory VM whose responses are delayed by 40 ms with Linux </w:t>
+      </w:r>
+      <w:r>
+        <w:rPr>
+          <w:rFonts w:ascii="Times New Roman" w:cs="Times New Roman" w:eastAsia="Times New Roman" w:hAnsi="Times New Roman"/>
+          <w:i/>
+          <w:iCs/>
+          <w:sz w:val="20"/>
+          <w:szCs w:val="20"/>
+        </w:rPr>
+        <w:t xml:space="preserve">tc netem</w:t>
+      </w:r>
+      <w:r>
+        <w:rPr>
+          <w:rFonts w:ascii="Times New Roman" w:cs="Times New Roman" w:eastAsia="Times New Roman" w:hAnsi="Times New Roman"/>
+          <w:sz w:val="20"/>
+          <w:szCs w:val="20"/>
+        </w:rPr>
+        <w:t xml:space="preserve"> to model a remote central service (about 50 ms per lookup in total, Section VI-A). (B2) </w:t>
       </w:r>
       <w:r>
         <w:rPr>
@@ -6992,7 +7010,7 @@
           <w:sz w:val="20"/>
           <w:szCs w:val="20"/>
         </w:rPr>
-        <w:t xml:space="preserve">Table 4 lists the experimental parameters; the PKI delay is an assumption, the other values are configuration of the prototype.</w:t>
+        <w:t xml:space="preserve">Table 4 lists the experimental parameters; the injected network delays are assumptions, the other values are configuration of the prototype.</w:t>
       </w:r>
     </w:p>
     <w:p>
@@ -7288,7 +7306,7 @@
                 <w:sz w:val="15"/>
                 <w:szCs w:val="15"/>
               </w:rPr>
-              <w:t xml:space="preserve">Host</w:t>
+              <w:t xml:space="preserve">Platform</w:t>
             </w:r>
           </w:p>
         </w:tc>
@@ -7323,7 +7341,7 @@
                 <w:sz w:val="15"/>
                 <w:szCs w:val="15"/>
               </w:rPr>
-              <w:t xml:space="preserve">GitHub-hosted, 2 vCPU, 8 GB</w:t>
+              <w:t xml:space="preserve">Google Cloud, 7 VMs (Section V-G)</w:t>
             </w:r>
           </w:p>
         </w:tc>
@@ -7473,7 +7491,7 @@
                 <w:sz w:val="15"/>
                 <w:szCs w:val="15"/>
               </w:rPr>
-              <w:t xml:space="preserve">5 s; 20 s; 3</w:t>
+              <w:t xml:space="preserve">5 s; 20 s; 5</w:t>
             </w:r>
           </w:p>
         </w:tc>
@@ -7588,7 +7606,7 @@
                 <w:sz w:val="15"/>
                 <w:szCs w:val="15"/>
               </w:rPr>
-              <w:t xml:space="preserve">Emulated WAN RTT (B1)</w:t>
+              <w:t xml:space="preserve">Directory delay (B1, netem)</w:t>
             </w:r>
           </w:p>
         </w:tc>
@@ -7663,7 +7681,7 @@
                 <w:sz w:val="15"/>
                 <w:szCs w:val="15"/>
               </w:rPr>
-              <w:t xml:space="preserve">Freshness window; policy</w:t>
+              <w:t xml:space="preserve">Validator link delay (netem)</w:t>
             </w:r>
           </w:p>
         </w:tc>
@@ -7698,7 +7716,7 @@
                 <w:sz w:val="15"/>
                 <w:szCs w:val="15"/>
               </w:rPr>
-              <w:t xml:space="preserve">5 s; class 0–1, trust ≥ 50</w:t>
+              <w:t xml:space="preserve">5 ms</w:t>
             </w:r>
           </w:p>
         </w:tc>
@@ -7713,6 +7731,81 @@
             <w:tcBorders>
               <w:top w:val="none" w:color="FFFFFF" w:sz="0"/>
               <w:left w:val="none" w:color="FFFFFF" w:sz="0"/>
+              <w:bottom w:val="none" w:color="FFFFFF" w:sz="0"/>
+              <w:right w:val="none" w:color="FFFFFF" w:sz="0"/>
+            </w:tcBorders>
+            <w:tcMar>
+              <w:top w:type="dxa" w:w="20"/>
+              <w:left w:type="dxa" w:w="40"/>
+              <w:bottom w:type="dxa" w:w="20"/>
+              <w:right w:type="dxa" w:w="40"/>
+            </w:tcMar>
+            <w:vAlign w:val="center"/>
+          </w:tcPr>
+          <w:p>
+            <w:pPr>
+              <w:keepNext/>
+              <w:spacing w:after="0" w:line="200"/>
+              <w:jc w:val="left"/>
+            </w:pPr>
+            <w:r>
+              <w:rPr>
+                <w:rFonts w:ascii="Times New Roman" w:cs="Times New Roman" w:eastAsia="Times New Roman" w:hAnsi="Times New Roman"/>
+                <w:b w:val="false"/>
+                <w:bCs w:val="false"/>
+                <w:sz w:val="15"/>
+                <w:szCs w:val="15"/>
+              </w:rPr>
+              <w:t xml:space="preserve">Freshness window; policy</w:t>
+            </w:r>
+          </w:p>
+        </w:tc>
+        <w:tc>
+          <w:tcPr>
+            <w:tcW w:type="dxa" w:w="2160"/>
+            <w:tcBorders>
+              <w:top w:val="none" w:color="FFFFFF" w:sz="0"/>
+              <w:left w:val="none" w:color="FFFFFF" w:sz="0"/>
+              <w:bottom w:val="none" w:color="FFFFFF" w:sz="0"/>
+              <w:right w:val="none" w:color="FFFFFF" w:sz="0"/>
+            </w:tcBorders>
+            <w:tcMar>
+              <w:top w:type="dxa" w:w="20"/>
+              <w:left w:type="dxa" w:w="40"/>
+              <w:bottom w:type="dxa" w:w="20"/>
+              <w:right w:type="dxa" w:w="40"/>
+            </w:tcMar>
+            <w:vAlign w:val="center"/>
+          </w:tcPr>
+          <w:p>
+            <w:pPr>
+              <w:keepNext/>
+              <w:spacing w:after="0" w:line="200"/>
+              <w:jc w:val="left"/>
+            </w:pPr>
+            <w:r>
+              <w:rPr>
+                <w:rFonts w:ascii="Times New Roman" w:cs="Times New Roman" w:eastAsia="Times New Roman" w:hAnsi="Times New Roman"/>
+                <w:b w:val="false"/>
+                <w:bCs w:val="false"/>
+                <w:sz w:val="15"/>
+                <w:szCs w:val="15"/>
+              </w:rPr>
+              <w:t xml:space="preserve">5 s; class 0–1, trust ≥ 50</w:t>
+            </w:r>
+          </w:p>
+        </w:tc>
+      </w:tr>
+      <w:tr>
+        <w:trPr>
+          <w:cantSplit/>
+        </w:trPr>
+        <w:tc>
+          <w:tcPr>
+            <w:tcW w:type="dxa" w:w="2700"/>
+            <w:tcBorders>
+              <w:top w:val="none" w:color="FFFFFF" w:sz="0"/>
+              <w:left w:val="none" w:color="FFFFFF" w:sz="0"/>
               <w:bottom w:val="single" w:color="000000" w:sz="4"/>
               <w:right w:val="none" w:color="FFFFFF" w:sz="0"/>
             </w:tcBorders>
@@ -7773,7 +7866,7 @@
                 <w:sz w:val="15"/>
                 <w:szCs w:val="15"/>
               </w:rPr>
-              <w:t xml:space="preserve">8 devices × 3 runs per system; TTL 10 s</w:t>
+              <w:t xml:space="preserve">8 devices × 5 runs per system; TTL 10 s</w:t>
             </w:r>
           </w:p>
         </w:tc>
@@ -7790,7 +7883,7 @@
           <w:sz w:val="14"/>
           <w:szCs w:val="14"/>
         </w:rPr>
-        <w:t xml:space="preserve">Only the PKI round trip is emulated; everything else is measured on running software.</w:t>
+        <w:t xml:space="preserve">Network delay is injected with tc netem on the directory and validator VMs only; everything else is measured on running software.</w:t>
       </w:r>
     </w:p>
     <w:p>
@@ -7821,7 +7914,56 @@
           <w:sz w:val="20"/>
           <w:szCs w:val="20"/>
         </w:rPr>
-        <w:t xml:space="preserve">(E1) End-to-end latency (mean, P95) from request send to decision, goodput (accepted requests per second), failures, and on-chain writes per second versus device count. (E2) Revocation enforcement delay: time from the revocation action until the PEP first denies the device. (E3) Security tests with 50 attempts each per run. (E4) Decision latency while the ledger is flooded with transactions. Also gas per operation and, from the micro-benchmark, confirmation latency and ledger throughput.</w:t>
+        <w:t xml:space="preserve">(E1) End-to-end latency (mean, P95) from request send to decision, goodput (accepted requests per second), failures, and on-chain writes per second versus device count. (E2) Revocation enforcement delay: time from the revocation action until the PEP first denies the device. (E3) Security tests with 50 attempts each per run. (E4) Decision latency while the ledger is flooded with transactions. (E5) Decision latency, goodput and revocation enforcement while one of the four validators is stopped. Also gas per operation and, from the micro-benchmark, confirmation latency and ledger throughput.</w:t>
+      </w:r>
+    </w:p>
+    <w:p>
+      <w:pPr>
+        <w:keepNext/>
+        <w:spacing w:after="30" w:before="60"/>
+        <w:jc w:val="left"/>
+      </w:pPr>
+      <w:r>
+        <w:rPr>
+          <w:rFonts w:ascii="Times New Roman" w:cs="Times New Roman" w:eastAsia="Times New Roman" w:hAnsi="Times New Roman"/>
+          <w:i/>
+          <w:iCs/>
+          <w:sz w:val="20"/>
+          <w:szCs w:val="20"/>
+        </w:rPr>
+        <w:t xml:space="preserve">G. Distributed Deployment</w:t>
+      </w:r>
+    </w:p>
+    <w:p>
+      <w:pPr>
+        <w:spacing w:after="60" w:before="0" w:line="228"/>
+        <w:jc w:val="both"/>
+      </w:pPr>
+      <w:r>
+        <w:rPr>
+          <w:rFonts w:ascii="Times New Roman" w:cs="Times New Roman" w:eastAsia="Times New Roman" w:hAnsi="Times New Roman"/>
+          <w:sz w:val="20"/>
+          <w:szCs w:val="20"/>
+        </w:rPr>
+        <w:t xml:space="preserve">The end-to-end experiments E1–E5 ran on Google Cloud (zone us-central1-a) on seven separate virtual machines in one VPC without external addresses: four Besu validators (e2-medium, 2 vCPU, 4 GB; one validator each), one PEP/PDP host (e2-standard-2), one directory server for B1 (e2-small) and one controller (e2-standard-2) that runs the load generator and the experiment scripts and submits the on-chain transactions. Linux </w:t>
+      </w:r>
+      <w:r>
+        <w:rPr>
+          <w:rFonts w:ascii="Times New Roman" w:cs="Times New Roman" w:eastAsia="Times New Roman" w:hAnsi="Times New Roman"/>
+          <w:i/>
+          <w:iCs/>
+          <w:sz w:val="20"/>
+          <w:szCs w:val="20"/>
+        </w:rPr>
+        <w:t xml:space="preserve">tc netem</w:t>
+      </w:r>
+      <w:r>
+        <w:rPr>
+          <w:rFonts w:ascii="Times New Roman" w:cs="Times New Roman" w:eastAsia="Times New Roman" w:hAnsi="Times New Roman"/>
+          <w:sz w:val="20"/>
+          <w:szCs w:val="20"/>
+        </w:rPr>
+        <w:t xml:space="preserve"> delays all outgoing traffic of each validator VM by 5 ms to represent a plant-local validator network, and the responses of the directory server by 40 ms to represent a remote central service; all other delay is the real VM-to-VM network delay. Each of the 5 repetitions started a freshly generated chain and restarted the PEP for every device count; the repetitions ran sequentially on the same VMs. The validator-failure test (E5) stops one validator container for 30 s while 50 devices are served. Cloud VMs in one zone approximate independent hosts better than a shared CI runner, but they are not an industrial network: devices are emulated by the load generator and co-tenancy in the cloud can add variance. The deployment scripts, configuration and raw results are available from the authors on request.</w:t>
       </w:r>
     </w:p>
     <w:p>
@@ -7868,7 +8010,7 @@
           <w:sz w:val="20"/>
           <w:szCs w:val="20"/>
         </w:rPr>
-        <w:t xml:space="preserve">Table 5 and Fig. 3 show end-to-end latency (mean of 3 runs). At 50 devices BC-ZTA answers in 7.4 ms on average (P95 22.3 ms), versus 48.2 ms for the centralised PKI-IAM, 4.4 ms for the ledger-free ABAC store and 10257 ms for the synchronous blockchain. BC-ZTA is therefore 85% faster than the centralised baseline, costs about 3.0 ms more than a local store (Merkle verification, hashing and audit bookkeeping), and is about 1381× faster than checking every request on-chain. Even at 10 devices, where the ledger is not saturated, the synchronous design needs 1426 ms because each request waits for a block.</w:t>
+        <w:t xml:space="preserve">Table 5 and Fig. 3 show end-to-end latency (mean of 5 runs). At 50 devices BC-ZTA answers in 5.4 ms on average (P95 6.2 ms), versus 49.1 ms for the centralised PKI-IAM, 5.2 ms for the ledger-free ABAC store and 1382 ms for the synchronous blockchain. BC-ZTA is therefore 89% faster than the centralised baseline, costs about 0.2 ms more than a local store (Merkle verification, hashing and audit bookkeeping), and is about 255× faster than checking every request on-chain. Even at 10 devices, where the ledger is not saturated, the synchronous design needs 1172 ms because each request waits for a block.</w:t>
       </w:r>
     </w:p>
     <w:p>
@@ -7883,7 +8025,7 @@
           <w:sz w:val="16"/>
           <w:szCs w:val="16"/>
         </w:rPr>
-        <w:t xml:space="preserve">TABLE 5. END-TO-END LATENCY (MS, MEAN OF 3 RUNS)</w:t>
+        <w:t xml:space="preserve">TABLE 5. END-TO-END LATENCY (MS, MEAN OF 5 RUNS)</w:t>
       </w:r>
     </w:p>
     <w:tbl>
@@ -8157,7 +8299,7 @@
                 <w:sz w:val="15"/>
                 <w:szCs w:val="15"/>
               </w:rPr>
-              <w:t xml:space="preserve">48.2</w:t>
+              <w:t xml:space="preserve">49.1</w:t>
             </w:r>
           </w:p>
         </w:tc>
@@ -8192,7 +8334,7 @@
                 <w:sz w:val="15"/>
                 <w:szCs w:val="15"/>
               </w:rPr>
-              <w:t xml:space="preserve">57.1</w:t>
+              <w:t xml:space="preserve">50.0</w:t>
             </w:r>
           </w:p>
         </w:tc>
@@ -8227,7 +8369,7 @@
                 <w:sz w:val="15"/>
                 <w:szCs w:val="15"/>
               </w:rPr>
-              <w:t xml:space="preserve">60.8</w:t>
+              <w:t xml:space="preserve">49.0</w:t>
             </w:r>
           </w:p>
         </w:tc>
@@ -8262,7 +8404,7 @@
                 <w:sz w:val="15"/>
                 <w:szCs w:val="15"/>
               </w:rPr>
-              <w:t xml:space="preserve">126.7</w:t>
+              <w:t xml:space="preserve">50.9</w:t>
             </w:r>
           </w:p>
         </w:tc>
@@ -8337,7 +8479,7 @@
                 <w:sz w:val="15"/>
                 <w:szCs w:val="15"/>
               </w:rPr>
-              <w:t xml:space="preserve">4.4</w:t>
+              <w:t xml:space="preserve">5.2</w:t>
             </w:r>
           </w:p>
         </w:tc>
@@ -8372,7 +8514,7 @@
                 <w:sz w:val="15"/>
                 <w:szCs w:val="15"/>
               </w:rPr>
-              <w:t xml:space="preserve">8.8</w:t>
+              <w:t xml:space="preserve">6.0</w:t>
             </w:r>
           </w:p>
         </w:tc>
@@ -8407,7 +8549,7 @@
                 <w:sz w:val="15"/>
                 <w:szCs w:val="15"/>
               </w:rPr>
-              <w:t xml:space="preserve">12.0</w:t>
+              <w:t xml:space="preserve">4.1</w:t>
             </w:r>
           </w:p>
         </w:tc>
@@ -8442,7 +8584,7 @@
                 <w:sz w:val="15"/>
                 <w:szCs w:val="15"/>
               </w:rPr>
-              <w:t xml:space="preserve">60.5</w:t>
+              <w:t xml:space="preserve">5.1</w:t>
             </w:r>
           </w:p>
         </w:tc>
@@ -8517,7 +8659,7 @@
                 <w:sz w:val="15"/>
                 <w:szCs w:val="15"/>
               </w:rPr>
-              <w:t xml:space="preserve">10257</w:t>
+              <w:t xml:space="preserve">1382</w:t>
             </w:r>
           </w:p>
         </w:tc>
@@ -8552,7 +8694,7 @@
                 <w:sz w:val="15"/>
                 <w:szCs w:val="15"/>
               </w:rPr>
-              <w:t xml:space="preserve">15847</w:t>
+              <w:t xml:space="preserve">2272</w:t>
             </w:r>
           </w:p>
         </w:tc>
@@ -8587,7 +8729,7 @@
                 <w:sz w:val="15"/>
                 <w:szCs w:val="15"/>
               </w:rPr>
-              <w:t xml:space="preserve">15047</w:t>
+              <w:t xml:space="preserve">12094</w:t>
             </w:r>
           </w:p>
         </w:tc>
@@ -8622,7 +8764,7 @@
                 <w:sz w:val="15"/>
                 <w:szCs w:val="15"/>
               </w:rPr>
-              <w:t xml:space="preserve">27169</w:t>
+              <w:t xml:space="preserve">20757</w:t>
             </w:r>
           </w:p>
         </w:tc>
@@ -8697,7 +8839,7 @@
                 <w:sz w:val="15"/>
                 <w:szCs w:val="15"/>
               </w:rPr>
-              <w:t xml:space="preserve">7.4</w:t>
+              <w:t xml:space="preserve">5.4</w:t>
             </w:r>
           </w:p>
         </w:tc>
@@ -8732,7 +8874,7 @@
                 <w:sz w:val="15"/>
                 <w:szCs w:val="15"/>
               </w:rPr>
-              <w:t xml:space="preserve">22.3</w:t>
+              <w:t xml:space="preserve">6.2</w:t>
             </w:r>
           </w:p>
         </w:tc>
@@ -8767,7 +8909,7 @@
                 <w:sz w:val="15"/>
                 <w:szCs w:val="15"/>
               </w:rPr>
-              <w:t xml:space="preserve">54.7</w:t>
+              <w:t xml:space="preserve">4.6</w:t>
             </w:r>
           </w:p>
         </w:tc>
@@ -8802,7 +8944,7 @@
                 <w:sz w:val="15"/>
                 <w:szCs w:val="15"/>
               </w:rPr>
-              <w:t xml:space="preserve">208.6</w:t>
+              <w:t xml:space="preserve">5.8</w:t>
             </w:r>
           </w:p>
         </w:tc>
@@ -8819,7 +8961,7 @@
           <w:sz w:val="14"/>
           <w:szCs w:val="14"/>
         </w:rPr>
-        <w:t xml:space="preserve">Columns give the number of devices; PKI-IAM includes an emulated 40 ms WAN round trip.</w:t>
+        <w:t xml:space="preserve">Columns give the number of devices; PKI-IAM responses are delayed by 40 ms (netem).</w:t>
       </w:r>
     </w:p>
     <w:p>
@@ -8833,7 +8975,7 @@
           <wp:inline distT="0" distB="0" distL="0" distR="0">
             <wp:extent cx="3067050" cy="2705100"/>
             <wp:effectExtent t="0" r="0" b="0" l="0"/>
-            <wp:docPr id="1" name="fig3_latency.png" descr="Fig. 3. Mean end-to-end latency versus number of devices (log scale; error bars: standard deviation of 3 runs)." title="Fig. 3. Mean end-to-end latency versus number of devices (log scale; error bars: standard deviation of 3 runs)."/>
+            <wp:docPr id="1" name="fig3_latency.png" descr="Fig. 3. Mean end-to-end latency versus number of devices (log scale; error bars: standard deviation of 5 runs)." title="Fig. 3. Mean end-to-end latency versus number of devices (log scale; error bars: standard deviation of 5 runs)."/>
             <wp:cNvGraphicFramePr>
               <a:graphicFrameLocks xmlns:a="http://schemas.openxmlformats.org/drawingml/2006/main" noChangeAspect="1"/>
             </wp:cNvGraphicFramePr>
@@ -8880,7 +9022,7 @@
           <w:sz w:val="16"/>
           <w:szCs w:val="16"/>
         </w:rPr>
-        <w:t xml:space="preserve">Fig. 3. Mean end-to-end latency versus number of devices (log scale; error bars: standard deviation of 3 runs).</w:t>
+        <w:t xml:space="preserve">Fig. 3. Mean end-to-end latency versus number of devices (log scale; error bars: standard deviation of 5 runs).</w:t>
       </w:r>
     </w:p>
     <w:p>
@@ -8929,7 +9071,7 @@
           <w:sz w:val="20"/>
           <w:szCs w:val="20"/>
         </w:rPr>
-        <w:t xml:space="preserve"> of 5.4 ms in the micro-benchmark. The PEP used 0.26 CPU cores at 50 devices and 0.59 at 200, against 0.53 for the local store. Every decision is covered by the audit batch: in the 200-device runs about 5,000 decisions per run were anchored in roughly 25 transactions. On-chain evaluation costs 44,685 gas as an estimate, but because it is a read, no fee or block wait is incurred.</w:t>
+        <w:t xml:space="preserve"> of 5.4 ms in the micro-benchmark. The PEP used 0.29 CPU cores at 50 devices and 0.65 at 200, against 0.53 for the local store. Every decision is covered by the audit batch: in the 200-device runs about 5,000 decisions per run were anchored in roughly 25 transactions. On-chain evaluation costs 44,685 gas as an estimate, but because it is a read, no fee or block wait is incurred.</w:t>
       </w:r>
     </w:p>
     <w:p>
@@ -8961,7 +9103,7 @@
           <w:sz w:val="20"/>
           <w:szCs w:val="20"/>
         </w:rPr>
-        <w:t xml:space="preserve">Table 6 summarises the Besu micro-benchmark. Write confirmation takes 1522 ms on average at 10 tx/s (P95 2439 ms), close to the 2 s block period; a transaction submitted just after a block, as in the phase-locked sequential tests S1/S5, waits about 1980 ms. Reads cost 5.4 ms (P95 10.9 ms). Committed throughput tracks the offered load up to 50 tx/s (46.5 tx/s) but saturates near 60 tx/s on this host: at 100 and 200 tx/s offered only 62.7 and 59.1 tx/s commit and 43% of transactions at 200 tx/s were not confirmed within 60 s. Batch anchoring at 1 tx/s confirmed all 60 anchors in 941 ms on average. Because all validators share one 2-vCPU host, 60 tx/s is a lower bound for a dedicated multi-server deployment.</w:t>
+        <w:t xml:space="preserve">Table 6 summarises the Besu micro-benchmark. Write confirmation takes 1522 ms on average at 10 tx/s (P95 2439 ms), close to the 2 s block period; a transaction submitted just after a block, as in the phase-locked sequential tests S1/S5, waits about 1980 ms. Reads cost 5.4 ms (P95 10.9 ms). Committed throughput tracks the offered load up to 50 tx/s (46.5 tx/s) but saturates near 60 tx/s on this host: at 100 and 200 tx/s offered only 62.7 and 59.1 tx/s commit and 43% of transactions at 200 tx/s were not confirmed within 60 s. Batch anchoring at 1 tx/s confirmed all 60 anchors in 941 ms on average. Because all validators share one 2-vCPU host, 60 tx/s is a lower bound: on the seven-VM deployment the synchronous baseline committed up to 112 tx/s (Section VI-E), almost twice as much.</w:t>
       </w:r>
     </w:p>
     <w:p>
@@ -8976,7 +9118,7 @@
           <w:sz w:val="16"/>
           <w:szCs w:val="16"/>
         </w:rPr>
-        <w:t xml:space="preserve">TABLE 6. MEASURED BESU RESULTS (3 RUNS, MEAN)</w:t>
+        <w:t xml:space="preserve">TABLE 6. MEASURED BESU RESULTS (SHARED CI HOST, 3 RUNS, MEAN)</w:t>
       </w:r>
     </w:p>
     <w:tbl>
@@ -10970,7 +11112,7 @@
           <w:sz w:val="20"/>
           <w:szCs w:val="20"/>
         </w:rPr>
-        <w:t xml:space="preserve">Fig. 4 shows goodput and on-chain write load against device count. Central PKI-IAM, ABAC and BC-ZTA served every request up to 200 devices with no failures, whereas the synchronous blockchain saturated: its goodput stopped at 47 req/s (37 req/s at 50 devices), only 74% of requests at 50 devices and 21% at 200 devices were answered in time, mean latency rose to 14.0 s and 2158 requests timed out at 200 devices. Its on-chain write rate (47 tx/s) is the measured ledger ceiling, whereas BC-ZTA writes about 1.0 tx/s regardless of the number of devices. At 200 devices all systems slow down because the PEP, the load generator and the four validators compete for two vCPUs: BC-ZTA reaches 55 ms mean (P95 209 ms) against 12 ms for the local store, so CPU rather than the ledger is its limit on this host. For comparison, a sharded design reaches 2,500 TPS at 700 nodes </w:t>
+        <w:t xml:space="preserve">Fig. 4 shows goodput and on-chain write load against device count. Central PKI-IAM, ABAC and BC-ZTA served every request up to 200 devices with no failures. The synchronous blockchain kept up to 50 devices (goodput 50 req/s, 1.4 s mean latency) and at 100 devices (100 req/s, 4.2 s), but at 200 devices only 40% of the requests were answered in time, goodput fell to 81 req/s and 4331 requests (summed over 5 runs) failed or timed out. Its on-chain write rate (100 tx/s at 100 and 112 tx/s at 200 devices) is the measured ledger ceiling of this deployment, whereas BC-ZTA writes about 1.0 tx/s regardless of the number of devices. The latency of BC-ZTA stays flat from 10 to 200 devices (5.4 to 4.6 ms mean, P95 at most 6.4 ms), and the PEP used 0.65 of its two vCPUs at 200 devices, so neither the ledger nor the PEP was the limit at this load; larger populations were not tested. For comparison, a sharded design reaches 2,500 TPS at 700 nodes </w:t>
       </w:r>
       <w:r>
         <w:rPr>
@@ -11079,7 +11221,7 @@
           <w:sz w:val="20"/>
           <w:szCs w:val="20"/>
         </w:rPr>
-        <w:t xml:space="preserve">Table 8 lists the security tests run against the BC-ZTA prototype (3 runs, 50 attempts per test and run). All legitimate requests were accepted (no false rejects), and none of the forged, replayed, stale, unregistered, tampered, class-violating or low-trust requests was accepted. For a revoked device, 0 requests were accepted after the revocation transaction was confirmed, and the first denial came 8 ms after confirmation or sooner. Fig. 5 shows the revocation enforcement delay of each system: with event-driven invalidation BC-ZTA enforces a revocation after 1.22 s on average (worst case 2.12 s), about one block period and independent of the TTL, whereas TTL-only refresh with a 10 s TTL needs 5.5 s on average (worst case 11.2 s). The centralised and local baselines revoke in 48 ms and 5 ms because they hold the state in one place; the blockchain-only value (2.03 s) includes the request that was in flight when the revocation was issued.</w:t>
+        <w:t xml:space="preserve">Table 8 lists the security tests run against the BC-ZTA prototype (5 runs, 50 attempts per test and run). All legitimate requests were accepted (no false rejects), and none of the forged, replayed, stale, unregistered, tampered, class-violating or low-trust requests was accepted. For a revoked device, 0 requests were accepted after the revocation transaction was confirmed, and the first denial came 15 ms after confirmation or sooner. Fig. 5 shows the revocation enforcement delay of each system: with event-driven invalidation BC-ZTA enforces a revocation after 1.25 s on average (worst case 2.23 s), about one block period and independent of the TTL, whereas TTL-only refresh with a 10 s TTL needs 6.6 s on average (worst case 11.5 s). The centralised and local baselines revoke in 57 ms and 22 ms because they hold the state in one place (the ABAC samples are bimodal, about 7 ms or 57 ms; we did not isolate the cause, which lies in the probe path rather than in the store); the blockchain-only value (1.35 s) includes the request that was in flight when the revocation was issued.</w:t>
       </w:r>
     </w:p>
     <w:p>
@@ -11094,7 +11236,7 @@
           <w:sz w:val="16"/>
           <w:szCs w:val="16"/>
         </w:rPr>
-        <w:t xml:space="preserve">TABLE 8. SECURITY TESTS ON THE BC-ZTA PROTOTYPE (3 RUNS)</w:t>
+        <w:t xml:space="preserve">TABLE 8. SECURITY TESTS ON THE BC-ZTA PROTOTYPE (5 RUNS)</w:t>
       </w:r>
     </w:p>
     <w:tbl>
@@ -11296,7 +11438,7 @@
                 <w:sz w:val="15"/>
                 <w:szCs w:val="15"/>
               </w:rPr>
-              <w:t xml:space="preserve">150</w:t>
+              <w:t xml:space="preserve">250</w:t>
             </w:r>
           </w:p>
         </w:tc>
@@ -11331,7 +11473,7 @@
                 <w:sz w:val="15"/>
                 <w:szCs w:val="15"/>
               </w:rPr>
-              <w:t xml:space="preserve">150</w:t>
+              <w:t xml:space="preserve">250</w:t>
             </w:r>
           </w:p>
         </w:tc>
@@ -11406,7 +11548,7 @@
                 <w:sz w:val="15"/>
                 <w:szCs w:val="15"/>
               </w:rPr>
-              <w:t xml:space="preserve">150</w:t>
+              <w:t xml:space="preserve">250</w:t>
             </w:r>
           </w:p>
         </w:tc>
@@ -11516,7 +11658,7 @@
                 <w:sz w:val="15"/>
                 <w:szCs w:val="15"/>
               </w:rPr>
-              <w:t xml:space="preserve">150</w:t>
+              <w:t xml:space="preserve">250</w:t>
             </w:r>
           </w:p>
         </w:tc>
@@ -11626,7 +11768,7 @@
                 <w:sz w:val="15"/>
                 <w:szCs w:val="15"/>
               </w:rPr>
-              <w:t xml:space="preserve">150</w:t>
+              <w:t xml:space="preserve">250</w:t>
             </w:r>
           </w:p>
         </w:tc>
@@ -11736,7 +11878,7 @@
                 <w:sz w:val="15"/>
                 <w:szCs w:val="15"/>
               </w:rPr>
-              <w:t xml:space="preserve">150</w:t>
+              <w:t xml:space="preserve">250</w:t>
             </w:r>
           </w:p>
         </w:tc>
@@ -11846,7 +11988,7 @@
                 <w:sz w:val="15"/>
                 <w:szCs w:val="15"/>
               </w:rPr>
-              <w:t xml:space="preserve">150</w:t>
+              <w:t xml:space="preserve">250</w:t>
             </w:r>
           </w:p>
         </w:tc>
@@ -11956,7 +12098,7 @@
                 <w:sz w:val="15"/>
                 <w:szCs w:val="15"/>
               </w:rPr>
-              <w:t xml:space="preserve">150</w:t>
+              <w:t xml:space="preserve">250</w:t>
             </w:r>
           </w:p>
         </w:tc>
@@ -12066,7 +12208,7 @@
                 <w:sz w:val="15"/>
                 <w:szCs w:val="15"/>
               </w:rPr>
-              <w:t xml:space="preserve">150</w:t>
+              <w:t xml:space="preserve">250</w:t>
             </w:r>
           </w:p>
         </w:tc>
@@ -12196,11 +12338,12 @@
           <w:sz w:val="20"/>
           <w:szCs w:val="20"/>
         </w:rPr>
-        <w:t xml:space="preserve">G. Comparison with Baselines</w:t>
-      </w:r>
-    </w:p>
-    <w:p>
-      <w:pPr>
+        <w:t xml:space="preserve">G. Availability under Validator Failure and Ledger Flooding</w:t>
+      </w:r>
+    </w:p>
+    <w:p>
+      <w:pPr>
+        <w:keepNext/>
         <w:spacing w:after="60" w:before="0" w:line="228"/>
         <w:jc w:val="both"/>
       </w:pPr>
@@ -12210,23 +12353,537 @@
           <w:sz w:val="20"/>
           <w:szCs w:val="20"/>
         </w:rPr>
-        <w:t xml:space="preserve">BC-ZTA is 3.0 ms slower than a ledger-free ABAC store at 50 devices but adds decentralised identity, shared policy and tamper-evident anchored audit that B2 lacks; against the centralised PKI-IAM it is 85% faster at 50 devices (with an emulated 40 ms WAN) and removes the central directory; and against the synchronous blockchain it avoids ~10.3 s per decision at 50 devices and the ledger ceiling. Its price is revocation latency: about 1.2 s with events (one block) instead of milliseconds for a central store. A reported Ethereum-based framework pays about 25 ms extra per request even at small scale </w:t>
-      </w:r>
-      <w:r>
-        <w:rPr>
-          <w:rFonts w:ascii="Times New Roman" w:cs="Times New Roman" w:eastAsia="Times New Roman" w:hAnsi="Times New Roman"/>
-          <w:sz w:val="20"/>
-          <w:szCs w:val="20"/>
-        </w:rPr>
-        <w:t xml:space="preserve">[17]</w:t>
-      </w:r>
-      <w:r>
-        <w:rPr>
-          <w:rFonts w:ascii="Times New Roman" w:cs="Times New Roman" w:eastAsia="Times New Roman" w:hAnsi="Times New Roman"/>
-          <w:sz w:val="20"/>
-          <w:szCs w:val="20"/>
-        </w:rPr>
-        <w:t xml:space="preserve">, consistent with our finding that on-path consensus is the bottleneck.</w:t>
+        <w:t xml:space="preserve">E5 stops one of the four validators for 30 s while 50 devices are served and one device is revoked during the outage. IBFT 2.0 with four validators tolerates </w:t>
+      </w:r>
+      <w:r>
+        <w:rPr>
+          <w:rFonts w:ascii="Times New Roman" w:cs="Times New Roman" w:eastAsia="Times New Roman" w:hAnsi="Times New Roman"/>
+          <w:i/>
+          <w:iCs/>
+          <w:sz w:val="20"/>
+          <w:szCs w:val="20"/>
+        </w:rPr>
+        <w:t xml:space="preserve">f</w:t>
+      </w:r>
+      <w:r>
+        <w:rPr>
+          <w:rFonts w:ascii="Times New Roman" w:cs="Times New Roman" w:eastAsia="Times New Roman" w:hAnsi="Times New Roman"/>
+          <w:sz w:val="20"/>
+          <w:szCs w:val="20"/>
+        </w:rPr>
+        <w:t xml:space="preserve"> = 1 faulty validator and the PEP decides from its cache, so decisions should be unaffected. Table 9 confirms this: all 3500 requests were answered and accepted (mean 5.4 ms, P95 6.8 ms, none late or failed), the revoked device was denied 1.76 s after the revocation was submitted, and the PEP kept anchoring audit batches (73 of 75 anchor transactions were confirmed when the statistics were read). Only one failure of one validator for 30 s was tested; network partitions, Byzantine validators and the loss of two validators were not.</w:t>
+      </w:r>
+    </w:p>
+    <w:p>
+      <w:pPr>
+        <w:keepNext/>
+        <w:spacing w:after="30" w:before="60"/>
+        <w:jc w:val="center"/>
+      </w:pPr>
+      <w:r>
+        <w:rPr>
+          <w:rFonts w:ascii="Times New Roman" w:cs="Times New Roman" w:eastAsia="Times New Roman" w:hAnsi="Times New Roman"/>
+          <w:sz w:val="16"/>
+          <w:szCs w:val="16"/>
+        </w:rPr>
+        <w:t xml:space="preserve">TABLE 9. VALIDATOR-FAILURE TEST (E5, ONE RUN)</w:t>
+      </w:r>
+    </w:p>
+    <w:tbl>
+      <w:tblPr>
+        <w:tblW w:type="dxa" w:w="4860"/>
+        <w:tblBorders>
+          <w:top w:val="single" w:color="auto" w:sz="4"/>
+          <w:left w:val="single" w:color="auto" w:sz="4"/>
+          <w:bottom w:val="single" w:color="auto" w:sz="4"/>
+          <w:right w:val="single" w:color="auto" w:sz="4"/>
+          <w:insideH w:val="single" w:color="auto" w:sz="4"/>
+          <w:insideV w:val="single" w:color="auto" w:sz="4"/>
+        </w:tblBorders>
+        <w:tblLayout w:type="fixed"/>
+      </w:tblPr>
+      <w:tblGrid>
+        <w:gridCol w:w="3160"/>
+        <w:gridCol w:w="1700"/>
+      </w:tblGrid>
+      <w:tr>
+        <w:trPr>
+          <w:cantSplit/>
+          <w:tblHeader/>
+        </w:trPr>
+        <w:tc>
+          <w:tcPr>
+            <w:tcW w:type="dxa" w:w="3160"/>
+            <w:tcBorders>
+              <w:top w:val="single" w:color="000000" w:sz="4"/>
+              <w:left w:val="none" w:color="FFFFFF" w:sz="0"/>
+              <w:bottom w:val="single" w:color="000000" w:sz="4"/>
+              <w:right w:val="none" w:color="FFFFFF" w:sz="0"/>
+            </w:tcBorders>
+            <w:tcMar>
+              <w:top w:type="dxa" w:w="20"/>
+              <w:left w:type="dxa" w:w="40"/>
+              <w:bottom w:type="dxa" w:w="20"/>
+              <w:right w:type="dxa" w:w="40"/>
+            </w:tcMar>
+            <w:vAlign w:val="center"/>
+          </w:tcPr>
+          <w:p>
+            <w:pPr>
+              <w:keepNext/>
+              <w:spacing w:after="0" w:line="200"/>
+              <w:jc w:val="left"/>
+            </w:pPr>
+            <w:r>
+              <w:rPr>
+                <w:rFonts w:ascii="Times New Roman" w:cs="Times New Roman" w:eastAsia="Times New Roman" w:hAnsi="Times New Roman"/>
+                <w:b/>
+                <w:bCs/>
+                <w:sz w:val="15"/>
+                <w:szCs w:val="15"/>
+              </w:rPr>
+              <w:t xml:space="preserve">Measure</w:t>
+            </w:r>
+          </w:p>
+        </w:tc>
+        <w:tc>
+          <w:tcPr>
+            <w:tcW w:type="dxa" w:w="1700"/>
+            <w:tcBorders>
+              <w:top w:val="single" w:color="000000" w:sz="4"/>
+              <w:left w:val="none" w:color="FFFFFF" w:sz="0"/>
+              <w:bottom w:val="single" w:color="000000" w:sz="4"/>
+              <w:right w:val="none" w:color="FFFFFF" w:sz="0"/>
+            </w:tcBorders>
+            <w:tcMar>
+              <w:top w:type="dxa" w:w="20"/>
+              <w:left w:type="dxa" w:w="40"/>
+              <w:bottom w:type="dxa" w:w="20"/>
+              <w:right w:type="dxa" w:w="40"/>
+            </w:tcMar>
+            <w:vAlign w:val="center"/>
+          </w:tcPr>
+          <w:p>
+            <w:pPr>
+              <w:keepNext/>
+              <w:spacing w:after="0" w:line="200"/>
+              <w:jc w:val="left"/>
+            </w:pPr>
+            <w:r>
+              <w:rPr>
+                <w:rFonts w:ascii="Times New Roman" w:cs="Times New Roman" w:eastAsia="Times New Roman" w:hAnsi="Times New Roman"/>
+                <w:b/>
+                <w:bCs/>
+                <w:sz w:val="15"/>
+                <w:szCs w:val="15"/>
+              </w:rPr>
+              <w:t xml:space="preserve">Value</w:t>
+            </w:r>
+          </w:p>
+        </w:tc>
+      </w:tr>
+      <w:tr>
+        <w:trPr>
+          <w:cantSplit/>
+        </w:trPr>
+        <w:tc>
+          <w:tcPr>
+            <w:tcW w:type="dxa" w:w="3160"/>
+            <w:tcBorders>
+              <w:top w:val="none" w:color="FFFFFF" w:sz="0"/>
+              <w:left w:val="none" w:color="FFFFFF" w:sz="0"/>
+              <w:bottom w:val="none" w:color="FFFFFF" w:sz="0"/>
+              <w:right w:val="none" w:color="FFFFFF" w:sz="0"/>
+            </w:tcBorders>
+            <w:tcMar>
+              <w:top w:type="dxa" w:w="20"/>
+              <w:left w:type="dxa" w:w="40"/>
+              <w:bottom w:type="dxa" w:w="20"/>
+              <w:right w:type="dxa" w:w="40"/>
+            </w:tcMar>
+            <w:vAlign w:val="center"/>
+          </w:tcPr>
+          <w:p>
+            <w:pPr>
+              <w:keepNext/>
+              <w:spacing w:after="0" w:line="200"/>
+              <w:jc w:val="left"/>
+            </w:pPr>
+            <w:r>
+              <w:rPr>
+                <w:rFonts w:ascii="Times New Roman" w:cs="Times New Roman" w:eastAsia="Times New Roman" w:hAnsi="Times New Roman"/>
+                <w:b w:val="false"/>
+                <w:bCs w:val="false"/>
+                <w:sz w:val="15"/>
+                <w:szCs w:val="15"/>
+              </w:rPr>
+              <w:t xml:space="preserve">Requests answered / accepted</w:t>
+            </w:r>
+          </w:p>
+        </w:tc>
+        <w:tc>
+          <w:tcPr>
+            <w:tcW w:type="dxa" w:w="1700"/>
+            <w:tcBorders>
+              <w:top w:val="none" w:color="FFFFFF" w:sz="0"/>
+              <w:left w:val="none" w:color="FFFFFF" w:sz="0"/>
+              <w:bottom w:val="none" w:color="FFFFFF" w:sz="0"/>
+              <w:right w:val="none" w:color="FFFFFF" w:sz="0"/>
+            </w:tcBorders>
+            <w:tcMar>
+              <w:top w:type="dxa" w:w="20"/>
+              <w:left w:type="dxa" w:w="40"/>
+              <w:bottom w:type="dxa" w:w="20"/>
+              <w:right w:type="dxa" w:w="40"/>
+            </w:tcMar>
+            <w:vAlign w:val="center"/>
+          </w:tcPr>
+          <w:p>
+            <w:pPr>
+              <w:keepNext/>
+              <w:spacing w:after="0" w:line="200"/>
+              <w:jc w:val="left"/>
+            </w:pPr>
+            <w:r>
+              <w:rPr>
+                <w:rFonts w:ascii="Times New Roman" w:cs="Times New Roman" w:eastAsia="Times New Roman" w:hAnsi="Times New Roman"/>
+                <w:b w:val="false"/>
+                <w:bCs w:val="false"/>
+                <w:sz w:val="15"/>
+                <w:szCs w:val="15"/>
+              </w:rPr>
+              <w:t xml:space="preserve">3500 / 3500</w:t>
+            </w:r>
+          </w:p>
+        </w:tc>
+      </w:tr>
+      <w:tr>
+        <w:trPr>
+          <w:cantSplit/>
+        </w:trPr>
+        <w:tc>
+          <w:tcPr>
+            <w:tcW w:type="dxa" w:w="3160"/>
+            <w:tcBorders>
+              <w:top w:val="none" w:color="FFFFFF" w:sz="0"/>
+              <w:left w:val="none" w:color="FFFFFF" w:sz="0"/>
+              <w:bottom w:val="none" w:color="FFFFFF" w:sz="0"/>
+              <w:right w:val="none" w:color="FFFFFF" w:sz="0"/>
+            </w:tcBorders>
+            <w:tcMar>
+              <w:top w:type="dxa" w:w="20"/>
+              <w:left w:type="dxa" w:w="40"/>
+              <w:bottom w:type="dxa" w:w="20"/>
+              <w:right w:type="dxa" w:w="40"/>
+            </w:tcMar>
+            <w:vAlign w:val="center"/>
+          </w:tcPr>
+          <w:p>
+            <w:pPr>
+              <w:keepNext/>
+              <w:spacing w:after="0" w:line="200"/>
+              <w:jc w:val="left"/>
+            </w:pPr>
+            <w:r>
+              <w:rPr>
+                <w:rFonts w:ascii="Times New Roman" w:cs="Times New Roman" w:eastAsia="Times New Roman" w:hAnsi="Times New Roman"/>
+                <w:b w:val="false"/>
+                <w:bCs w:val="false"/>
+                <w:sz w:val="15"/>
+                <w:szCs w:val="15"/>
+              </w:rPr>
+              <w:t xml:space="preserve">Mean / P95 latency (ms)</w:t>
+            </w:r>
+          </w:p>
+        </w:tc>
+        <w:tc>
+          <w:tcPr>
+            <w:tcW w:type="dxa" w:w="1700"/>
+            <w:tcBorders>
+              <w:top w:val="none" w:color="FFFFFF" w:sz="0"/>
+              <w:left w:val="none" w:color="FFFFFF" w:sz="0"/>
+              <w:bottom w:val="none" w:color="FFFFFF" w:sz="0"/>
+              <w:right w:val="none" w:color="FFFFFF" w:sz="0"/>
+            </w:tcBorders>
+            <w:tcMar>
+              <w:top w:type="dxa" w:w="20"/>
+              <w:left w:type="dxa" w:w="40"/>
+              <w:bottom w:type="dxa" w:w="20"/>
+              <w:right w:type="dxa" w:w="40"/>
+            </w:tcMar>
+            <w:vAlign w:val="center"/>
+          </w:tcPr>
+          <w:p>
+            <w:pPr>
+              <w:keepNext/>
+              <w:spacing w:after="0" w:line="200"/>
+              <w:jc w:val="left"/>
+            </w:pPr>
+            <w:r>
+              <w:rPr>
+                <w:rFonts w:ascii="Times New Roman" w:cs="Times New Roman" w:eastAsia="Times New Roman" w:hAnsi="Times New Roman"/>
+                <w:b w:val="false"/>
+                <w:bCs w:val="false"/>
+                <w:sz w:val="15"/>
+                <w:szCs w:val="15"/>
+              </w:rPr>
+              <w:t xml:space="preserve">5.4 / 6.8</w:t>
+            </w:r>
+          </w:p>
+        </w:tc>
+      </w:tr>
+      <w:tr>
+        <w:trPr>
+          <w:cantSplit/>
+        </w:trPr>
+        <w:tc>
+          <w:tcPr>
+            <w:tcW w:type="dxa" w:w="3160"/>
+            <w:tcBorders>
+              <w:top w:val="none" w:color="FFFFFF" w:sz="0"/>
+              <w:left w:val="none" w:color="FFFFFF" w:sz="0"/>
+              <w:bottom w:val="none" w:color="FFFFFF" w:sz="0"/>
+              <w:right w:val="none" w:color="FFFFFF" w:sz="0"/>
+            </w:tcBorders>
+            <w:tcMar>
+              <w:top w:type="dxa" w:w="20"/>
+              <w:left w:type="dxa" w:w="40"/>
+              <w:bottom w:type="dxa" w:w="20"/>
+              <w:right w:type="dxa" w:w="40"/>
+            </w:tcMar>
+            <w:vAlign w:val="center"/>
+          </w:tcPr>
+          <w:p>
+            <w:pPr>
+              <w:keepNext/>
+              <w:spacing w:after="0" w:line="200"/>
+              <w:jc w:val="left"/>
+            </w:pPr>
+            <w:r>
+              <w:rPr>
+                <w:rFonts w:ascii="Times New Roman" w:cs="Times New Roman" w:eastAsia="Times New Roman" w:hAnsi="Times New Roman"/>
+                <w:b w:val="false"/>
+                <w:bCs w:val="false"/>
+                <w:sz w:val="15"/>
+                <w:szCs w:val="15"/>
+              </w:rPr>
+              <w:t xml:space="preserve">Late or failed requests</w:t>
+            </w:r>
+          </w:p>
+        </w:tc>
+        <w:tc>
+          <w:tcPr>
+            <w:tcW w:type="dxa" w:w="1700"/>
+            <w:tcBorders>
+              <w:top w:val="none" w:color="FFFFFF" w:sz="0"/>
+              <w:left w:val="none" w:color="FFFFFF" w:sz="0"/>
+              <w:bottom w:val="none" w:color="FFFFFF" w:sz="0"/>
+              <w:right w:val="none" w:color="FFFFFF" w:sz="0"/>
+            </w:tcBorders>
+            <w:tcMar>
+              <w:top w:type="dxa" w:w="20"/>
+              <w:left w:type="dxa" w:w="40"/>
+              <w:bottom w:type="dxa" w:w="20"/>
+              <w:right w:type="dxa" w:w="40"/>
+            </w:tcMar>
+            <w:vAlign w:val="center"/>
+          </w:tcPr>
+          <w:p>
+            <w:pPr>
+              <w:keepNext/>
+              <w:spacing w:after="0" w:line="200"/>
+              <w:jc w:val="left"/>
+            </w:pPr>
+            <w:r>
+              <w:rPr>
+                <w:rFonts w:ascii="Times New Roman" w:cs="Times New Roman" w:eastAsia="Times New Roman" w:hAnsi="Times New Roman"/>
+                <w:b w:val="false"/>
+                <w:bCs w:val="false"/>
+                <w:sz w:val="15"/>
+                <w:szCs w:val="15"/>
+              </w:rPr>
+              <w:t xml:space="preserve">0 / 0</w:t>
+            </w:r>
+          </w:p>
+        </w:tc>
+      </w:tr>
+      <w:tr>
+        <w:trPr>
+          <w:cantSplit/>
+        </w:trPr>
+        <w:tc>
+          <w:tcPr>
+            <w:tcW w:type="dxa" w:w="3160"/>
+            <w:tcBorders>
+              <w:top w:val="none" w:color="FFFFFF" w:sz="0"/>
+              <w:left w:val="none" w:color="FFFFFF" w:sz="0"/>
+              <w:bottom w:val="none" w:color="FFFFFF" w:sz="0"/>
+              <w:right w:val="none" w:color="FFFFFF" w:sz="0"/>
+            </w:tcBorders>
+            <w:tcMar>
+              <w:top w:type="dxa" w:w="20"/>
+              <w:left w:type="dxa" w:w="40"/>
+              <w:bottom w:type="dxa" w:w="20"/>
+              <w:right w:type="dxa" w:w="40"/>
+            </w:tcMar>
+            <w:vAlign w:val="center"/>
+          </w:tcPr>
+          <w:p>
+            <w:pPr>
+              <w:keepNext/>
+              <w:spacing w:after="0" w:line="200"/>
+              <w:jc w:val="left"/>
+            </w:pPr>
+            <w:r>
+              <w:rPr>
+                <w:rFonts w:ascii="Times New Roman" w:cs="Times New Roman" w:eastAsia="Times New Roman" w:hAnsi="Times New Roman"/>
+                <w:b w:val="false"/>
+                <w:bCs w:val="false"/>
+                <w:sz w:val="15"/>
+                <w:szCs w:val="15"/>
+              </w:rPr>
+              <w:t xml:space="preserve">Revocation enforced (s)</w:t>
+            </w:r>
+          </w:p>
+        </w:tc>
+        <w:tc>
+          <w:tcPr>
+            <w:tcW w:type="dxa" w:w="1700"/>
+            <w:tcBorders>
+              <w:top w:val="none" w:color="FFFFFF" w:sz="0"/>
+              <w:left w:val="none" w:color="FFFFFF" w:sz="0"/>
+              <w:bottom w:val="none" w:color="FFFFFF" w:sz="0"/>
+              <w:right w:val="none" w:color="FFFFFF" w:sz="0"/>
+            </w:tcBorders>
+            <w:tcMar>
+              <w:top w:type="dxa" w:w="20"/>
+              <w:left w:type="dxa" w:w="40"/>
+              <w:bottom w:type="dxa" w:w="20"/>
+              <w:right w:type="dxa" w:w="40"/>
+            </w:tcMar>
+            <w:vAlign w:val="center"/>
+          </w:tcPr>
+          <w:p>
+            <w:pPr>
+              <w:keepNext/>
+              <w:spacing w:after="0" w:line="200"/>
+              <w:jc w:val="left"/>
+            </w:pPr>
+            <w:r>
+              <w:rPr>
+                <w:rFonts w:ascii="Times New Roman" w:cs="Times New Roman" w:eastAsia="Times New Roman" w:hAnsi="Times New Roman"/>
+                <w:b w:val="false"/>
+                <w:bCs w:val="false"/>
+                <w:sz w:val="15"/>
+                <w:szCs w:val="15"/>
+              </w:rPr>
+              <w:t xml:space="preserve">1.76</w:t>
+            </w:r>
+          </w:p>
+        </w:tc>
+      </w:tr>
+      <w:tr>
+        <w:trPr>
+          <w:cantSplit/>
+        </w:trPr>
+        <w:tc>
+          <w:tcPr>
+            <w:tcW w:type="dxa" w:w="3160"/>
+            <w:tcBorders>
+              <w:top w:val="none" w:color="FFFFFF" w:sz="0"/>
+              <w:left w:val="none" w:color="FFFFFF" w:sz="0"/>
+              <w:bottom w:val="single" w:color="000000" w:sz="4"/>
+              <w:right w:val="none" w:color="FFFFFF" w:sz="0"/>
+            </w:tcBorders>
+            <w:tcMar>
+              <w:top w:type="dxa" w:w="20"/>
+              <w:left w:type="dxa" w:w="40"/>
+              <w:bottom w:type="dxa" w:w="20"/>
+              <w:right w:type="dxa" w:w="40"/>
+            </w:tcMar>
+            <w:vAlign w:val="center"/>
+          </w:tcPr>
+          <w:p>
+            <w:pPr>
+              <w:keepNext/>
+              <w:spacing w:after="0" w:line="200"/>
+              <w:jc w:val="left"/>
+            </w:pPr>
+            <w:r>
+              <w:rPr>
+                <w:rFonts w:ascii="Times New Roman" w:cs="Times New Roman" w:eastAsia="Times New Roman" w:hAnsi="Times New Roman"/>
+                <w:b w:val="false"/>
+                <w:bCs w:val="false"/>
+                <w:sz w:val="15"/>
+                <w:szCs w:val="15"/>
+              </w:rPr>
+              <w:t xml:space="preserve">Anchors sent / confirmed</w:t>
+            </w:r>
+          </w:p>
+        </w:tc>
+        <w:tc>
+          <w:tcPr>
+            <w:tcW w:type="dxa" w:w="1700"/>
+            <w:tcBorders>
+              <w:top w:val="none" w:color="FFFFFF" w:sz="0"/>
+              <w:left w:val="none" w:color="FFFFFF" w:sz="0"/>
+              <w:bottom w:val="single" w:color="000000" w:sz="4"/>
+              <w:right w:val="none" w:color="FFFFFF" w:sz="0"/>
+            </w:tcBorders>
+            <w:tcMar>
+              <w:top w:type="dxa" w:w="20"/>
+              <w:left w:type="dxa" w:w="40"/>
+              <w:bottom w:type="dxa" w:w="20"/>
+              <w:right w:type="dxa" w:w="40"/>
+            </w:tcMar>
+            <w:vAlign w:val="center"/>
+          </w:tcPr>
+          <w:p>
+            <w:pPr>
+              <w:keepNext/>
+              <w:spacing w:after="0" w:line="200"/>
+              <w:jc w:val="left"/>
+            </w:pPr>
+            <w:r>
+              <w:rPr>
+                <w:rFonts w:ascii="Times New Roman" w:cs="Times New Roman" w:eastAsia="Times New Roman" w:hAnsi="Times New Roman"/>
+                <w:b w:val="false"/>
+                <w:bCs w:val="false"/>
+                <w:sz w:val="15"/>
+                <w:szCs w:val="15"/>
+              </w:rPr>
+              <w:t xml:space="preserve">75 / 73</w:t>
+            </w:r>
+          </w:p>
+        </w:tc>
+      </w:tr>
+    </w:tbl>
+    <w:p>
+      <w:pPr>
+        <w:spacing w:after="80" w:before="20"/>
+        <w:jc w:val="both"/>
+      </w:pPr>
+      <w:r>
+        <w:rPr>
+          <w:rFonts w:ascii="Times New Roman" w:cs="Times New Roman" w:eastAsia="Times New Roman" w:hAnsi="Times New Roman"/>
+          <w:sz w:val="14"/>
+          <w:szCs w:val="14"/>
+        </w:rPr>
+        <w:t xml:space="preserve">One of four validators stopped for 30 s of a 70 s window; 50 devices at 1 req/s.</w:t>
+      </w:r>
+    </w:p>
+    <w:p>
+      <w:pPr>
+        <w:spacing w:after="60" w:before="0" w:line="228"/>
+        <w:jc w:val="both"/>
+      </w:pPr>
+      <w:r>
+        <w:rPr>
+          <w:rFonts w:ascii="Times New Roman" w:cs="Times New Roman" w:eastAsia="Times New Roman" w:hAnsi="Times New Roman"/>
+          <w:sz w:val="20"/>
+          <w:szCs w:val="20"/>
+        </w:rPr>
+        <w:t xml:space="preserve">In E4 the ledger is flooded with 200 tx/s of audit-log transactions for 35 s while 50 devices are served. Besu accepted 3166 to 7000 of the 7000 flood transactions per run and rejected the rest (presumably a full transaction pool), so the accepted flood rate was 90 to 200 tx/s. In all 5 runs the PEP answered every request (success 100%), with mean latency 4.9–5.1 ms against 5.0–5.4 ms with an idle ledger. This is the intended effect of keeping the ledger off the request path. On the shared CI host the same flood had caused request failures, which we attribute to CPU contention between the PEP and the flooded validators and which the separate hosts removed.</w:t>
       </w:r>
     </w:p>
     <w:p>
@@ -12243,7 +12900,7 @@
           <w:sz w:val="20"/>
           <w:szCs w:val="20"/>
         </w:rPr>
-        <w:t xml:space="preserve">H. Discussion and Limitations</w:t>
+        <w:t xml:space="preserve">H. Comparison with Baselines</w:t>
       </w:r>
     </w:p>
     <w:p>
@@ -12257,7 +12914,54 @@
           <w:sz w:val="20"/>
           <w:szCs w:val="20"/>
         </w:rPr>
-        <w:t xml:space="preserve">The key trade-off is bounded revocation staleness for latency. Limitations: (i) all four validators, the PEP and the load generator ran on one shared 2-vCPU CI host, so absolute latencies and throughput are not representative of a multi-server plant and validator network delay is not captured; (ii) the WAN delay of the PKI baseline is emulated, and the baselines are simple re-implementations, not production IAM products; (iii) the device population is emulated: no physical devices, industrial protocols or secure elements were used; (iv) one plant authority key issues registrations and revocations, so authority compromise is out of scope; (v) in the flooding test (E4), when 200 tx/s were sent to Besu while 50 devices were served, BC-ZTA success fell to 55–94% (mean latency 1192–8323 ms, against 4.3 ms without flooding), and every failure was a request rejected as stale; we attribute this to CPU starvation of the PEP by the flooded validators on the shared host, so the test does not demonstrate availability under ledger congestion, which needs separate hosts; and (vi) trust scores are voted values, not yet learned from data. Comparisons with published numbers are indicative only, since workloads and testbeds differ.</w:t>
+        <w:t xml:space="preserve">BC-ZTA is 0.2 ms slower than a ledger-free ABAC store at 50 devices but adds decentralised identity, shared policy and tamper-evident anchored audit that B2 lacks; against the centralised PKI-IAM it is 89% faster at 50 devices (with a 40 ms netem delay on the directory server) and removes the central directory; and against the synchronous blockchain it avoids ~1.4 s per decision at 50 devices and the ledger ceiling. Its price is revocation latency: about 1.3 s with events (one block) instead of milliseconds for a central store. A reported Ethereum-based framework pays about 25 ms extra per request even at small scale </w:t>
+      </w:r>
+      <w:r>
+        <w:rPr>
+          <w:rFonts w:ascii="Times New Roman" w:cs="Times New Roman" w:eastAsia="Times New Roman" w:hAnsi="Times New Roman"/>
+          <w:sz w:val="20"/>
+          <w:szCs w:val="20"/>
+        </w:rPr>
+        <w:t xml:space="preserve">[17]</w:t>
+      </w:r>
+      <w:r>
+        <w:rPr>
+          <w:rFonts w:ascii="Times New Roman" w:cs="Times New Roman" w:eastAsia="Times New Roman" w:hAnsi="Times New Roman"/>
+          <w:sz w:val="20"/>
+          <w:szCs w:val="20"/>
+        </w:rPr>
+        <w:t xml:space="preserve">, consistent with our finding that on-path consensus is the bottleneck.</w:t>
+      </w:r>
+    </w:p>
+    <w:p>
+      <w:pPr>
+        <w:keepNext/>
+        <w:spacing w:after="30" w:before="60"/>
+        <w:jc w:val="left"/>
+      </w:pPr>
+      <w:r>
+        <w:rPr>
+          <w:rFonts w:ascii="Times New Roman" w:cs="Times New Roman" w:eastAsia="Times New Roman" w:hAnsi="Times New Roman"/>
+          <w:i/>
+          <w:iCs/>
+          <w:sz w:val="20"/>
+          <w:szCs w:val="20"/>
+        </w:rPr>
+        <w:t xml:space="preserve">I. Discussion and Limitations</w:t>
+      </w:r>
+    </w:p>
+    <w:p>
+      <w:pPr>
+        <w:spacing w:after="60" w:before="0" w:line="228"/>
+        <w:jc w:val="both"/>
+      </w:pPr>
+      <w:r>
+        <w:rPr>
+          <w:rFonts w:ascii="Times New Roman" w:cs="Times New Roman" w:eastAsia="Times New Roman" w:hAnsi="Times New Roman"/>
+          <w:sz w:val="20"/>
+          <w:szCs w:val="20"/>
+        </w:rPr>
+        <w:t xml:space="preserve">The key trade-off is bounded revocation staleness for latency. Limitations: (i) the seven VMs sit in one zone of one cloud provider, so inter-VM delay is that of a data-centre network plus the injected netem delays, not a plant network or a WAN, and absolute latencies and throughput are specific to these VM sizes; (ii) the baselines are simple re-implementations (the directory is a minimal HTTP service with an injected delay), not production IAM products such as LDAP or Keycloak; (iii) the device population is emulated by a load generator with up to 200 devices at 1 request/s: no physical devices, industrial protocols, secure elements, larger populations or bursty and churn-heavy workloads were used; (iv) one plant authority key issues registrations and revocations, so authority compromise is out of scope; (v) the availability tests are limited: the E4 flood was partly rejected by Besu (an accepted rate of 90–200 tx/s) and E5 stops one validator once for 30 s, with no network partition or Byzantine validator; (vi) each experiment has five repetitions on the same VMs, and the revocation tests use 8 devices per run; and (vii) trust scores are voted values, not yet learned from data. Comparisons with published numbers are indicative only, since workloads and testbeds differ.</w:t>
       </w:r>
     </w:p>
     <w:p>
@@ -12300,7 +13004,7 @@
           <w:sz w:val="20"/>
           <w:szCs w:val="20"/>
         </w:rPr>
-        <w:t xml:space="preserve">We presented BC-ZTA, a blockchain-assisted zero-trust architecture that keeps consensus off the per-request path through edge-cached, Merkle-verified state and asynchronous batched anchoring. Four Solidity contracts pass 15 unit tests, and measured gas shows batch anchoring is about 1351× cheaper per record than per-event logging. In end-to-end tests on a four-validator Besu network, BC-ZTA decided in 7.4 ms on average at 50 devices and served 200 devices without failures with about one on-chain write per second, while the synchronous design needed 10.3 s and saturated at about 47 requests per second; the price is a revocation delay of about 1.2 s with event-driven invalidation. All forged, replayed, stale, unregistered, tampered and policy-violating requests were rejected. The evaluation used one shared host and an emulated device population and WAN link. Future work includes a multi-host Besu deployment with real network delay, physical devices and industrial protocols, learning-based trust scoring and post-quantum signatures.</w:t>
+        <w:t xml:space="preserve">We presented BC-ZTA, a blockchain-assisted zero-trust architecture that keeps consensus off the per-request path through edge-cached, Merkle-verified state and asynchronous batched anchoring. Four Solidity contracts pass 15 unit tests, and measured gas shows batch anchoring is about 1351× cheaper per record than per-event logging. In end-to-end tests on a seven-VM Google Cloud deployment with a four-validator Besu network, BC-ZTA decided in 5.4 ms on average at 50 devices and served 200 devices without failures with about one on-chain write per second, and kept deciding while one validator was stopped, while the synchronous design needed 1.4 s at 50 devices and answered only 40% of the requests at 200 devices; the price is a revocation delay of about 1.3 s with event-driven invalidation. All forged, replayed, stale, unregistered, tampered and policy-violating requests were rejected. The evaluation used cloud VMs in a single zone with injected network delay and an emulated device population. Future work includes a multi-site Besu deployment with real network delay, physical devices and industrial protocols, production IAM baselines, learning-based trust scoring and post-quantum signatures.</w:t>
       </w:r>
     </w:p>
     <w:p>
@@ -12372,7 +13076,7 @@
         </w:rPr>
         <w:t xml:space="preserve">F. Federici, D. Martintoni, and V. Senni, “A zero-trust architecture for remote access in industrial IoT infrastructures,” Electronics, vol. 12, no. 3, Art. no. 566, 2023, </w:t>
       </w:r>
-      <w:hyperlink w:history="1" r:id="rIdicx-huvpjufi5tqk7sh4q">
+      <w:hyperlink w:history="1" r:id="rIdzntl9jeppclfxlh6c_qr4">
         <w:r>
           <w:rPr>
             <w:rFonts w:ascii="Times New Roman" w:cs="Times New Roman" w:eastAsia="Times New Roman" w:hAnsi="Times New Roman"/>
@@ -12410,7 +13114,7 @@
         </w:rPr>
         <w:t xml:space="preserve">C. Zanasi, S. Russo, and M. Colajanni, “Flexible zero trust architecture for the cybersecurity of industrial IoT infrastructures,” Ad Hoc Netw., vol. 156, Art. no. 103414, 2024, </w:t>
       </w:r>
-      <w:hyperlink w:history="1" r:id="rIdibn0dl74arzmlfkjoxdnn">
+      <w:hyperlink w:history="1" r:id="rIdi-bcefn9g1wkipwhjujca">
         <w:r>
           <w:rPr>
             <w:rFonts w:ascii="Times New Roman" w:cs="Times New Roman" w:eastAsia="Times New Roman" w:hAnsi="Times New Roman"/>
@@ -12448,7 +13152,7 @@
         </w:rPr>
         <w:t xml:space="preserve">S. Rose, O. Borchert, S. Mitchell, and S. Connelly, “Zero trust architecture,” Nat. Inst. Standards Technol., Gaithersburg, MD, USA, Spec. Publ. 800-207, Aug. 2020, </w:t>
       </w:r>
-      <w:hyperlink w:history="1" r:id="rIduhkojayxekb_ultzzbf1l">
+      <w:hyperlink w:history="1" r:id="rIdu2xd_rzr_wqbdfqkrczu6">
         <w:r>
           <w:rPr>
             <w:rFonts w:ascii="Times New Roman" w:cs="Times New Roman" w:eastAsia="Times New Roman" w:hAnsi="Times New Roman"/>
@@ -12486,7 +13190,7 @@
         </w:rPr>
         <w:t xml:space="preserve">M. L. Gambo and A. Almulhem, “Zero trust architecture: A systematic literature review,” J. Netw. Syst. Manage., vol. 34, Art. no. 25, 2026, </w:t>
       </w:r>
-      <w:hyperlink w:history="1" r:id="rIde9algprg8khqhhrih5j91">
+      <w:hyperlink w:history="1" r:id="rId1l35dvxs2etojztpzwe7h">
         <w:r>
           <w:rPr>
             <w:rFonts w:ascii="Times New Roman" w:cs="Times New Roman" w:eastAsia="Times New Roman" w:hAnsi="Times New Roman"/>
@@ -12524,7 +13228,7 @@
         </w:rPr>
         <w:t xml:space="preserve">S. Mushtaq, M. Mohsin, and M. M. Mushtaq, “A systematic literature review on the implementation and challenges of zero trust architecture across domains,” Sensors, vol. 25, no. 19, Art. no. 6118, 2025, </w:t>
       </w:r>
-      <w:hyperlink w:history="1" r:id="rIdk3vy7yx5wvamef2n_9mrw">
+      <w:hyperlink w:history="1" r:id="rIdg3sdqudastrbsseokjjtf">
         <w:r>
           <w:rPr>
             <w:rFonts w:ascii="Times New Roman" w:cs="Times New Roman" w:eastAsia="Times New Roman" w:hAnsi="Times New Roman"/>
@@ -12562,7 +13266,7 @@
         </w:rPr>
         <w:t xml:space="preserve">M. A. Azad, S. Abdullah, J. Arshad, H. Lallie, and Y. H. Ahmed, “Verify and trust: A multidimensional survey of zero-trust security in the age of IoT,” Internet Things, vol. 27, Art. no. 101227, 2024, </w:t>
       </w:r>
-      <w:hyperlink w:history="1" r:id="rIdzgqihlji6pzeeznajpcdd">
+      <w:hyperlink w:history="1" r:id="rIdyxviryffk-gqpmcilpc3z">
         <w:r>
           <w:rPr>
             <w:rFonts w:ascii="Times New Roman" w:cs="Times New Roman" w:eastAsia="Times New Roman" w:hAnsi="Times New Roman"/>
@@ -12600,7 +13304,7 @@
         </w:rPr>
         <w:t xml:space="preserve">S. Mthethwa, M. T. Dlamini, and E. Jembere, “Zero trust for NHIs based on robust identity and access management for a resilient IoT future,” Sensors, vol. 26, no. 8, Art. no. 2392, 2026, </w:t>
       </w:r>
-      <w:hyperlink w:history="1" r:id="rIdqcmx7yjfehgx-btogedez">
+      <w:hyperlink w:history="1" r:id="rIdhakohtfoxmtwdiia5_z13">
         <w:r>
           <w:rPr>
             <w:rFonts w:ascii="Times New Roman" w:cs="Times New Roman" w:eastAsia="Times New Roman" w:hAnsi="Times New Roman"/>
@@ -12638,7 +13342,7 @@
         </w:rPr>
         <w:t xml:space="preserve">M. Asim, N. Tariq, A. I. Awad, F. Waheed, S. Bukhari, A. Rafay, and H. H. Song, “Lightweight and privacy-aware decentralized identity management for Industrial Internet of Things applications,” Future Gener. Comput. Syst., vol. 186, Art. no. 108753, 2027 (online Aug. 2026), </w:t>
       </w:r>
-      <w:hyperlink w:history="1" r:id="rId6x8cjcekifgluo9nouswi">
+      <w:hyperlink w:history="1" r:id="rIdcuilcmkgvkdhvpog_m62y">
         <w:r>
           <w:rPr>
             <w:rFonts w:ascii="Times New Roman" w:cs="Times New Roman" w:eastAsia="Times New Roman" w:hAnsi="Times New Roman"/>
@@ -12676,7 +13380,7 @@
         </w:rPr>
         <w:t xml:space="preserve">E. B. Fernández and A. Brazhuk, “A critical analysis of zero trust architecture (ZTA),” Comput. Stand. Interfaces, vol. 89, Art. no. 103832, 2024, </w:t>
       </w:r>
-      <w:hyperlink w:history="1" r:id="rIdntqs5mysjmfveq9sacafr">
+      <w:hyperlink w:history="1" r:id="rId_pafgvvmgbrhvyg0mmssz">
         <w:r>
           <w:rPr>
             <w:rFonts w:ascii="Times New Roman" w:cs="Times New Roman" w:eastAsia="Times New Roman" w:hAnsi="Times New Roman"/>
@@ -12714,7 +13418,7 @@
         </w:rPr>
         <w:t xml:space="preserve">Y.-W. Ma and P.-H. Chiu, “A novel risk-based access control engine in zero trust architecture for IoT network,” Int. J. Inf. Secur., vol. 24, Art. no. 124, 2025, </w:t>
       </w:r>
-      <w:hyperlink w:history="1" r:id="rIdta8knhxr_hfyx0r038ikw">
+      <w:hyperlink w:history="1" r:id="rIdqnshbzrfox_okknd6kchp">
         <w:r>
           <w:rPr>
             <w:rFonts w:ascii="Times New Roman" w:cs="Times New Roman" w:eastAsia="Times New Roman" w:hAnsi="Times New Roman"/>
@@ -12752,7 +13456,7 @@
         </w:rPr>
         <w:t xml:space="preserve">M. A. Aleisa, “Blockchain-enabled zero trust architecture for privacy-preserving cybersecurity in IoT environments,” IEEE Access, vol. 13, pp. 18660–18676, 2025, </w:t>
       </w:r>
-      <w:hyperlink w:history="1" r:id="rIdfnjlcbh14uwj5odm-tpoz">
+      <w:hyperlink w:history="1" r:id="rIdoc4uzkfcs4ujmioxul4q3">
         <w:r>
           <w:rPr>
             <w:rFonts w:ascii="Times New Roman" w:cs="Times New Roman" w:eastAsia="Times New Roman" w:hAnsi="Times New Roman"/>
@@ -12790,7 +13494,7 @@
         </w:rPr>
         <w:t xml:space="preserve">S. Nie, J. Ren, R. Wu, P. Han, Z. Han, and W. Wan, “Zero-trust access control mechanism based on blockchain and inner-product encryption in the Internet of Things in a 6G environment,” Sensors, vol. 25, no. 2, Art. no. 550, 2025, </w:t>
       </w:r>
-      <w:hyperlink w:history="1" r:id="rIdgtyjzbvlf0rfxbpghdbuq">
+      <w:hyperlink w:history="1" r:id="rIdkzr6nxjhayyjcxalt21xv">
         <w:r>
           <w:rPr>
             <w:rFonts w:ascii="Times New Roman" w:cs="Times New Roman" w:eastAsia="Times New Roman" w:hAnsi="Times New Roman"/>
@@ -12828,7 +13532,7 @@
         </w:rPr>
         <w:t xml:space="preserve">G. Ali, S. Shah, M. Elaffendi, and N. Ahmad, “Blockchain-based access management framework for interoperable digital twins in industrial IoT,” Front. Blockchain, vol. 8, Art. no. 1693926, 2025, </w:t>
       </w:r>
-      <w:hyperlink w:history="1" r:id="rIdptbbhgj81zcs5ntdufj0e">
+      <w:hyperlink w:history="1" r:id="rId8pxjzwpiyc6nuoybo9urr">
         <w:r>
           <w:rPr>
             <w:rFonts w:ascii="Times New Roman" w:cs="Times New Roman" w:eastAsia="Times New Roman" w:hAnsi="Times New Roman"/>
@@ -12866,7 +13570,7 @@
         </w:rPr>
         <w:t xml:space="preserve">M. Essaid and H. Ju, “Blockchain solutions for enhancing security and privacy in Industrial IoT,” Appl. Sci., vol. 15, no. 12, Art. no. 6835, 2025, </w:t>
       </w:r>
-      <w:hyperlink w:history="1" r:id="rIddnpi9y7-z4a8owwwjnt09">
+      <w:hyperlink w:history="1" r:id="rId1trvsaixw7u-yktgiqiyn">
         <w:r>
           <w:rPr>
             <w:rFonts w:ascii="Times New Roman" w:cs="Times New Roman" w:eastAsia="Times New Roman" w:hAnsi="Times New Roman"/>
@@ -12904,7 +13608,7 @@
         </w:rPr>
         <w:t xml:space="preserve">D. Li, H. Li, N. Crespi, R. Minerva, M. Li, W. Liang, and K. C. Li, “Hyper-IIoT: A smart contract-inspired access control scheme for resource-constrained Industrial Internet of Things,” IEEE Trans. Sustain. Comput., vol. 10, no. 5, pp. 820–829, 2025, </w:t>
       </w:r>
-      <w:hyperlink w:history="1" r:id="rId42uvuso2cn86sbnzhboaf">
+      <w:hyperlink w:history="1" r:id="rIdexzj73n1xlanuatfwdv5f">
         <w:r>
           <w:rPr>
             <w:rFonts w:ascii="Times New Roman" w:cs="Times New Roman" w:eastAsia="Times New Roman" w:hAnsi="Times New Roman"/>
@@ -12942,7 +13646,7 @@
         </w:rPr>
         <w:t xml:space="preserve">Z. Guo, “Blockchain-enhanced smart contracts for formal verification of IoT access control mechanisms,” Alexandria Eng. J., vol. 118, pp. 315–324, 2025, </w:t>
       </w:r>
-      <w:hyperlink w:history="1" r:id="rIdndxh7yf66de8xd3ubdpvg">
+      <w:hyperlink w:history="1" r:id="rId3wdmzvfo4jirtpzp81xdf">
         <w:r>
           <w:rPr>
             <w:rFonts w:ascii="Times New Roman" w:cs="Times New Roman" w:eastAsia="Times New Roman" w:hAnsi="Times New Roman"/>
@@ -12980,7 +13684,7 @@
         </w:rPr>
         <w:t xml:space="preserve">A. Singh, V. Pareek, and A. Sharma, “Blockchain-enabled zero trust framework for securing FinTech ecosystems against insider threats and cyber attacks,” </w:t>
       </w:r>
-      <w:hyperlink w:history="1" r:id="rIdr2_c2m3257k8oihprmdct">
+      <w:hyperlink w:history="1" r:id="rIdjyulep70rkhup5xfn5vbl">
         <w:r>
           <w:rPr>
             <w:rFonts w:ascii="Times New Roman" w:cs="Times New Roman" w:eastAsia="Times New Roman" w:hAnsi="Times New Roman"/>
@@ -13018,7 +13722,7 @@
         </w:rPr>
         <w:t xml:space="preserve">M. M. Salim, M. Kim, S. K. Singh, and J. H. Park, “Zero-trust blockchain-enabled framework for scalable and secure IoT networks,” Future Gener. Comput. Syst., vol. 175, Art. no. 108093, 2026, </w:t>
       </w:r>
-      <w:hyperlink w:history="1" r:id="rIdcmtyrckc1kynhrebw_yp5">
+      <w:hyperlink w:history="1" r:id="rIdc5sg5om62ivdqansfv_be">
         <w:r>
           <w:rPr>
             <w:rFonts w:ascii="Times New Roman" w:cs="Times New Roman" w:eastAsia="Times New Roman" w:hAnsi="Times New Roman"/>
@@ -13056,7 +13760,7 @@
         </w:rPr>
         <w:t xml:space="preserve">A. Sharma, S. Rani, and W. Boulila, “Blockchain-based zero trust networks with federated transfer learning for IoT security in industry 5.0,” PLOS ONE, vol. 20, no. 6, Art. no. e0323241, 2025, </w:t>
       </w:r>
-      <w:hyperlink w:history="1" r:id="rIdy5qx00krwizyhxvz2qnkd">
+      <w:hyperlink w:history="1" r:id="rId3aq5ilqk2_fnt7oaykfdg">
         <w:r>
           <w:rPr>
             <w:rFonts w:ascii="Times New Roman" w:cs="Times New Roman" w:eastAsia="Times New Roman" w:hAnsi="Times New Roman"/>
@@ -13094,7 +13798,7 @@
         </w:rPr>
         <w:t xml:space="preserve">S. Mishra, T. S. M. Aldafas, and N. S. Alshammari, “A zero-trust digital twin framework for privacy-preserving multi-dataset intrusion detection in industrial IoT with lightweight blockchain auditing,” Sci. Rep., vol. 16, Art. no. 15236, 2026, </w:t>
       </w:r>
-      <w:hyperlink w:history="1" r:id="rId9cusjegfqnwqsjkrfgk94">
+      <w:hyperlink w:history="1" r:id="rIdigvta_brftvk9k2sw17gh">
         <w:r>
           <w:rPr>
             <w:rFonts w:ascii="Times New Roman" w:cs="Times New Roman" w:eastAsia="Times New Roman" w:hAnsi="Times New Roman"/>
@@ -13132,7 +13836,7 @@
         </w:rPr>
         <w:t xml:space="preserve">Z. Zhai, J. Liu, X. Liu, Y. Mao, X. Zhang, J. Ma, and C. Jin, “A lightweight authentication method for Industrial Internet of Things based on blockchain and Chebyshev chaotic maps,” Future Internet, vol. 17, no. 8, Art. no. 338, 2025, </w:t>
       </w:r>
-      <w:hyperlink w:history="1" r:id="rIdmqpivr2acx8i77cbesvqn">
+      <w:hyperlink w:history="1" r:id="rIda79j7nww1iht2qtap0pum">
         <w:r>
           <w:rPr>
             <w:rFonts w:ascii="Times New Roman" w:cs="Times New Roman" w:eastAsia="Times New Roman" w:hAnsi="Times New Roman"/>
@@ -13170,7 +13874,7 @@
         </w:rPr>
         <w:t xml:space="preserve">T. Ramírez-Gordillo, A. Maciá-Lillo, F. A. Pujol, N. García-D’Urso, J. Azorín-López, and H. Mora, “Decentralized identity management for Internet of Things (IoT) devices using IOTA blockchain technology,” Future Internet, vol. 17, no. 1, Art. no. 49, 2025, </w:t>
       </w:r>
-      <w:hyperlink w:history="1" r:id="rIddnztb40sjcwolsl1wqaqq">
+      <w:hyperlink w:history="1" r:id="rIdl8hy8cgucwmngfhzpbd7y">
         <w:r>
           <w:rPr>
             <w:rFonts w:ascii="Times New Roman" w:cs="Times New Roman" w:eastAsia="Times New Roman" w:hAnsi="Times New Roman"/>
@@ -13208,7 +13912,7 @@
         </w:rPr>
         <w:t xml:space="preserve">S. I. R. Naqvi, Z. J. Bin, A. Mohsin, M. P. Akhter, and M. M. ur Rahman, “DBoT: Enhancing scalability and privacy in intelligent building spaces through a direct acyclic graph blockchain,” in Proc. 17th Int. Conf. Open Source Syst. Technol. (ICOSST), 2023, </w:t>
       </w:r>
-      <w:hyperlink w:history="1" r:id="rIdngneldrvdwutgm4etxh_y">
+      <w:hyperlink w:history="1" r:id="rIdxwa0jdhj9z_vfbaxjgxy7">
         <w:r>
           <w:rPr>
             <w:rFonts w:ascii="Times New Roman" w:cs="Times New Roman" w:eastAsia="Times New Roman" w:hAnsi="Times New Roman"/>
@@ -13246,7 +13950,7 @@
         </w:rPr>
         <w:t xml:space="preserve">R. Islam, R. Bose, S. Roy, A. A. Khan, S. Sutradhar, S. Das, F. Ali, and A. A. AlZubi, “Decentralized trust framework for smart cities: A blockchain-enabled cybersecurity and data integrity model,” Sci. Rep., vol. 15, Art. no. 23454, 2025, </w:t>
       </w:r>
-      <w:hyperlink w:history="1" r:id="rIdidtucxdogsuopsrwfslwx">
+      <w:hyperlink w:history="1" r:id="rIdurxhad8xrsrnpgdkyfof4">
         <w:r>
           <w:rPr>
             <w:rFonts w:ascii="Times New Roman" w:cs="Times New Roman" w:eastAsia="Times New Roman" w:hAnsi="Times New Roman"/>
@@ -13284,7 +13988,7 @@
         </w:rPr>
         <w:t xml:space="preserve">P. Rani, “A zero-trust framework for securing next-generation Internet of Things network,” in New Trends and Applications in Internet of Things (IoT) and Big Data Analytics, vol. 2. Cham, Switzerland: Springer, 2026, pp. 213–225, </w:t>
       </w:r>
-      <w:hyperlink w:history="1" r:id="rIdgtod0ynbg3_4mpdnhh0sx">
+      <w:hyperlink w:history="1" r:id="rIdpthyxpegvsmbnzbz_zorj">
         <w:r>
           <w:rPr>
             <w:rFonts w:ascii="Times New Roman" w:cs="Times New Roman" w:eastAsia="Times New Roman" w:hAnsi="Times New Roman"/>
@@ -13322,7 +14026,7 @@
         </w:rPr>
         <w:t xml:space="preserve">B. Chellaprabha, D. Manohari, and J. J. Justus, “Scalable and secure IoT architecture using trust-driven adaptive resource management and edge intelligence,” in Expert Applications and Security (NICE-TEAS 2025), Lecture Notes in Networks and Systems, vol. 1823. Cham, Switzerland: Springer, 2026, pp. 444–461, </w:t>
       </w:r>
-      <w:hyperlink w:history="1" r:id="rIdghzvsygab7lommnr4mjbs">
+      <w:hyperlink w:history="1" r:id="rIdxqsztbkntnuemeeby5sd6">
         <w:r>
           <w:rPr>
             <w:rFonts w:ascii="Times New Roman" w:cs="Times New Roman" w:eastAsia="Times New Roman" w:hAnsi="Times New Roman"/>
@@ -13360,7 +14064,7 @@
         </w:rPr>
         <w:t xml:space="preserve">K. Li et al., “Zero-trust foundation models: A new paradigm for secure and collaborative artificial intelligence for Internet of Things,” </w:t>
       </w:r>
-      <w:hyperlink w:history="1" r:id="rId0u-riella5xddoexckbq-">
+      <w:hyperlink w:history="1" r:id="rIduvjytyzh4_mn1rwqxykqn">
         <w:r>
           <w:rPr>
             <w:rFonts w:ascii="Times New Roman" w:cs="Times New Roman" w:eastAsia="Times New Roman" w:hAnsi="Times New Roman"/>
@@ -13398,7 +14102,7 @@
         </w:rPr>
         <w:t xml:space="preserve">S. Ghasemshirazi, G. Shirvani, and M. A. Alipour, “Zero trust: Applications, challenges, and opportunities,” </w:t>
       </w:r>
-      <w:hyperlink w:history="1" r:id="rIde2un4bvh_-ptdikax0jhr">
+      <w:hyperlink w:history="1" r:id="rIdvu9y6ek7jp2kulzzkaczp">
         <w:r>
           <w:rPr>
             <w:rFonts w:ascii="Times New Roman" w:cs="Times New Roman" w:eastAsia="Times New Roman" w:hAnsi="Times New Roman"/>
@@ -13436,7 +14140,7 @@
         </w:rPr>
         <w:t xml:space="preserve">A. K. Peepliwal et al., “A prototype model of zero-trust architecture blockchain with EigenTrust-based practical Byzantine fault tolerance protocol to manage decentralized clinical trials,” </w:t>
       </w:r>
-      <w:hyperlink w:history="1" r:id="rIdsi5xviv1z0_shklgdjxna">
+      <w:hyperlink w:history="1" r:id="rIduboriab_yrsyrsjrt8e9h">
         <w:r>
           <w:rPr>
             <w:rFonts w:ascii="Times New Roman" w:cs="Times New Roman" w:eastAsia="Times New Roman" w:hAnsi="Times New Roman"/>
@@ -13474,7 +14178,7 @@
         </w:rPr>
         <w:t xml:space="preserve">A. Kulkarni, N. A. Hazari, and M. Y. Niamat, “A zero trust-based framework employing blockchain technology and ring oscillator physical unclonable functions for security of field programmable gate array supply chain,” IEEE Access, vol. 12, pp. 89322–89338, 2024. [Online]. Available: </w:t>
       </w:r>
-      <w:hyperlink w:history="1" r:id="rId-xwse-7e3k-smeesycmbl">
+      <w:hyperlink w:history="1" r:id="rIdr9gb_0-zoagq5rcfo_us1">
         <w:r>
           <w:rPr>
             <w:rFonts w:ascii="Times New Roman" w:cs="Times New Roman" w:eastAsia="Times New Roman" w:hAnsi="Times New Roman"/>

</xml_diff>